<commit_message>
add initial slide  info
</commit_message>
<xml_diff>
--- a/Project/paper/CMSC-4200-Group1-Project.docx
+++ b/Project/paper/CMSC-4200-Group1-Project.docx
@@ -9213,14 +9213,6 @@
     </w:p>
     <w:p>
       <w:pPr>
-        <w:ind w:firstLine="720"/>
-        <w:rPr>
-          <w:rFonts w:ascii="Times New Roman" w:hAnsi="Times New Roman" w:cs="Times New Roman"/>
-        </w:rPr>
-      </w:pPr>
-    </w:p>
-    <w:p>
-      <w:pPr>
         <w:rPr>
           <w:rFonts w:ascii="Times New Roman" w:hAnsi="Times New Roman" w:cs="Times New Roman"/>
           <w:b/>
@@ -9262,15 +9254,21 @@
         <w:rPr>
           <w:rFonts w:ascii="Times New Roman" w:hAnsi="Times New Roman" w:cs="Times New Roman"/>
         </w:rPr>
+        <w:t>The log</w:t>
+      </w:r>
+      <w:r>
+        <w:rPr>
+          <w:rFonts w:ascii="Times New Roman" w:hAnsi="Times New Roman" w:cs="Times New Roman"/>
+        </w:rPr>
+        <w:noBreakHyphen/>
+        <w:t xml:space="preserve">time encryption method demonstrates the use of modular exponentiation, an algorithm whose performance scales logarithmically with the size of the exponent or modulus. </w:t>
+      </w:r>
+      <w:r>
+        <w:rPr>
+          <w:rFonts w:ascii="Times New Roman" w:hAnsi="Times New Roman" w:cs="Times New Roman"/>
+        </w:rPr>
         <w:lastRenderedPageBreak/>
-        <w:t>The log</w:t>
-      </w:r>
-      <w:r>
-        <w:rPr>
-          <w:rFonts w:ascii="Times New Roman" w:hAnsi="Times New Roman" w:cs="Times New Roman"/>
-        </w:rPr>
-        <w:noBreakHyphen/>
-        <w:t xml:space="preserve">time encryption method demonstrates the use of modular exponentiation, an algorithm whose performance scales logarithmically with the size of the exponent or modulus. Although the specific implementation in this program uses fixed parameters (making it effectively constant in practice), the underlying algorithm is inherently </w:t>
+        <w:t xml:space="preserve">Although the specific implementation in this program uses fixed parameters (making it effectively constant in practice), the underlying algorithm is inherently </w:t>
       </w:r>
       <w:proofErr w:type="gramStart"/>
       <w:r>
@@ -9411,15 +9409,6 @@
           <w:iCs/>
         </w:rPr>
       </w:pPr>
-    </w:p>
-    <w:p>
-      <w:pPr>
-        <w:rPr>
-          <w:rFonts w:ascii="Times New Roman" w:hAnsi="Times New Roman" w:cs="Times New Roman"/>
-          <w:i/>
-          <w:iCs/>
-        </w:rPr>
-      </w:pPr>
       <w:r>
         <w:rPr>
           <w:rFonts w:ascii="Times New Roman" w:hAnsi="Times New Roman" w:cs="Times New Roman"/>
@@ -9953,7 +9942,6 @@
                 <w:b/>
                 <w:bCs/>
               </w:rPr>
-              <w:lastRenderedPageBreak/>
               <w:t>6. Anchor chain externally</w:t>
             </w:r>
           </w:p>
@@ -10008,6 +9996,7 @@
                 <w:b/>
                 <w:bCs/>
               </w:rPr>
+              <w:lastRenderedPageBreak/>
               <w:t>7. Long</w:t>
             </w:r>
             <w:r>
@@ -10080,13 +10069,6 @@
         </w:tc>
       </w:tr>
     </w:tbl>
-    <w:p>
-      <w:pPr>
-        <w:rPr>
-          <w:rFonts w:ascii="Times New Roman" w:hAnsi="Times New Roman" w:cs="Times New Roman"/>
-        </w:rPr>
-      </w:pPr>
-    </w:p>
     <w:p>
       <w:pPr>
         <w:rPr>
@@ -10555,14 +10537,7 @@
         <w:rPr>
           <w:rFonts w:ascii="Times New Roman" w:hAnsi="Times New Roman" w:cs="Times New Roman"/>
         </w:rPr>
-        <w:t xml:space="preserve">By combining Argon2id’s memory‑hard hashing, deliberately high hashing parameters, a cryptographically linked hash chain, Merkle‑tree commitments, external anchoring, and a robust modern hash like SHA‑3‑512, this system maximizes security by design—intentionally trading </w:t>
-      </w:r>
-      <w:r>
-        <w:rPr>
-          <w:rFonts w:ascii="Times New Roman" w:hAnsi="Times New Roman" w:cs="Times New Roman"/>
-        </w:rPr>
-        <w:lastRenderedPageBreak/>
-        <w:t>computational speed for verifiable integrity. Any attempt to alter past transactions becomes both computationally prohibitive and cryptographically detectable, even against well‑resourced adversaries or insider threats. The result is a transaction‑history architecture that is tamper‑evident, audit‑friendly, and built to remain trustworthy far into the future, providing banks with a defensible, high‑assurance method for securing their most critical financial records.</w:t>
+        <w:t>By combining Argon2id’s memory‑hard hashing, deliberately high hashing parameters, a cryptographically linked hash chain, Merkle‑tree commitments, external anchoring, and a robust modern hash like SHA‑3‑512, this system maximizes security by design—intentionally trading computational speed for verifiable integrity. Any attempt to alter past transactions becomes both computationally prohibitive and cryptographically detectable, even against well‑resourced adversaries or insider threats. The result is a transaction‑history architecture that is tamper‑evident, audit‑friendly, and built to remain trustworthy far into the future, providing banks with a defensible, high‑assurance method for securing their most critical financial records.</w:t>
       </w:r>
     </w:p>
     <w:p>
@@ -10579,6 +10554,7 @@
           <w:i/>
           <w:iCs/>
         </w:rPr>
+        <w:lastRenderedPageBreak/>
         <w:t xml:space="preserve">Model </w:t>
       </w:r>
       <w:r>
@@ -11120,6 +11096,30 @@
         <w:t>Conclusion</w:t>
       </w:r>
       <w:bookmarkEnd w:id="15"/>
+    </w:p>
+    <w:p>
+      <w:pPr>
+        <w:spacing w:line="240" w:lineRule="auto"/>
+        <w:rPr>
+          <w:rFonts w:ascii="Times New Roman" w:hAnsi="Times New Roman" w:cs="Times New Roman"/>
+        </w:rPr>
+      </w:pPr>
+    </w:p>
+    <w:p>
+      <w:pPr>
+        <w:spacing w:line="240" w:lineRule="auto"/>
+        <w:rPr>
+          <w:rFonts w:ascii="Times New Roman" w:hAnsi="Times New Roman" w:cs="Times New Roman"/>
+        </w:rPr>
+      </w:pPr>
+    </w:p>
+    <w:p>
+      <w:pPr>
+        <w:spacing w:line="240" w:lineRule="auto"/>
+        <w:rPr>
+          <w:rFonts w:ascii="Times New Roman" w:hAnsi="Times New Roman" w:cs="Times New Roman"/>
+        </w:rPr>
+      </w:pPr>
     </w:p>
     <w:p>
       <w:pPr>

</xml_diff>

<commit_message>
Added Gemini slides, comparison slide, and conclusion slide. Styled powerpoint slides.
</commit_message>
<xml_diff>
--- a/Project/paper/CMSC-4200-Group1-Project.docx
+++ b/Project/paper/CMSC-4200-Group1-Project.docx
@@ -4,6 +4,9 @@
   <w:body>
     <w:sdt>
       <w:sdtPr>
+        <w:rPr>
+          <w:rFonts w:ascii="Times New Roman" w:hAnsi="Times New Roman" w:cs="Times New Roman"/>
+        </w:rPr>
         <w:id w:val="-2036344286"/>
         <w:docPartObj>
           <w:docPartGallery w:val="Cover Pages"/>
@@ -653,7 +656,7 @@
     <w:sdt>
       <w:sdtPr>
         <w:rPr>
-          <w:rFonts w:asciiTheme="minorHAnsi" w:eastAsiaTheme="minorHAnsi" w:hAnsiTheme="minorHAnsi" w:cstheme="minorBidi"/>
+          <w:rFonts w:ascii="Times New Roman" w:eastAsiaTheme="minorHAnsi" w:hAnsi="Times New Roman" w:cs="Times New Roman"/>
           <w:color w:val="auto"/>
           <w:kern w:val="2"/>
           <w:sz w:val="24"/>
@@ -692,11 +695,14 @@
           <w:pPr>
             <w:pStyle w:val="TOC1"/>
             <w:rPr>
-              <w:rFonts w:eastAsiaTheme="minorEastAsia"/>
+              <w:rFonts w:ascii="Times New Roman" w:eastAsiaTheme="minorEastAsia" w:hAnsi="Times New Roman" w:cs="Times New Roman"/>
               <w:noProof/>
             </w:rPr>
           </w:pPr>
           <w:r>
+            <w:rPr>
+              <w:rFonts w:ascii="Times New Roman" w:hAnsi="Times New Roman" w:cs="Times New Roman"/>
+            </w:rPr>
             <w:fldChar w:fldCharType="begin"/>
           </w:r>
           <w:r>
@@ -710,6 +716,7 @@
           <w:r>
             <w:rPr>
               <w:rStyle w:val="IndexLink"/>
+              <w:rFonts w:ascii="Times New Roman" w:hAnsi="Times New Roman" w:cs="Times New Roman"/>
             </w:rPr>
             <w:fldChar w:fldCharType="separate"/>
           </w:r>
@@ -724,6 +731,7 @@
             </w:r>
             <w:r>
               <w:rPr>
+                <w:rFonts w:ascii="Times New Roman" w:hAnsi="Times New Roman" w:cs="Times New Roman"/>
                 <w:noProof/>
                 <w:webHidden/>
               </w:rPr>
@@ -731,6 +739,7 @@
             </w:r>
             <w:r>
               <w:rPr>
+                <w:rFonts w:ascii="Times New Roman" w:hAnsi="Times New Roman" w:cs="Times New Roman"/>
                 <w:noProof/>
                 <w:webHidden/>
               </w:rPr>
@@ -738,6 +747,7 @@
             </w:r>
             <w:r>
               <w:rPr>
+                <w:rFonts w:ascii="Times New Roman" w:hAnsi="Times New Roman" w:cs="Times New Roman"/>
                 <w:noProof/>
                 <w:webHidden/>
               </w:rPr>
@@ -745,12 +755,14 @@
             </w:r>
             <w:r>
               <w:rPr>
+                <w:rFonts w:ascii="Times New Roman" w:hAnsi="Times New Roman" w:cs="Times New Roman"/>
                 <w:noProof/>
                 <w:webHidden/>
               </w:rPr>
             </w:r>
             <w:r>
               <w:rPr>
+                <w:rFonts w:ascii="Times New Roman" w:hAnsi="Times New Roman" w:cs="Times New Roman"/>
                 <w:noProof/>
                 <w:webHidden/>
               </w:rPr>
@@ -758,6 +770,7 @@
             </w:r>
             <w:r>
               <w:rPr>
+                <w:rFonts w:ascii="Times New Roman" w:hAnsi="Times New Roman" w:cs="Times New Roman"/>
                 <w:noProof/>
                 <w:webHidden/>
               </w:rPr>
@@ -765,6 +778,7 @@
             </w:r>
             <w:r>
               <w:rPr>
+                <w:rFonts w:ascii="Times New Roman" w:hAnsi="Times New Roman" w:cs="Times New Roman"/>
                 <w:noProof/>
                 <w:webHidden/>
               </w:rPr>
@@ -776,7 +790,7 @@
           <w:pPr>
             <w:pStyle w:val="TOC1"/>
             <w:rPr>
-              <w:rFonts w:eastAsiaTheme="minorEastAsia"/>
+              <w:rFonts w:ascii="Times New Roman" w:eastAsiaTheme="minorEastAsia" w:hAnsi="Times New Roman" w:cs="Times New Roman"/>
               <w:noProof/>
             </w:rPr>
           </w:pPr>
@@ -791,6 +805,7 @@
             </w:r>
             <w:r>
               <w:rPr>
+                <w:rFonts w:ascii="Times New Roman" w:hAnsi="Times New Roman" w:cs="Times New Roman"/>
                 <w:noProof/>
                 <w:webHidden/>
               </w:rPr>
@@ -798,6 +813,7 @@
             </w:r>
             <w:r>
               <w:rPr>
+                <w:rFonts w:ascii="Times New Roman" w:hAnsi="Times New Roman" w:cs="Times New Roman"/>
                 <w:noProof/>
                 <w:webHidden/>
               </w:rPr>
@@ -805,6 +821,7 @@
             </w:r>
             <w:r>
               <w:rPr>
+                <w:rFonts w:ascii="Times New Roman" w:hAnsi="Times New Roman" w:cs="Times New Roman"/>
                 <w:noProof/>
                 <w:webHidden/>
               </w:rPr>
@@ -812,12 +829,14 @@
             </w:r>
             <w:r>
               <w:rPr>
+                <w:rFonts w:ascii="Times New Roman" w:hAnsi="Times New Roman" w:cs="Times New Roman"/>
                 <w:noProof/>
                 <w:webHidden/>
               </w:rPr>
             </w:r>
             <w:r>
               <w:rPr>
+                <w:rFonts w:ascii="Times New Roman" w:hAnsi="Times New Roman" w:cs="Times New Roman"/>
                 <w:noProof/>
                 <w:webHidden/>
               </w:rPr>
@@ -825,6 +844,7 @@
             </w:r>
             <w:r>
               <w:rPr>
+                <w:rFonts w:ascii="Times New Roman" w:hAnsi="Times New Roman" w:cs="Times New Roman"/>
                 <w:noProof/>
                 <w:webHidden/>
               </w:rPr>
@@ -832,6 +852,7 @@
             </w:r>
             <w:r>
               <w:rPr>
+                <w:rFonts w:ascii="Times New Roman" w:hAnsi="Times New Roman" w:cs="Times New Roman"/>
                 <w:noProof/>
                 <w:webHidden/>
               </w:rPr>
@@ -843,7 +864,7 @@
           <w:pPr>
             <w:pStyle w:val="TOC1"/>
             <w:rPr>
-              <w:rFonts w:eastAsiaTheme="minorEastAsia"/>
+              <w:rFonts w:ascii="Times New Roman" w:eastAsiaTheme="minorEastAsia" w:hAnsi="Times New Roman" w:cs="Times New Roman"/>
               <w:noProof/>
             </w:rPr>
           </w:pPr>
@@ -858,6 +879,7 @@
             </w:r>
             <w:r>
               <w:rPr>
+                <w:rFonts w:ascii="Times New Roman" w:hAnsi="Times New Roman" w:cs="Times New Roman"/>
                 <w:noProof/>
                 <w:webHidden/>
               </w:rPr>
@@ -865,6 +887,7 @@
             </w:r>
             <w:r>
               <w:rPr>
+                <w:rFonts w:ascii="Times New Roman" w:hAnsi="Times New Roman" w:cs="Times New Roman"/>
                 <w:noProof/>
                 <w:webHidden/>
               </w:rPr>
@@ -872,6 +895,7 @@
             </w:r>
             <w:r>
               <w:rPr>
+                <w:rFonts w:ascii="Times New Roman" w:hAnsi="Times New Roman" w:cs="Times New Roman"/>
                 <w:noProof/>
                 <w:webHidden/>
               </w:rPr>
@@ -879,12 +903,14 @@
             </w:r>
             <w:r>
               <w:rPr>
+                <w:rFonts w:ascii="Times New Roman" w:hAnsi="Times New Roman" w:cs="Times New Roman"/>
                 <w:noProof/>
                 <w:webHidden/>
               </w:rPr>
             </w:r>
             <w:r>
               <w:rPr>
+                <w:rFonts w:ascii="Times New Roman" w:hAnsi="Times New Roman" w:cs="Times New Roman"/>
                 <w:noProof/>
                 <w:webHidden/>
               </w:rPr>
@@ -892,6 +918,7 @@
             </w:r>
             <w:r>
               <w:rPr>
+                <w:rFonts w:ascii="Times New Roman" w:hAnsi="Times New Roman" w:cs="Times New Roman"/>
                 <w:noProof/>
                 <w:webHidden/>
               </w:rPr>
@@ -899,6 +926,7 @@
             </w:r>
             <w:r>
               <w:rPr>
+                <w:rFonts w:ascii="Times New Roman" w:hAnsi="Times New Roman" w:cs="Times New Roman"/>
                 <w:noProof/>
                 <w:webHidden/>
               </w:rPr>
@@ -910,7 +938,7 @@
           <w:pPr>
             <w:pStyle w:val="TOC1"/>
             <w:rPr>
-              <w:rFonts w:eastAsiaTheme="minorEastAsia"/>
+              <w:rFonts w:ascii="Times New Roman" w:eastAsiaTheme="minorEastAsia" w:hAnsi="Times New Roman" w:cs="Times New Roman"/>
               <w:noProof/>
             </w:rPr>
           </w:pPr>
@@ -925,6 +953,7 @@
             </w:r>
             <w:r>
               <w:rPr>
+                <w:rFonts w:ascii="Times New Roman" w:hAnsi="Times New Roman" w:cs="Times New Roman"/>
                 <w:noProof/>
                 <w:webHidden/>
               </w:rPr>
@@ -932,6 +961,7 @@
             </w:r>
             <w:r>
               <w:rPr>
+                <w:rFonts w:ascii="Times New Roman" w:hAnsi="Times New Roman" w:cs="Times New Roman"/>
                 <w:noProof/>
                 <w:webHidden/>
               </w:rPr>
@@ -939,6 +969,7 @@
             </w:r>
             <w:r>
               <w:rPr>
+                <w:rFonts w:ascii="Times New Roman" w:hAnsi="Times New Roman" w:cs="Times New Roman"/>
                 <w:noProof/>
                 <w:webHidden/>
               </w:rPr>
@@ -946,12 +977,14 @@
             </w:r>
             <w:r>
               <w:rPr>
+                <w:rFonts w:ascii="Times New Roman" w:hAnsi="Times New Roman" w:cs="Times New Roman"/>
                 <w:noProof/>
                 <w:webHidden/>
               </w:rPr>
             </w:r>
             <w:r>
               <w:rPr>
+                <w:rFonts w:ascii="Times New Roman" w:hAnsi="Times New Roman" w:cs="Times New Roman"/>
                 <w:noProof/>
                 <w:webHidden/>
               </w:rPr>
@@ -959,6 +992,7 @@
             </w:r>
             <w:r>
               <w:rPr>
+                <w:rFonts w:ascii="Times New Roman" w:hAnsi="Times New Roman" w:cs="Times New Roman"/>
                 <w:noProof/>
                 <w:webHidden/>
               </w:rPr>
@@ -966,6 +1000,7 @@
             </w:r>
             <w:r>
               <w:rPr>
+                <w:rFonts w:ascii="Times New Roman" w:hAnsi="Times New Roman" w:cs="Times New Roman"/>
                 <w:noProof/>
                 <w:webHidden/>
               </w:rPr>
@@ -977,7 +1012,7 @@
           <w:pPr>
             <w:pStyle w:val="TOC1"/>
             <w:rPr>
-              <w:rFonts w:eastAsiaTheme="minorEastAsia"/>
+              <w:rFonts w:ascii="Times New Roman" w:eastAsiaTheme="minorEastAsia" w:hAnsi="Times New Roman" w:cs="Times New Roman"/>
               <w:noProof/>
             </w:rPr>
           </w:pPr>
@@ -992,6 +1027,7 @@
             </w:r>
             <w:r>
               <w:rPr>
+                <w:rFonts w:ascii="Times New Roman" w:hAnsi="Times New Roman" w:cs="Times New Roman"/>
                 <w:noProof/>
                 <w:webHidden/>
               </w:rPr>
@@ -999,6 +1035,7 @@
             </w:r>
             <w:r>
               <w:rPr>
+                <w:rFonts w:ascii="Times New Roman" w:hAnsi="Times New Roman" w:cs="Times New Roman"/>
                 <w:noProof/>
                 <w:webHidden/>
               </w:rPr>
@@ -1006,6 +1043,7 @@
             </w:r>
             <w:r>
               <w:rPr>
+                <w:rFonts w:ascii="Times New Roman" w:hAnsi="Times New Roman" w:cs="Times New Roman"/>
                 <w:noProof/>
                 <w:webHidden/>
               </w:rPr>
@@ -1013,12 +1051,14 @@
             </w:r>
             <w:r>
               <w:rPr>
+                <w:rFonts w:ascii="Times New Roman" w:hAnsi="Times New Roman" w:cs="Times New Roman"/>
                 <w:noProof/>
                 <w:webHidden/>
               </w:rPr>
             </w:r>
             <w:r>
               <w:rPr>
+                <w:rFonts w:ascii="Times New Roman" w:hAnsi="Times New Roman" w:cs="Times New Roman"/>
                 <w:noProof/>
                 <w:webHidden/>
               </w:rPr>
@@ -1026,6 +1066,7 @@
             </w:r>
             <w:r>
               <w:rPr>
+                <w:rFonts w:ascii="Times New Roman" w:hAnsi="Times New Roman" w:cs="Times New Roman"/>
                 <w:noProof/>
                 <w:webHidden/>
               </w:rPr>
@@ -1033,6 +1074,7 @@
             </w:r>
             <w:r>
               <w:rPr>
+                <w:rFonts w:ascii="Times New Roman" w:hAnsi="Times New Roman" w:cs="Times New Roman"/>
                 <w:noProof/>
                 <w:webHidden/>
               </w:rPr>
@@ -1047,7 +1089,7 @@
               <w:tab w:val="right" w:leader="dot" w:pos="9350"/>
             </w:tabs>
             <w:rPr>
-              <w:rFonts w:eastAsiaTheme="minorEastAsia"/>
+              <w:rFonts w:ascii="Times New Roman" w:eastAsiaTheme="minorEastAsia" w:hAnsi="Times New Roman" w:cs="Times New Roman"/>
               <w:noProof/>
             </w:rPr>
           </w:pPr>
@@ -1062,6 +1104,7 @@
             </w:r>
             <w:r>
               <w:rPr>
+                <w:rFonts w:ascii="Times New Roman" w:hAnsi="Times New Roman" w:cs="Times New Roman"/>
                 <w:noProof/>
                 <w:webHidden/>
               </w:rPr>
@@ -1069,6 +1112,7 @@
             </w:r>
             <w:r>
               <w:rPr>
+                <w:rFonts w:ascii="Times New Roman" w:hAnsi="Times New Roman" w:cs="Times New Roman"/>
                 <w:noProof/>
                 <w:webHidden/>
               </w:rPr>
@@ -1076,6 +1120,7 @@
             </w:r>
             <w:r>
               <w:rPr>
+                <w:rFonts w:ascii="Times New Roman" w:hAnsi="Times New Roman" w:cs="Times New Roman"/>
                 <w:noProof/>
                 <w:webHidden/>
               </w:rPr>
@@ -1083,12 +1128,14 @@
             </w:r>
             <w:r>
               <w:rPr>
+                <w:rFonts w:ascii="Times New Roman" w:hAnsi="Times New Roman" w:cs="Times New Roman"/>
                 <w:noProof/>
                 <w:webHidden/>
               </w:rPr>
             </w:r>
             <w:r>
               <w:rPr>
+                <w:rFonts w:ascii="Times New Roman" w:hAnsi="Times New Roman" w:cs="Times New Roman"/>
                 <w:noProof/>
                 <w:webHidden/>
               </w:rPr>
@@ -1096,6 +1143,7 @@
             </w:r>
             <w:r>
               <w:rPr>
+                <w:rFonts w:ascii="Times New Roman" w:hAnsi="Times New Roman" w:cs="Times New Roman"/>
                 <w:noProof/>
                 <w:webHidden/>
               </w:rPr>
@@ -1103,6 +1151,7 @@
             </w:r>
             <w:r>
               <w:rPr>
+                <w:rFonts w:ascii="Times New Roman" w:hAnsi="Times New Roman" w:cs="Times New Roman"/>
                 <w:noProof/>
                 <w:webHidden/>
               </w:rPr>
@@ -1114,7 +1163,7 @@
           <w:pPr>
             <w:pStyle w:val="TOC1"/>
             <w:rPr>
-              <w:rFonts w:eastAsiaTheme="minorEastAsia"/>
+              <w:rFonts w:ascii="Times New Roman" w:eastAsiaTheme="minorEastAsia" w:hAnsi="Times New Roman" w:cs="Times New Roman"/>
               <w:noProof/>
             </w:rPr>
           </w:pPr>
@@ -1129,6 +1178,7 @@
             </w:r>
             <w:r>
               <w:rPr>
+                <w:rFonts w:ascii="Times New Roman" w:hAnsi="Times New Roman" w:cs="Times New Roman"/>
                 <w:noProof/>
                 <w:webHidden/>
               </w:rPr>
@@ -1136,6 +1186,7 @@
             </w:r>
             <w:r>
               <w:rPr>
+                <w:rFonts w:ascii="Times New Roman" w:hAnsi="Times New Roman" w:cs="Times New Roman"/>
                 <w:noProof/>
                 <w:webHidden/>
               </w:rPr>
@@ -1143,6 +1194,7 @@
             </w:r>
             <w:r>
               <w:rPr>
+                <w:rFonts w:ascii="Times New Roman" w:hAnsi="Times New Roman" w:cs="Times New Roman"/>
                 <w:noProof/>
                 <w:webHidden/>
               </w:rPr>
@@ -1150,12 +1202,14 @@
             </w:r>
             <w:r>
               <w:rPr>
+                <w:rFonts w:ascii="Times New Roman" w:hAnsi="Times New Roman" w:cs="Times New Roman"/>
                 <w:noProof/>
                 <w:webHidden/>
               </w:rPr>
             </w:r>
             <w:r>
               <w:rPr>
+                <w:rFonts w:ascii="Times New Roman" w:hAnsi="Times New Roman" w:cs="Times New Roman"/>
                 <w:noProof/>
                 <w:webHidden/>
               </w:rPr>
@@ -1163,6 +1217,7 @@
             </w:r>
             <w:r>
               <w:rPr>
+                <w:rFonts w:ascii="Times New Roman" w:hAnsi="Times New Roman" w:cs="Times New Roman"/>
                 <w:noProof/>
                 <w:webHidden/>
               </w:rPr>
@@ -1170,6 +1225,7 @@
             </w:r>
             <w:r>
               <w:rPr>
+                <w:rFonts w:ascii="Times New Roman" w:hAnsi="Times New Roman" w:cs="Times New Roman"/>
                 <w:noProof/>
                 <w:webHidden/>
               </w:rPr>
@@ -1184,7 +1240,7 @@
               <w:tab w:val="right" w:leader="dot" w:pos="9350"/>
             </w:tabs>
             <w:rPr>
-              <w:rFonts w:eastAsiaTheme="minorEastAsia"/>
+              <w:rFonts w:ascii="Times New Roman" w:eastAsiaTheme="minorEastAsia" w:hAnsi="Times New Roman" w:cs="Times New Roman"/>
               <w:noProof/>
             </w:rPr>
           </w:pPr>
@@ -1201,6 +1257,7 @@
             </w:r>
             <w:r>
               <w:rPr>
+                <w:rFonts w:ascii="Times New Roman" w:hAnsi="Times New Roman" w:cs="Times New Roman"/>
                 <w:noProof/>
                 <w:webHidden/>
               </w:rPr>
@@ -1208,6 +1265,7 @@
             </w:r>
             <w:r>
               <w:rPr>
+                <w:rFonts w:ascii="Times New Roman" w:hAnsi="Times New Roman" w:cs="Times New Roman"/>
                 <w:noProof/>
                 <w:webHidden/>
               </w:rPr>
@@ -1215,6 +1273,7 @@
             </w:r>
             <w:r>
               <w:rPr>
+                <w:rFonts w:ascii="Times New Roman" w:hAnsi="Times New Roman" w:cs="Times New Roman"/>
                 <w:noProof/>
                 <w:webHidden/>
               </w:rPr>
@@ -1222,12 +1281,14 @@
             </w:r>
             <w:r>
               <w:rPr>
+                <w:rFonts w:ascii="Times New Roman" w:hAnsi="Times New Roman" w:cs="Times New Roman"/>
                 <w:noProof/>
                 <w:webHidden/>
               </w:rPr>
             </w:r>
             <w:r>
               <w:rPr>
+                <w:rFonts w:ascii="Times New Roman" w:hAnsi="Times New Roman" w:cs="Times New Roman"/>
                 <w:noProof/>
                 <w:webHidden/>
               </w:rPr>
@@ -1235,6 +1296,7 @@
             </w:r>
             <w:r>
               <w:rPr>
+                <w:rFonts w:ascii="Times New Roman" w:hAnsi="Times New Roman" w:cs="Times New Roman"/>
                 <w:noProof/>
                 <w:webHidden/>
               </w:rPr>
@@ -1242,6 +1304,7 @@
             </w:r>
             <w:r>
               <w:rPr>
+                <w:rFonts w:ascii="Times New Roman" w:hAnsi="Times New Roman" w:cs="Times New Roman"/>
                 <w:noProof/>
                 <w:webHidden/>
               </w:rPr>
@@ -1256,7 +1319,7 @@
               <w:tab w:val="right" w:leader="dot" w:pos="9350"/>
             </w:tabs>
             <w:rPr>
-              <w:rFonts w:eastAsiaTheme="minorEastAsia"/>
+              <w:rFonts w:ascii="Times New Roman" w:eastAsiaTheme="minorEastAsia" w:hAnsi="Times New Roman" w:cs="Times New Roman"/>
               <w:noProof/>
             </w:rPr>
           </w:pPr>
@@ -1273,6 +1336,7 @@
             </w:r>
             <w:r>
               <w:rPr>
+                <w:rFonts w:ascii="Times New Roman" w:hAnsi="Times New Roman" w:cs="Times New Roman"/>
                 <w:noProof/>
                 <w:webHidden/>
               </w:rPr>
@@ -1280,6 +1344,7 @@
             </w:r>
             <w:r>
               <w:rPr>
+                <w:rFonts w:ascii="Times New Roman" w:hAnsi="Times New Roman" w:cs="Times New Roman"/>
                 <w:noProof/>
                 <w:webHidden/>
               </w:rPr>
@@ -1287,6 +1352,7 @@
             </w:r>
             <w:r>
               <w:rPr>
+                <w:rFonts w:ascii="Times New Roman" w:hAnsi="Times New Roman" w:cs="Times New Roman"/>
                 <w:noProof/>
                 <w:webHidden/>
               </w:rPr>
@@ -1294,12 +1360,14 @@
             </w:r>
             <w:r>
               <w:rPr>
+                <w:rFonts w:ascii="Times New Roman" w:hAnsi="Times New Roman" w:cs="Times New Roman"/>
                 <w:noProof/>
                 <w:webHidden/>
               </w:rPr>
             </w:r>
             <w:r>
               <w:rPr>
+                <w:rFonts w:ascii="Times New Roman" w:hAnsi="Times New Roman" w:cs="Times New Roman"/>
                 <w:noProof/>
                 <w:webHidden/>
               </w:rPr>
@@ -1307,6 +1375,7 @@
             </w:r>
             <w:r>
               <w:rPr>
+                <w:rFonts w:ascii="Times New Roman" w:hAnsi="Times New Roman" w:cs="Times New Roman"/>
                 <w:noProof/>
                 <w:webHidden/>
               </w:rPr>
@@ -1314,6 +1383,7 @@
             </w:r>
             <w:r>
               <w:rPr>
+                <w:rFonts w:ascii="Times New Roman" w:hAnsi="Times New Roman" w:cs="Times New Roman"/>
                 <w:noProof/>
                 <w:webHidden/>
               </w:rPr>
@@ -1328,7 +1398,7 @@
               <w:tab w:val="right" w:leader="dot" w:pos="9350"/>
             </w:tabs>
             <w:rPr>
-              <w:rFonts w:eastAsiaTheme="minorEastAsia"/>
+              <w:rFonts w:ascii="Times New Roman" w:eastAsiaTheme="minorEastAsia" w:hAnsi="Times New Roman" w:cs="Times New Roman"/>
               <w:noProof/>
             </w:rPr>
           </w:pPr>
@@ -1345,6 +1415,7 @@
             </w:r>
             <w:r>
               <w:rPr>
+                <w:rFonts w:ascii="Times New Roman" w:hAnsi="Times New Roman" w:cs="Times New Roman"/>
                 <w:noProof/>
                 <w:webHidden/>
               </w:rPr>
@@ -1352,6 +1423,7 @@
             </w:r>
             <w:r>
               <w:rPr>
+                <w:rFonts w:ascii="Times New Roman" w:hAnsi="Times New Roman" w:cs="Times New Roman"/>
                 <w:noProof/>
                 <w:webHidden/>
               </w:rPr>
@@ -1359,6 +1431,7 @@
             </w:r>
             <w:r>
               <w:rPr>
+                <w:rFonts w:ascii="Times New Roman" w:hAnsi="Times New Roman" w:cs="Times New Roman"/>
                 <w:noProof/>
                 <w:webHidden/>
               </w:rPr>
@@ -1366,12 +1439,14 @@
             </w:r>
             <w:r>
               <w:rPr>
+                <w:rFonts w:ascii="Times New Roman" w:hAnsi="Times New Roman" w:cs="Times New Roman"/>
                 <w:noProof/>
                 <w:webHidden/>
               </w:rPr>
             </w:r>
             <w:r>
               <w:rPr>
+                <w:rFonts w:ascii="Times New Roman" w:hAnsi="Times New Roman" w:cs="Times New Roman"/>
                 <w:noProof/>
                 <w:webHidden/>
               </w:rPr>
@@ -1379,6 +1454,7 @@
             </w:r>
             <w:r>
               <w:rPr>
+                <w:rFonts w:ascii="Times New Roman" w:hAnsi="Times New Roman" w:cs="Times New Roman"/>
                 <w:noProof/>
                 <w:webHidden/>
               </w:rPr>
@@ -1386,6 +1462,7 @@
             </w:r>
             <w:r>
               <w:rPr>
+                <w:rFonts w:ascii="Times New Roman" w:hAnsi="Times New Roman" w:cs="Times New Roman"/>
                 <w:noProof/>
                 <w:webHidden/>
               </w:rPr>
@@ -1397,7 +1474,7 @@
           <w:pPr>
             <w:pStyle w:val="TOC1"/>
             <w:rPr>
-              <w:rFonts w:eastAsiaTheme="minorEastAsia"/>
+              <w:rFonts w:ascii="Times New Roman" w:eastAsiaTheme="minorEastAsia" w:hAnsi="Times New Roman" w:cs="Times New Roman"/>
               <w:noProof/>
             </w:rPr>
           </w:pPr>
@@ -1412,6 +1489,7 @@
             </w:r>
             <w:r>
               <w:rPr>
+                <w:rFonts w:ascii="Times New Roman" w:hAnsi="Times New Roman" w:cs="Times New Roman"/>
                 <w:noProof/>
                 <w:webHidden/>
               </w:rPr>
@@ -1419,6 +1497,7 @@
             </w:r>
             <w:r>
               <w:rPr>
+                <w:rFonts w:ascii="Times New Roman" w:hAnsi="Times New Roman" w:cs="Times New Roman"/>
                 <w:noProof/>
                 <w:webHidden/>
               </w:rPr>
@@ -1426,6 +1505,7 @@
             </w:r>
             <w:r>
               <w:rPr>
+                <w:rFonts w:ascii="Times New Roman" w:hAnsi="Times New Roman" w:cs="Times New Roman"/>
                 <w:noProof/>
                 <w:webHidden/>
               </w:rPr>
@@ -1433,12 +1513,14 @@
             </w:r>
             <w:r>
               <w:rPr>
+                <w:rFonts w:ascii="Times New Roman" w:hAnsi="Times New Roman" w:cs="Times New Roman"/>
                 <w:noProof/>
                 <w:webHidden/>
               </w:rPr>
             </w:r>
             <w:r>
               <w:rPr>
+                <w:rFonts w:ascii="Times New Roman" w:hAnsi="Times New Roman" w:cs="Times New Roman"/>
                 <w:noProof/>
                 <w:webHidden/>
               </w:rPr>
@@ -1446,6 +1528,7 @@
             </w:r>
             <w:r>
               <w:rPr>
+                <w:rFonts w:ascii="Times New Roman" w:hAnsi="Times New Roman" w:cs="Times New Roman"/>
                 <w:noProof/>
                 <w:webHidden/>
               </w:rPr>
@@ -1453,6 +1536,7 @@
             </w:r>
             <w:r>
               <w:rPr>
+                <w:rFonts w:ascii="Times New Roman" w:hAnsi="Times New Roman" w:cs="Times New Roman"/>
                 <w:noProof/>
                 <w:webHidden/>
               </w:rPr>
@@ -1467,7 +1551,7 @@
               <w:tab w:val="right" w:leader="dot" w:pos="9350"/>
             </w:tabs>
             <w:rPr>
-              <w:rFonts w:eastAsiaTheme="minorEastAsia"/>
+              <w:rFonts w:ascii="Times New Roman" w:eastAsiaTheme="minorEastAsia" w:hAnsi="Times New Roman" w:cs="Times New Roman"/>
               <w:noProof/>
             </w:rPr>
           </w:pPr>
@@ -1482,6 +1566,7 @@
             </w:r>
             <w:r>
               <w:rPr>
+                <w:rFonts w:ascii="Times New Roman" w:hAnsi="Times New Roman" w:cs="Times New Roman"/>
                 <w:noProof/>
                 <w:webHidden/>
               </w:rPr>
@@ -1489,6 +1574,7 @@
             </w:r>
             <w:r>
               <w:rPr>
+                <w:rFonts w:ascii="Times New Roman" w:hAnsi="Times New Roman" w:cs="Times New Roman"/>
                 <w:noProof/>
                 <w:webHidden/>
               </w:rPr>
@@ -1496,6 +1582,7 @@
             </w:r>
             <w:r>
               <w:rPr>
+                <w:rFonts w:ascii="Times New Roman" w:hAnsi="Times New Roman" w:cs="Times New Roman"/>
                 <w:noProof/>
                 <w:webHidden/>
               </w:rPr>
@@ -1503,12 +1590,14 @@
             </w:r>
             <w:r>
               <w:rPr>
+                <w:rFonts w:ascii="Times New Roman" w:hAnsi="Times New Roman" w:cs="Times New Roman"/>
                 <w:noProof/>
                 <w:webHidden/>
               </w:rPr>
             </w:r>
             <w:r>
               <w:rPr>
+                <w:rFonts w:ascii="Times New Roman" w:hAnsi="Times New Roman" w:cs="Times New Roman"/>
                 <w:noProof/>
                 <w:webHidden/>
               </w:rPr>
@@ -1516,6 +1605,7 @@
             </w:r>
             <w:r>
               <w:rPr>
+                <w:rFonts w:ascii="Times New Roman" w:hAnsi="Times New Roman" w:cs="Times New Roman"/>
                 <w:noProof/>
                 <w:webHidden/>
               </w:rPr>
@@ -1523,6 +1613,7 @@
             </w:r>
             <w:r>
               <w:rPr>
+                <w:rFonts w:ascii="Times New Roman" w:hAnsi="Times New Roman" w:cs="Times New Roman"/>
                 <w:noProof/>
                 <w:webHidden/>
               </w:rPr>
@@ -1537,7 +1628,7 @@
               <w:tab w:val="right" w:leader="dot" w:pos="9350"/>
             </w:tabs>
             <w:rPr>
-              <w:rFonts w:eastAsiaTheme="minorEastAsia"/>
+              <w:rFonts w:ascii="Times New Roman" w:eastAsiaTheme="minorEastAsia" w:hAnsi="Times New Roman" w:cs="Times New Roman"/>
               <w:noProof/>
             </w:rPr>
           </w:pPr>
@@ -1552,6 +1643,7 @@
             </w:r>
             <w:r>
               <w:rPr>
+                <w:rFonts w:ascii="Times New Roman" w:hAnsi="Times New Roman" w:cs="Times New Roman"/>
                 <w:noProof/>
                 <w:webHidden/>
               </w:rPr>
@@ -1559,6 +1651,7 @@
             </w:r>
             <w:r>
               <w:rPr>
+                <w:rFonts w:ascii="Times New Roman" w:hAnsi="Times New Roman" w:cs="Times New Roman"/>
                 <w:noProof/>
                 <w:webHidden/>
               </w:rPr>
@@ -1566,6 +1659,7 @@
             </w:r>
             <w:r>
               <w:rPr>
+                <w:rFonts w:ascii="Times New Roman" w:hAnsi="Times New Roman" w:cs="Times New Roman"/>
                 <w:noProof/>
                 <w:webHidden/>
               </w:rPr>
@@ -1573,12 +1667,14 @@
             </w:r>
             <w:r>
               <w:rPr>
+                <w:rFonts w:ascii="Times New Roman" w:hAnsi="Times New Roman" w:cs="Times New Roman"/>
                 <w:noProof/>
                 <w:webHidden/>
               </w:rPr>
             </w:r>
             <w:r>
               <w:rPr>
+                <w:rFonts w:ascii="Times New Roman" w:hAnsi="Times New Roman" w:cs="Times New Roman"/>
                 <w:noProof/>
                 <w:webHidden/>
               </w:rPr>
@@ -1586,6 +1682,7 @@
             </w:r>
             <w:r>
               <w:rPr>
+                <w:rFonts w:ascii="Times New Roman" w:hAnsi="Times New Roman" w:cs="Times New Roman"/>
                 <w:noProof/>
                 <w:webHidden/>
               </w:rPr>
@@ -1593,6 +1690,7 @@
             </w:r>
             <w:r>
               <w:rPr>
+                <w:rFonts w:ascii="Times New Roman" w:hAnsi="Times New Roman" w:cs="Times New Roman"/>
                 <w:noProof/>
                 <w:webHidden/>
               </w:rPr>
@@ -1604,7 +1702,7 @@
           <w:pPr>
             <w:pStyle w:val="TOC1"/>
             <w:rPr>
-              <w:rFonts w:eastAsiaTheme="minorEastAsia"/>
+              <w:rFonts w:ascii="Times New Roman" w:eastAsiaTheme="minorEastAsia" w:hAnsi="Times New Roman" w:cs="Times New Roman"/>
               <w:noProof/>
             </w:rPr>
           </w:pPr>
@@ -1619,6 +1717,7 @@
             </w:r>
             <w:r>
               <w:rPr>
+                <w:rFonts w:ascii="Times New Roman" w:hAnsi="Times New Roman" w:cs="Times New Roman"/>
                 <w:noProof/>
                 <w:webHidden/>
               </w:rPr>
@@ -1626,6 +1725,7 @@
             </w:r>
             <w:r>
               <w:rPr>
+                <w:rFonts w:ascii="Times New Roman" w:hAnsi="Times New Roman" w:cs="Times New Roman"/>
                 <w:noProof/>
                 <w:webHidden/>
               </w:rPr>
@@ -1633,6 +1733,7 @@
             </w:r>
             <w:r>
               <w:rPr>
+                <w:rFonts w:ascii="Times New Roman" w:hAnsi="Times New Roman" w:cs="Times New Roman"/>
                 <w:noProof/>
                 <w:webHidden/>
               </w:rPr>
@@ -1640,12 +1741,14 @@
             </w:r>
             <w:r>
               <w:rPr>
+                <w:rFonts w:ascii="Times New Roman" w:hAnsi="Times New Roman" w:cs="Times New Roman"/>
                 <w:noProof/>
                 <w:webHidden/>
               </w:rPr>
             </w:r>
             <w:r>
               <w:rPr>
+                <w:rFonts w:ascii="Times New Roman" w:hAnsi="Times New Roman" w:cs="Times New Roman"/>
                 <w:noProof/>
                 <w:webHidden/>
               </w:rPr>
@@ -1653,6 +1756,7 @@
             </w:r>
             <w:r>
               <w:rPr>
+                <w:rFonts w:ascii="Times New Roman" w:hAnsi="Times New Roman" w:cs="Times New Roman"/>
                 <w:noProof/>
                 <w:webHidden/>
               </w:rPr>
@@ -1660,6 +1764,7 @@
             </w:r>
             <w:r>
               <w:rPr>
+                <w:rFonts w:ascii="Times New Roman" w:hAnsi="Times New Roman" w:cs="Times New Roman"/>
                 <w:noProof/>
                 <w:webHidden/>
               </w:rPr>
@@ -1671,7 +1776,7 @@
           <w:pPr>
             <w:pStyle w:val="TOC1"/>
             <w:rPr>
-              <w:rFonts w:eastAsiaTheme="minorEastAsia"/>
+              <w:rFonts w:ascii="Times New Roman" w:eastAsiaTheme="minorEastAsia" w:hAnsi="Times New Roman" w:cs="Times New Roman"/>
               <w:noProof/>
             </w:rPr>
           </w:pPr>
@@ -1686,6 +1791,7 @@
             </w:r>
             <w:r>
               <w:rPr>
+                <w:rFonts w:ascii="Times New Roman" w:hAnsi="Times New Roman" w:cs="Times New Roman"/>
                 <w:noProof/>
                 <w:webHidden/>
               </w:rPr>
@@ -1693,6 +1799,7 @@
             </w:r>
             <w:r>
               <w:rPr>
+                <w:rFonts w:ascii="Times New Roman" w:hAnsi="Times New Roman" w:cs="Times New Roman"/>
                 <w:noProof/>
                 <w:webHidden/>
               </w:rPr>
@@ -1700,6 +1807,7 @@
             </w:r>
             <w:r>
               <w:rPr>
+                <w:rFonts w:ascii="Times New Roman" w:hAnsi="Times New Roman" w:cs="Times New Roman"/>
                 <w:noProof/>
                 <w:webHidden/>
               </w:rPr>
@@ -1707,12 +1815,14 @@
             </w:r>
             <w:r>
               <w:rPr>
+                <w:rFonts w:ascii="Times New Roman" w:hAnsi="Times New Roman" w:cs="Times New Roman"/>
                 <w:noProof/>
                 <w:webHidden/>
               </w:rPr>
             </w:r>
             <w:r>
               <w:rPr>
+                <w:rFonts w:ascii="Times New Roman" w:hAnsi="Times New Roman" w:cs="Times New Roman"/>
                 <w:noProof/>
                 <w:webHidden/>
               </w:rPr>
@@ -1720,6 +1830,7 @@
             </w:r>
             <w:r>
               <w:rPr>
+                <w:rFonts w:ascii="Times New Roman" w:hAnsi="Times New Roman" w:cs="Times New Roman"/>
                 <w:noProof/>
                 <w:webHidden/>
               </w:rPr>
@@ -1727,6 +1838,7 @@
             </w:r>
             <w:r>
               <w:rPr>
+                <w:rFonts w:ascii="Times New Roman" w:hAnsi="Times New Roman" w:cs="Times New Roman"/>
                 <w:noProof/>
                 <w:webHidden/>
               </w:rPr>
@@ -1738,7 +1850,7 @@
           <w:pPr>
             <w:pStyle w:val="TOC1"/>
             <w:rPr>
-              <w:rFonts w:eastAsiaTheme="minorEastAsia"/>
+              <w:rFonts w:ascii="Times New Roman" w:eastAsiaTheme="minorEastAsia" w:hAnsi="Times New Roman" w:cs="Times New Roman"/>
               <w:noProof/>
             </w:rPr>
           </w:pPr>
@@ -1753,6 +1865,7 @@
             </w:r>
             <w:r>
               <w:rPr>
+                <w:rFonts w:ascii="Times New Roman" w:hAnsi="Times New Roman" w:cs="Times New Roman"/>
                 <w:noProof/>
                 <w:webHidden/>
               </w:rPr>
@@ -1760,6 +1873,7 @@
             </w:r>
             <w:r>
               <w:rPr>
+                <w:rFonts w:ascii="Times New Roman" w:hAnsi="Times New Roman" w:cs="Times New Roman"/>
                 <w:noProof/>
                 <w:webHidden/>
               </w:rPr>
@@ -1767,6 +1881,7 @@
             </w:r>
             <w:r>
               <w:rPr>
+                <w:rFonts w:ascii="Times New Roman" w:hAnsi="Times New Roman" w:cs="Times New Roman"/>
                 <w:noProof/>
                 <w:webHidden/>
               </w:rPr>
@@ -1774,12 +1889,14 @@
             </w:r>
             <w:r>
               <w:rPr>
+                <w:rFonts w:ascii="Times New Roman" w:hAnsi="Times New Roman" w:cs="Times New Roman"/>
                 <w:noProof/>
                 <w:webHidden/>
               </w:rPr>
             </w:r>
             <w:r>
               <w:rPr>
+                <w:rFonts w:ascii="Times New Roman" w:hAnsi="Times New Roman" w:cs="Times New Roman"/>
                 <w:noProof/>
                 <w:webHidden/>
               </w:rPr>
@@ -1787,6 +1904,7 @@
             </w:r>
             <w:r>
               <w:rPr>
+                <w:rFonts w:ascii="Times New Roman" w:hAnsi="Times New Roman" w:cs="Times New Roman"/>
                 <w:noProof/>
                 <w:webHidden/>
               </w:rPr>
@@ -1794,6 +1912,7 @@
             </w:r>
             <w:r>
               <w:rPr>
+                <w:rFonts w:ascii="Times New Roman" w:hAnsi="Times New Roman" w:cs="Times New Roman"/>
                 <w:noProof/>
                 <w:webHidden/>
               </w:rPr>
@@ -1805,7 +1924,7 @@
           <w:pPr>
             <w:pStyle w:val="TOC1"/>
             <w:rPr>
-              <w:rFonts w:eastAsiaTheme="minorEastAsia"/>
+              <w:rFonts w:ascii="Times New Roman" w:eastAsiaTheme="minorEastAsia" w:hAnsi="Times New Roman" w:cs="Times New Roman"/>
               <w:noProof/>
             </w:rPr>
           </w:pPr>
@@ -1820,6 +1939,7 @@
             </w:r>
             <w:r>
               <w:rPr>
+                <w:rFonts w:ascii="Times New Roman" w:hAnsi="Times New Roman" w:cs="Times New Roman"/>
                 <w:noProof/>
                 <w:webHidden/>
               </w:rPr>
@@ -1827,6 +1947,7 @@
             </w:r>
             <w:r>
               <w:rPr>
+                <w:rFonts w:ascii="Times New Roman" w:hAnsi="Times New Roman" w:cs="Times New Roman"/>
                 <w:noProof/>
                 <w:webHidden/>
               </w:rPr>
@@ -1834,6 +1955,7 @@
             </w:r>
             <w:r>
               <w:rPr>
+                <w:rFonts w:ascii="Times New Roman" w:hAnsi="Times New Roman" w:cs="Times New Roman"/>
                 <w:noProof/>
                 <w:webHidden/>
               </w:rPr>
@@ -1841,12 +1963,14 @@
             </w:r>
             <w:r>
               <w:rPr>
+                <w:rFonts w:ascii="Times New Roman" w:hAnsi="Times New Roman" w:cs="Times New Roman"/>
                 <w:noProof/>
                 <w:webHidden/>
               </w:rPr>
             </w:r>
             <w:r>
               <w:rPr>
+                <w:rFonts w:ascii="Times New Roman" w:hAnsi="Times New Roman" w:cs="Times New Roman"/>
                 <w:noProof/>
                 <w:webHidden/>
               </w:rPr>
@@ -1854,6 +1978,7 @@
             </w:r>
             <w:r>
               <w:rPr>
+                <w:rFonts w:ascii="Times New Roman" w:hAnsi="Times New Roman" w:cs="Times New Roman"/>
                 <w:noProof/>
                 <w:webHidden/>
               </w:rPr>
@@ -1861,6 +1986,7 @@
             </w:r>
             <w:r>
               <w:rPr>
+                <w:rFonts w:ascii="Times New Roman" w:hAnsi="Times New Roman" w:cs="Times New Roman"/>
                 <w:noProof/>
                 <w:webHidden/>
               </w:rPr>
@@ -2060,6 +2186,7 @@
         </w:rPr>
         <w:t xml:space="preserve">AI and Cybersecurity are two fundamental fields in computer science. AI focuses on building systems that can automate performing tasks that require human intelligence. AI implements models to learn, reason, build perception, and understanding to approach problems with strategy. The article, </w:t>
       </w:r>
+      <w:proofErr w:type="gramStart"/>
       <w:r>
         <w:rPr>
           <w:rFonts w:ascii="Times New Roman" w:hAnsi="Times New Roman" w:cs="Times New Roman"/>
@@ -2068,21 +2195,18 @@
           <w:i/>
           <w:iCs/>
         </w:rPr>
-        <w:t>What is artificial intelligence (AI)</w:t>
-      </w:r>
-      <w:r>
-        <w:rPr>
-          <w:rFonts w:ascii="Times New Roman" w:hAnsi="Times New Roman" w:cs="Times New Roman"/>
+        <w:t>What</w:t>
+      </w:r>
+      <w:proofErr w:type="gramEnd"/>
+      <w:r>
+        <w:rPr>
+          <w:rFonts w:ascii="Times New Roman" w:hAnsi="Times New Roman" w:cs="Times New Roman"/>
+          <w:b/>
+          <w:bCs/>
           <w:i/>
           <w:iCs/>
         </w:rPr>
-        <w:t xml:space="preserve">, </w:t>
-      </w:r>
-      <w:r>
-        <w:rPr>
-          <w:rFonts w:ascii="Times New Roman" w:hAnsi="Times New Roman" w:cs="Times New Roman"/>
-        </w:rPr>
-        <w:t>tells us of this innovation</w:t>
+        <w:t xml:space="preserve"> is artificial intelligence (AI)</w:t>
       </w:r>
       <w:r>
         <w:rPr>
@@ -2090,7 +2214,39 @@
           <w:i/>
           <w:iCs/>
         </w:rPr>
-        <w:t>. “Artificial intelligence is a branch of computer science that creates systems and software capable of tasks once thought to be uniquely human. It enables machines to learn from experience, adapt to new information, and uses data, algorithms and computational power to interpret complex situations and make decisions with minimal human input. AI can understand language, recognize patterns, solve problems and even demonstrate creativity – often at speeds and scales far beyond our own. By harnessing these capabilities, it is reshaping how we interact with technology and pushing the boundaries of what machines can achieve (2026, ISO).”</w:t>
+        <w:t xml:space="preserve">, </w:t>
+      </w:r>
+      <w:r>
+        <w:rPr>
+          <w:rFonts w:ascii="Times New Roman" w:hAnsi="Times New Roman" w:cs="Times New Roman"/>
+        </w:rPr>
+        <w:t>tells us of this innovation</w:t>
+      </w:r>
+      <w:r>
+        <w:rPr>
+          <w:rFonts w:ascii="Times New Roman" w:hAnsi="Times New Roman" w:cs="Times New Roman"/>
+          <w:i/>
+          <w:iCs/>
+        </w:rPr>
+        <w:t xml:space="preserve">. “Artificial intelligence is a branch of computer science that creates systems and software capable of tasks once thought to be uniquely human. It enables machines to learn from experience, adapt to new information, and </w:t>
+      </w:r>
+      <w:proofErr w:type="gramStart"/>
+      <w:r>
+        <w:rPr>
+          <w:rFonts w:ascii="Times New Roman" w:hAnsi="Times New Roman" w:cs="Times New Roman"/>
+          <w:i/>
+          <w:iCs/>
+        </w:rPr>
+        <w:t>uses</w:t>
+      </w:r>
+      <w:proofErr w:type="gramEnd"/>
+      <w:r>
+        <w:rPr>
+          <w:rFonts w:ascii="Times New Roman" w:hAnsi="Times New Roman" w:cs="Times New Roman"/>
+          <w:i/>
+          <w:iCs/>
+        </w:rPr>
+        <w:t> data, algorithms and computational power to interpret complex situations and make decisions with minimal human input. AI can understand language, recognize patterns, solve problems and even demonstrate creativity – often at speeds and scales far beyond our own. By harnessing these capabilities, it is reshaping how we interact with technology and pushing the boundaries of what machines can achieve (2026, ISO).”</w:t>
       </w:r>
     </w:p>
     <w:p>
@@ -2176,7 +2332,23 @@
           <w:rFonts w:ascii="Times New Roman" w:hAnsi="Times New Roman" w:cs="Times New Roman"/>
           <w:color w:val="000000" w:themeColor="text1"/>
         </w:rPr>
-        <w:t xml:space="preserve">we would like to see if AI is capable of providing and designing encryption solutions when given a computational time constraint. For example, can AI provide optimal data hashing solutions in terms of Big O? Can AI make decisions on security level vs computational cost? Encryption is much more than just formatting data into unreadable and unrecognizable content. Encryption must meet the requirements of the scenario it is used in. These requirements are constraints of time, memory, and computing power. Is an algorithm considered to be correct if it runs several minutes over when it was proposed to give a solution? When designing encryption methods, consideration is spent on catering the proposed solution in a way that meets the problem’s security and efficiency needs. This careful software design is usually done by a qualified engineer whose goal is to perfect this optimization trade off. Herein lies our project topic. Our team took great interest in whether AI could replace the software engineer’s position of Encryption evaluation based on computational time complexity. This topic of evaluating AI’s ability to problem solve encryption solutions when held to time constraints explores both mathematical and algorithm processing </w:t>
+        <w:t xml:space="preserve">we would like to see if AI </w:t>
+      </w:r>
+      <w:proofErr w:type="gramStart"/>
+      <w:r>
+        <w:rPr>
+          <w:rFonts w:ascii="Times New Roman" w:hAnsi="Times New Roman" w:cs="Times New Roman"/>
+          <w:color w:val="000000" w:themeColor="text1"/>
+        </w:rPr>
+        <w:t>is capable of providing and designing</w:t>
+      </w:r>
+      <w:proofErr w:type="gramEnd"/>
+      <w:r>
+        <w:rPr>
+          <w:rFonts w:ascii="Times New Roman" w:hAnsi="Times New Roman" w:cs="Times New Roman"/>
+          <w:color w:val="000000" w:themeColor="text1"/>
+        </w:rPr>
+        <w:t xml:space="preserve"> encryption solutions when given a computational time constraint. For example, can AI provide optimal data hashing solutions in terms of Big O? Can AI make decisions on security level vs computational cost? Encryption is much more than just formatting data into unreadable and unrecognizable content. Encryption must meet the requirements of the scenario it is used in. These requirements are constraints of time, memory, and computing power. Is an algorithm considered to be correct if it runs several minutes over when it was proposed to give a solution? When designing encryption methods, consideration is spent on catering the proposed solution in a way that meets the problem’s security and efficiency needs. This careful software design is usually done by a qualified engineer whose goal is to perfect this optimization trade off. Herein lies our project topic. Our team took great interest in whether AI could replace the software engineer’s position of Encryption evaluation based on computational time complexity. This topic of evaluating AI’s ability to problem solve encryption solutions when held to time constraints explores both mathematical and algorithm processing </w:t>
       </w:r>
       <w:r>
         <w:rPr>
@@ -2285,7 +2457,21 @@
         <w:rPr>
           <w:rFonts w:ascii="Times New Roman" w:hAnsi="Times New Roman" w:cs="Times New Roman"/>
         </w:rPr>
-        <w:t>Each team member has been assigned an AI model for experimentation. The AI model will be prompted with specific queries to generate encryption algorithms. Generated content will then be tested for optimization and complexity. Additionally, a final security analysis will be given on each generated encryption algorithm. For smooth processing and cohesive project analysis, our team will stay in consistent communication during experimentation and provide peer reviews of team solutions. Each member of the team will additionally provide report documentation under specified categories to summarize findings. This contribution will allow for a final conclusion of AI’s encryption and time constraints ability.</w:t>
+        <w:t xml:space="preserve">Each team member has been assigned an AI model for experimentation. The AI model will be prompted with specific queries to generate encryption algorithms. Generated content will then be tested for optimization and complexity. Additionally, a final security analysis will be given on each generated encryption algorithm. For smooth processing and cohesive project analysis, our team will stay in consistent communication during experimentation and provide peer reviews of team solutions. Each member of the team will additionally provide report documentation under specified categories to summarize findings. This contribution will allow for </w:t>
+      </w:r>
+      <w:proofErr w:type="gramStart"/>
+      <w:r>
+        <w:rPr>
+          <w:rFonts w:ascii="Times New Roman" w:hAnsi="Times New Roman" w:cs="Times New Roman"/>
+        </w:rPr>
+        <w:t>a final conclusion</w:t>
+      </w:r>
+      <w:proofErr w:type="gramEnd"/>
+      <w:r>
+        <w:rPr>
+          <w:rFonts w:ascii="Times New Roman" w:hAnsi="Times New Roman" w:cs="Times New Roman"/>
+        </w:rPr>
+        <w:t xml:space="preserve"> of AI’s encryption and time constraints ability.</w:t>
       </w:r>
     </w:p>
     <w:p>
@@ -2589,7 +2775,21 @@
           <w:rFonts w:ascii="Times New Roman" w:hAnsi="Times New Roman" w:cs="Times New Roman"/>
         </w:rPr>
         <w:lastRenderedPageBreak/>
-        <w:t>GPT-based models, developed by OpenAI, have overwhelming market share among large language models (Statcounter Global Stats, 2026). Given this, our selection of AI agents gives a variety of options: GPT-based, modified GPT-based, and non GPT-based. In comparing results, our team may be able to determine if one agent or foundation type is more successful or efficient for our application than the others.</w:t>
+        <w:t>GPT-based models, developed by OpenAI, have overwhelming market share among large language models (</w:t>
+      </w:r>
+      <w:proofErr w:type="spellStart"/>
+      <w:r>
+        <w:rPr>
+          <w:rFonts w:ascii="Times New Roman" w:hAnsi="Times New Roman" w:cs="Times New Roman"/>
+        </w:rPr>
+        <w:t>Statcounter</w:t>
+      </w:r>
+      <w:proofErr w:type="spellEnd"/>
+      <w:r>
+        <w:rPr>
+          <w:rFonts w:ascii="Times New Roman" w:hAnsi="Times New Roman" w:cs="Times New Roman"/>
+        </w:rPr>
+        <w:t xml:space="preserve"> Global Stats, 2026). Given this, our selection of AI agents gives a variety of options: GPT-based, modified GPT-based, and non GPT-based. In comparing results, our team may be able to determine if one agent or foundation type is more successful or efficient for our application than the others.</w:t>
       </w:r>
     </w:p>
     <w:p>
@@ -2728,7 +2928,21 @@
         <w:rPr>
           <w:rFonts w:ascii="Times New Roman" w:hAnsi="Times New Roman" w:cs="Times New Roman"/>
         </w:rPr>
-        <w:t>A datacenter needs to encrypt their employee’s system passwords. The passwords are required to be 8 characters including numbers and special characters. The software needs to encrypt the password upon account creation and verified on relogging in. There needs to be no lag during this process. There are 200 employees in this datacenter that all need accounts. Which encryption approach should be used and why?</w:t>
+        <w:t xml:space="preserve">A datacenter needs to encrypt their employee’s system passwords. The passwords are required to be 8 characters including numbers and special characters. The software needs to encrypt the password upon account creation and </w:t>
+      </w:r>
+      <w:proofErr w:type="gramStart"/>
+      <w:r>
+        <w:rPr>
+          <w:rFonts w:ascii="Times New Roman" w:hAnsi="Times New Roman" w:cs="Times New Roman"/>
+        </w:rPr>
+        <w:t>verified</w:t>
+      </w:r>
+      <w:proofErr w:type="gramEnd"/>
+      <w:r>
+        <w:rPr>
+          <w:rFonts w:ascii="Times New Roman" w:hAnsi="Times New Roman" w:cs="Times New Roman"/>
+        </w:rPr>
+        <w:t xml:space="preserve"> on relogging in. There needs to be no lag during this process. There are 200 employees in this datacenter that all need accounts. Which encryption approach should be used and why?</w:t>
       </w:r>
     </w:p>
     <w:p>
@@ -3272,7 +3486,21 @@
         <w:rPr>
           <w:rFonts w:ascii="Times New Roman" w:hAnsi="Times New Roman" w:cs="Times New Roman"/>
         </w:rPr>
-        <w:t>The system should use secure salted password hashing with an algorithm such as Argon2 or bcrypt rather than encryption. These algorithms are designed specifically for password storage, provide strong protection against brute force attacks, and are fast enough that hashing and verification for 200 employees will occur with virtually no noticeable latency during account creation or login. (GPT, 2026)</w:t>
+        <w:t xml:space="preserve">The system should use secure salted password hashing with an algorithm such as Argon2 or </w:t>
+      </w:r>
+      <w:proofErr w:type="spellStart"/>
+      <w:r>
+        <w:rPr>
+          <w:rFonts w:ascii="Times New Roman" w:hAnsi="Times New Roman" w:cs="Times New Roman"/>
+        </w:rPr>
+        <w:t>bcrypt</w:t>
+      </w:r>
+      <w:proofErr w:type="spellEnd"/>
+      <w:r>
+        <w:rPr>
+          <w:rFonts w:ascii="Times New Roman" w:hAnsi="Times New Roman" w:cs="Times New Roman"/>
+        </w:rPr>
+        <w:t xml:space="preserve"> rather than encryption. These algorithms are designed specifically for password storage, provide strong protection against brute force attacks, and are fast enough that hashing and verification for 200 employees will occur with virtually no noticeable latency during account creation or login. (GPT, 2026)</w:t>
       </w:r>
     </w:p>
     <w:p>
@@ -3304,7 +3532,35 @@
         <w:rPr>
           <w:rFonts w:ascii="Times New Roman" w:hAnsi="Times New Roman" w:cs="Times New Roman"/>
         </w:rPr>
-        <w:t>This category seeks to answer the question of whether AI can properly optimize an encryption algorithm. AI must be able to take into account specified requirements as an engineer would to determine what tradeoffs must be made, while maintaining compliancy. The following prompt has been designed to represent both selection features and optimization strategies.</w:t>
+        <w:t xml:space="preserve">This category seeks to answer the question of whether AI can properly optimize an encryption algorithm. AI must be able to </w:t>
+      </w:r>
+      <w:proofErr w:type="gramStart"/>
+      <w:r>
+        <w:rPr>
+          <w:rFonts w:ascii="Times New Roman" w:hAnsi="Times New Roman" w:cs="Times New Roman"/>
+        </w:rPr>
+        <w:t>take into account</w:t>
+      </w:r>
+      <w:proofErr w:type="gramEnd"/>
+      <w:r>
+        <w:rPr>
+          <w:rFonts w:ascii="Times New Roman" w:hAnsi="Times New Roman" w:cs="Times New Roman"/>
+        </w:rPr>
+        <w:t xml:space="preserve"> specified requirements as an engineer would to determine what tradeoffs must be made, while maintaining </w:t>
+      </w:r>
+      <w:proofErr w:type="gramStart"/>
+      <w:r>
+        <w:rPr>
+          <w:rFonts w:ascii="Times New Roman" w:hAnsi="Times New Roman" w:cs="Times New Roman"/>
+        </w:rPr>
+        <w:t>compliancy</w:t>
+      </w:r>
+      <w:proofErr w:type="gramEnd"/>
+      <w:r>
+        <w:rPr>
+          <w:rFonts w:ascii="Times New Roman" w:hAnsi="Times New Roman" w:cs="Times New Roman"/>
+        </w:rPr>
+        <w:t>. The following prompt has been designed to represent both selection features and optimization strategies.</w:t>
       </w:r>
     </w:p>
     <w:p>
@@ -3507,7 +3763,21 @@
               <w:rPr>
                 <w:rFonts w:ascii="Times New Roman" w:eastAsia="Aptos" w:hAnsi="Times New Roman" w:cs="Times New Roman"/>
               </w:rPr>
-              <w:t>Latency &lt; 200 ms per transaction</w:t>
+              <w:t xml:space="preserve">Latency &lt; 200 </w:t>
+            </w:r>
+            <w:proofErr w:type="spellStart"/>
+            <w:r>
+              <w:rPr>
+                <w:rFonts w:ascii="Times New Roman" w:eastAsia="Aptos" w:hAnsi="Times New Roman" w:cs="Times New Roman"/>
+              </w:rPr>
+              <w:t>ms</w:t>
+            </w:r>
+            <w:proofErr w:type="spellEnd"/>
+            <w:r>
+              <w:rPr>
+                <w:rFonts w:ascii="Times New Roman" w:eastAsia="Aptos" w:hAnsi="Times New Roman" w:cs="Times New Roman"/>
+              </w:rPr>
+              <w:t xml:space="preserve"> per transaction</w:t>
             </w:r>
           </w:p>
           <w:p>
@@ -3956,6 +4226,7 @@
       </w:pPr>
       <w:r>
         <w:rPr>
+          <w:rFonts w:ascii="Times New Roman" w:hAnsi="Times New Roman" w:cs="Times New Roman"/>
           <w:noProof/>
         </w:rPr>
         <w:drawing>
@@ -4061,7 +4332,21 @@
         <w:rPr>
           <w:rFonts w:ascii="Times New Roman" w:hAnsi="Times New Roman" w:cs="Times New Roman"/>
         </w:rPr>
-        <w:t>This section represents the most crucial research point of our project, since focused on specific time complexity. This section will test AI’s ability to produce solutions that meet a certain computational time requirement.</w:t>
+        <w:t xml:space="preserve">This section represents the most crucial research point of our </w:t>
+      </w:r>
+      <w:proofErr w:type="gramStart"/>
+      <w:r>
+        <w:rPr>
+          <w:rFonts w:ascii="Times New Roman" w:hAnsi="Times New Roman" w:cs="Times New Roman"/>
+        </w:rPr>
+        <w:t>project, since</w:t>
+      </w:r>
+      <w:proofErr w:type="gramEnd"/>
+      <w:r>
+        <w:rPr>
+          <w:rFonts w:ascii="Times New Roman" w:hAnsi="Times New Roman" w:cs="Times New Roman"/>
+        </w:rPr>
+        <w:t xml:space="preserve"> focused on specific time complexity. This section will test AI’s ability to produce solutions that meet a certain computational time requirement.</w:t>
       </w:r>
     </w:p>
     <w:p>
@@ -4529,6 +4814,7 @@
       </w:pPr>
       <w:r>
         <w:rPr>
+          <w:rFonts w:ascii="Times New Roman" w:hAnsi="Times New Roman" w:cs="Times New Roman"/>
           <w:noProof/>
         </w:rPr>
         <w:drawing>
@@ -4681,7 +4967,21 @@
               <w:rPr>
                 <w:rFonts w:ascii="Times New Roman" w:eastAsia="Aptos" w:hAnsi="Times New Roman" w:cs="Times New Roman"/>
               </w:rPr>
-              <w:t>- Collision resistance → use a strong hash (e.g., SHA-256 or SHA-3)</w:t>
+              <w:t xml:space="preserve">- Collision resistance → use </w:t>
+            </w:r>
+            <w:proofErr w:type="gramStart"/>
+            <w:r>
+              <w:rPr>
+                <w:rFonts w:ascii="Times New Roman" w:eastAsia="Aptos" w:hAnsi="Times New Roman" w:cs="Times New Roman"/>
+              </w:rPr>
+              <w:t>a strong</w:t>
+            </w:r>
+            <w:proofErr w:type="gramEnd"/>
+            <w:r>
+              <w:rPr>
+                <w:rFonts w:ascii="Times New Roman" w:eastAsia="Aptos" w:hAnsi="Times New Roman" w:cs="Times New Roman"/>
+              </w:rPr>
+              <w:t xml:space="preserve"> hash (e.g., SHA-256 or SHA-3)</w:t>
             </w:r>
           </w:p>
           <w:p>
@@ -4754,6 +5054,7 @@
       </w:pPr>
       <w:r>
         <w:rPr>
+          <w:rFonts w:ascii="Times New Roman" w:hAnsi="Times New Roman" w:cs="Times New Roman"/>
           <w:noProof/>
         </w:rPr>
         <w:drawing>
@@ -4824,6 +5125,7 @@
       </w:pPr>
       <w:r>
         <w:rPr>
+          <w:rFonts w:ascii="Times New Roman" w:hAnsi="Times New Roman" w:cs="Times New Roman"/>
           <w:noProof/>
         </w:rPr>
         <w:drawing>
@@ -4895,7 +5197,21 @@
         <w:rPr>
           <w:rFonts w:ascii="Times New Roman" w:hAnsi="Times New Roman" w:cs="Times New Roman"/>
         </w:rPr>
-        <w:t xml:space="preserve">Chat GPT AI model was able to take the proposed questions and formulate solutions. Breaking the prompts into sections allowed for thorough and logical processing. Each section prompt allowed for diverse testing information. During this ChatGPT experimentation, our team was able to see both pros and cons. The AI model has great capabilities of processing the prompt. It can separate specific requirements from the prompt seamlessly. By formatting the requirements into tabular representations, the AI model reached optimal problem organization. Solutions were provided quickly with through explanations. However, it was noticed that ChatGPT provided no references or reasons behind these solutions. The user or engineer is required to blindly trust AI or do external research that would add additional time to project composition. This produces a detrimental cost when dealing specifically with code since it is the intellectual property of the author. However, without proper documentation, who is the author of the AI generated code or logic? Has it been sourced from an external internet source? Has it been reused or modified? Overall credibility is a major concern regarding this AI model. </w:t>
+        <w:t xml:space="preserve">Chat GPT AI model was able to take the proposed questions and formulate solutions. Breaking the prompts into sections allowed for thorough and logical processing. Each section prompt allowed for diverse testing information. During this ChatGPT </w:t>
+      </w:r>
+      <w:proofErr w:type="gramStart"/>
+      <w:r>
+        <w:rPr>
+          <w:rFonts w:ascii="Times New Roman" w:hAnsi="Times New Roman" w:cs="Times New Roman"/>
+        </w:rPr>
+        <w:t>experimentation</w:t>
+      </w:r>
+      <w:proofErr w:type="gramEnd"/>
+      <w:r>
+        <w:rPr>
+          <w:rFonts w:ascii="Times New Roman" w:hAnsi="Times New Roman" w:cs="Times New Roman"/>
+        </w:rPr>
+        <w:t xml:space="preserve">, our team was able to see both pros and cons. The AI model has great capabilities of processing the prompt. It can separate specific requirements from the prompt seamlessly. By formatting the requirements into tabular representations, the AI model reached optimal problem organization. Solutions were provided quickly with through explanations. However, it was noticed that ChatGPT provided no references or reasons behind these solutions. The user or engineer is required to blindly trust AI or do external research that would add additional time to project composition. This produces a detrimental cost when dealing specifically with code since it is the intellectual property of the author. However, without proper documentation, who is the author of the AI generated code or logic? Has it been sourced from an external internet source? Has it been reused or modified? Overall credibility is a major concern regarding this AI model. </w:t>
       </w:r>
     </w:p>
     <w:p>
@@ -4938,12 +5254,12 @@
       <w:pPr>
         <w:spacing w:line="240" w:lineRule="auto"/>
         <w:rPr>
-          <w:rFonts w:ascii="Times New Roman" w:hAnsi="Times New Roman"/>
-        </w:rPr>
-      </w:pPr>
-      <w:r>
-        <w:rPr>
-          <w:rFonts w:ascii="Times New Roman" w:hAnsi="Times New Roman"/>
+          <w:rFonts w:ascii="Times New Roman" w:hAnsi="Times New Roman" w:cs="Times New Roman"/>
+        </w:rPr>
+      </w:pPr>
+      <w:r>
+        <w:rPr>
+          <w:rFonts w:ascii="Times New Roman" w:hAnsi="Times New Roman" w:cs="Times New Roman"/>
         </w:rPr>
         <w:tab/>
         <w:t>For the second AI model experimentation, Google Gemini will be prompted with the exact same prompts that were sent to ChatGPT. Each prompt will be performed on a new chat to prevent previous memory and history from interfering with the validity or persuasion of the data. Gemini is unique from the other two models explored in this paper, in that it has its own unique foundational LLM; it does not use a GPT model, as ChatGPT and Copilot do.</w:t>
@@ -4971,12 +5287,12 @@
         <w:spacing w:line="240" w:lineRule="auto"/>
         <w:ind w:firstLine="720"/>
         <w:rPr>
-          <w:rFonts w:ascii="Times New Roman" w:hAnsi="Times New Roman"/>
-        </w:rPr>
-      </w:pPr>
-      <w:r>
-        <w:rPr>
-          <w:rFonts w:ascii="Times New Roman" w:hAnsi="Times New Roman"/>
+          <w:rFonts w:ascii="Times New Roman" w:hAnsi="Times New Roman" w:cs="Times New Roman"/>
+        </w:rPr>
+      </w:pPr>
+      <w:r>
+        <w:rPr>
+          <w:rFonts w:ascii="Times New Roman" w:hAnsi="Times New Roman" w:cs="Times New Roman"/>
         </w:rPr>
         <w:t>This category seeks to answer the question of whether AI can properly choose an encryption algorithm while keeping in mind speed, efficiency, and security.</w:t>
       </w:r>
@@ -4985,7 +5301,7 @@
       <w:pPr>
         <w:spacing w:line="240" w:lineRule="auto"/>
         <w:rPr>
-          <w:rFonts w:ascii="Times New Roman" w:hAnsi="Times New Roman"/>
+          <w:rFonts w:ascii="Times New Roman" w:hAnsi="Times New Roman" w:cs="Times New Roman"/>
           <w:b/>
           <w:bCs/>
           <w:u w:val="single"/>
@@ -4993,7 +5309,7 @@
       </w:pPr>
       <w:r>
         <w:rPr>
-          <w:rFonts w:ascii="Times New Roman" w:hAnsi="Times New Roman"/>
+          <w:rFonts w:ascii="Times New Roman" w:hAnsi="Times New Roman" w:cs="Times New Roman"/>
           <w:b/>
           <w:bCs/>
           <w:u w:val="single"/>
@@ -5005,19 +5321,33 @@
       <w:pPr>
         <w:spacing w:line="240" w:lineRule="auto"/>
         <w:rPr>
-          <w:rFonts w:ascii="Times New Roman" w:hAnsi="Times New Roman"/>
-        </w:rPr>
-      </w:pPr>
-      <w:r>
-        <w:rPr>
-          <w:rFonts w:ascii="Times New Roman" w:hAnsi="Times New Roman"/>
+          <w:rFonts w:ascii="Times New Roman" w:hAnsi="Times New Roman" w:cs="Times New Roman"/>
+        </w:rPr>
+      </w:pPr>
+      <w:r>
+        <w:rPr>
+          <w:rFonts w:ascii="Times New Roman" w:hAnsi="Times New Roman" w:cs="Times New Roman"/>
         </w:rPr>
         <w:tab/>
-        <w:t xml:space="preserve">A datacenter needs to encrypt their employee’s system passwords. The passwords are required to be 8 characters including numbers and special characters. The software needs to encrypt the password upon account creation and verified on relogging in. There needs to be no </w:t>
-      </w:r>
-      <w:r>
-        <w:rPr>
-          <w:rFonts w:ascii="Times New Roman" w:hAnsi="Times New Roman"/>
+        <w:t xml:space="preserve">A datacenter needs to encrypt their employee’s system passwords. The passwords are required to be 8 characters including numbers and special characters. The software needs to encrypt the password upon account creation and </w:t>
+      </w:r>
+      <w:proofErr w:type="gramStart"/>
+      <w:r>
+        <w:rPr>
+          <w:rFonts w:ascii="Times New Roman" w:hAnsi="Times New Roman" w:cs="Times New Roman"/>
+        </w:rPr>
+        <w:t>verified</w:t>
+      </w:r>
+      <w:proofErr w:type="gramEnd"/>
+      <w:r>
+        <w:rPr>
+          <w:rFonts w:ascii="Times New Roman" w:hAnsi="Times New Roman" w:cs="Times New Roman"/>
+        </w:rPr>
+        <w:t xml:space="preserve"> on relogging in. There needs to be no </w:t>
+      </w:r>
+      <w:r>
+        <w:rPr>
+          <w:rFonts w:ascii="Times New Roman" w:hAnsi="Times New Roman" w:cs="Times New Roman"/>
         </w:rPr>
         <w:lastRenderedPageBreak/>
         <w:t>lag during this process. There are 200 employees in this datacenter that all need accounts. Which encryption approach should be used and why?</w:t>
@@ -5027,14 +5357,28 @@
       <w:pPr>
         <w:spacing w:line="240" w:lineRule="auto"/>
         <w:rPr>
-          <w:rFonts w:ascii="Times New Roman" w:hAnsi="Times New Roman"/>
-        </w:rPr>
-      </w:pPr>
-      <w:r>
-        <w:rPr>
-          <w:rFonts w:ascii="Times New Roman" w:hAnsi="Times New Roman"/>
-        </w:rPr>
-        <w:t>Gemini responded, recommending Salted Hashing with Argon2id or BCrypt. It specified that “encrypt” is not the correct action for what is needed, as encryptions can be decrypted. It presents hashing as distinct from encryption, and provided the following table:</w:t>
+          <w:rFonts w:ascii="Times New Roman" w:hAnsi="Times New Roman" w:cs="Times New Roman"/>
+        </w:rPr>
+      </w:pPr>
+      <w:r>
+        <w:rPr>
+          <w:rFonts w:ascii="Times New Roman" w:hAnsi="Times New Roman" w:cs="Times New Roman"/>
+        </w:rPr>
+        <w:t xml:space="preserve">Gemini responded, recommending Salted Hashing with Argon2id or </w:t>
+      </w:r>
+      <w:proofErr w:type="spellStart"/>
+      <w:r>
+        <w:rPr>
+          <w:rFonts w:ascii="Times New Roman" w:hAnsi="Times New Roman" w:cs="Times New Roman"/>
+        </w:rPr>
+        <w:t>BCrypt</w:t>
+      </w:r>
+      <w:proofErr w:type="spellEnd"/>
+      <w:r>
+        <w:rPr>
+          <w:rFonts w:ascii="Times New Roman" w:hAnsi="Times New Roman" w:cs="Times New Roman"/>
+        </w:rPr>
+        <w:t>. It specified that “encrypt” is not the correct action for what is needed, as encryptions can be decrypted. It presents hashing as distinct from encryption, and provided the following table:</w:t>
       </w:r>
     </w:p>
     <w:tbl>
@@ -5074,11 +5418,14 @@
             <w:pPr>
               <w:pStyle w:val="TableContents"/>
               <w:spacing w:after="0" w:line="274" w:lineRule="auto"/>
+              <w:rPr>
+                <w:rFonts w:ascii="Times New Roman" w:hAnsi="Times New Roman" w:cs="Times New Roman"/>
+              </w:rPr>
             </w:pPr>
             <w:r>
               <w:rPr>
                 <w:rStyle w:val="Strong"/>
-                <w:rFonts w:ascii="Times New Roman" w:hAnsi="Times New Roman"/>
+                <w:rFonts w:ascii="Times New Roman" w:hAnsi="Times New Roman" w:cs="Times New Roman"/>
               </w:rPr>
               <w:t>Feature</w:t>
             </w:r>
@@ -5099,11 +5446,14 @@
             <w:pPr>
               <w:pStyle w:val="TableContents"/>
               <w:spacing w:after="0" w:line="274" w:lineRule="auto"/>
+              <w:rPr>
+                <w:rFonts w:ascii="Times New Roman" w:hAnsi="Times New Roman" w:cs="Times New Roman"/>
+              </w:rPr>
             </w:pPr>
             <w:r>
               <w:rPr>
                 <w:rStyle w:val="Strong"/>
-                <w:rFonts w:ascii="Times New Roman" w:hAnsi="Times New Roman"/>
+                <w:rFonts w:ascii="Times New Roman" w:hAnsi="Times New Roman" w:cs="Times New Roman"/>
               </w:rPr>
               <w:t>Symmetric Encryption (AES)</w:t>
             </w:r>
@@ -5124,11 +5474,14 @@
             <w:pPr>
               <w:pStyle w:val="TableContents"/>
               <w:spacing w:after="0" w:line="274" w:lineRule="auto"/>
+              <w:rPr>
+                <w:rFonts w:ascii="Times New Roman" w:hAnsi="Times New Roman" w:cs="Times New Roman"/>
+              </w:rPr>
             </w:pPr>
             <w:r>
               <w:rPr>
                 <w:rStyle w:val="Strong"/>
-                <w:rFonts w:ascii="Times New Roman" w:hAnsi="Times New Roman"/>
+                <w:rFonts w:ascii="Times New Roman" w:hAnsi="Times New Roman" w:cs="Times New Roman"/>
               </w:rPr>
               <w:t>Standard Hashing (SHA-256)</w:t>
             </w:r>
@@ -5149,13 +5502,32 @@
             <w:pPr>
               <w:pStyle w:val="TableContents"/>
               <w:spacing w:after="0" w:line="274" w:lineRule="auto"/>
+              <w:rPr>
+                <w:rFonts w:ascii="Times New Roman" w:hAnsi="Times New Roman" w:cs="Times New Roman"/>
+              </w:rPr>
             </w:pPr>
             <w:r>
               <w:rPr>
                 <w:rStyle w:val="Strong"/>
-                <w:rFonts w:ascii="Times New Roman" w:hAnsi="Times New Roman"/>
-              </w:rPr>
-              <w:t>Salted Hashing (Argon2/BCrypt)</w:t>
+                <w:rFonts w:ascii="Times New Roman" w:hAnsi="Times New Roman" w:cs="Times New Roman"/>
+              </w:rPr>
+              <w:t>Salted Hashing (Argon2/</w:t>
+            </w:r>
+            <w:proofErr w:type="spellStart"/>
+            <w:r>
+              <w:rPr>
+                <w:rStyle w:val="Strong"/>
+                <w:rFonts w:ascii="Times New Roman" w:hAnsi="Times New Roman" w:cs="Times New Roman"/>
+              </w:rPr>
+              <w:t>BCrypt</w:t>
+            </w:r>
+            <w:proofErr w:type="spellEnd"/>
+            <w:r>
+              <w:rPr>
+                <w:rStyle w:val="Strong"/>
+                <w:rFonts w:ascii="Times New Roman" w:hAnsi="Times New Roman" w:cs="Times New Roman"/>
+              </w:rPr>
+              <w:t>)</w:t>
             </w:r>
           </w:p>
         </w:tc>
@@ -5177,13 +5549,13 @@
               <w:pStyle w:val="TableContents"/>
               <w:spacing w:after="140" w:line="274" w:lineRule="auto"/>
               <w:rPr>
-                <w:rFonts w:ascii="Times New Roman" w:hAnsi="Times New Roman"/>
+                <w:rFonts w:ascii="Times New Roman" w:hAnsi="Times New Roman" w:cs="Times New Roman"/>
                 <w:b/>
               </w:rPr>
             </w:pPr>
             <w:r>
               <w:rPr>
-                <w:rFonts w:ascii="Times New Roman" w:hAnsi="Times New Roman"/>
+                <w:rFonts w:ascii="Times New Roman" w:hAnsi="Times New Roman" w:cs="Times New Roman"/>
                 <w:b/>
               </w:rPr>
               <w:t>Reversibility</w:t>
@@ -5206,12 +5578,12 @@
               <w:pStyle w:val="TableContents"/>
               <w:spacing w:after="140" w:line="274" w:lineRule="auto"/>
               <w:rPr>
-                <w:rFonts w:ascii="Times New Roman" w:hAnsi="Times New Roman"/>
-              </w:rPr>
-            </w:pPr>
-            <w:r>
-              <w:rPr>
-                <w:rFonts w:ascii="Times New Roman" w:hAnsi="Times New Roman"/>
+                <w:rFonts w:ascii="Times New Roman" w:hAnsi="Times New Roman" w:cs="Times New Roman"/>
+              </w:rPr>
+            </w:pPr>
+            <w:r>
+              <w:rPr>
+                <w:rFonts w:ascii="Times New Roman" w:hAnsi="Times New Roman" w:cs="Times New Roman"/>
               </w:rPr>
               <w:t>Reversible (Riskier)</w:t>
             </w:r>
@@ -5233,12 +5605,12 @@
               <w:pStyle w:val="TableContents"/>
               <w:spacing w:after="140" w:line="274" w:lineRule="auto"/>
               <w:rPr>
-                <w:rFonts w:ascii="Times New Roman" w:hAnsi="Times New Roman"/>
-              </w:rPr>
-            </w:pPr>
-            <w:r>
-              <w:rPr>
-                <w:rFonts w:ascii="Times New Roman" w:hAnsi="Times New Roman"/>
+                <w:rFonts w:ascii="Times New Roman" w:hAnsi="Times New Roman" w:cs="Times New Roman"/>
+              </w:rPr>
+            </w:pPr>
+            <w:r>
+              <w:rPr>
+                <w:rFonts w:ascii="Times New Roman" w:hAnsi="Times New Roman" w:cs="Times New Roman"/>
               </w:rPr>
               <w:t>Non-reversible</w:t>
             </w:r>
@@ -5260,12 +5632,12 @@
               <w:pStyle w:val="TableContents"/>
               <w:spacing w:after="140" w:line="274" w:lineRule="auto"/>
               <w:rPr>
-                <w:rFonts w:ascii="Times New Roman" w:hAnsi="Times New Roman"/>
-              </w:rPr>
-            </w:pPr>
-            <w:r>
-              <w:rPr>
-                <w:rFonts w:ascii="Times New Roman" w:hAnsi="Times New Roman"/>
+                <w:rFonts w:ascii="Times New Roman" w:hAnsi="Times New Roman" w:cs="Times New Roman"/>
+              </w:rPr>
+            </w:pPr>
+            <w:r>
+              <w:rPr>
+                <w:rFonts w:ascii="Times New Roman" w:hAnsi="Times New Roman" w:cs="Times New Roman"/>
               </w:rPr>
               <w:t>Non-reversible</w:t>
             </w:r>
@@ -5289,13 +5661,13 @@
               <w:pStyle w:val="TableContents"/>
               <w:spacing w:after="140" w:line="274" w:lineRule="auto"/>
               <w:rPr>
-                <w:rFonts w:ascii="Times New Roman" w:hAnsi="Times New Roman"/>
+                <w:rFonts w:ascii="Times New Roman" w:hAnsi="Times New Roman" w:cs="Times New Roman"/>
                 <w:b/>
               </w:rPr>
             </w:pPr>
             <w:r>
               <w:rPr>
-                <w:rFonts w:ascii="Times New Roman" w:hAnsi="Times New Roman"/>
+                <w:rFonts w:ascii="Times New Roman" w:hAnsi="Times New Roman" w:cs="Times New Roman"/>
                 <w:b/>
               </w:rPr>
               <w:t>Speed</w:t>
@@ -5318,12 +5690,12 @@
               <w:pStyle w:val="TableContents"/>
               <w:spacing w:after="140" w:line="274" w:lineRule="auto"/>
               <w:rPr>
-                <w:rFonts w:ascii="Times New Roman" w:hAnsi="Times New Roman"/>
-              </w:rPr>
-            </w:pPr>
-            <w:r>
-              <w:rPr>
-                <w:rFonts w:ascii="Times New Roman" w:hAnsi="Times New Roman"/>
+                <w:rFonts w:ascii="Times New Roman" w:hAnsi="Times New Roman" w:cs="Times New Roman"/>
+              </w:rPr>
+            </w:pPr>
+            <w:r>
+              <w:rPr>
+                <w:rFonts w:ascii="Times New Roman" w:hAnsi="Times New Roman" w:cs="Times New Roman"/>
               </w:rPr>
               <w:t>Very Fast</w:t>
             </w:r>
@@ -5345,12 +5717,12 @@
               <w:pStyle w:val="TableContents"/>
               <w:spacing w:after="140" w:line="274" w:lineRule="auto"/>
               <w:rPr>
-                <w:rFonts w:ascii="Times New Roman" w:hAnsi="Times New Roman"/>
-              </w:rPr>
-            </w:pPr>
-            <w:r>
-              <w:rPr>
-                <w:rFonts w:ascii="Times New Roman" w:hAnsi="Times New Roman"/>
+                <w:rFonts w:ascii="Times New Roman" w:hAnsi="Times New Roman" w:cs="Times New Roman"/>
+              </w:rPr>
+            </w:pPr>
+            <w:r>
+              <w:rPr>
+                <w:rFonts w:ascii="Times New Roman" w:hAnsi="Times New Roman" w:cs="Times New Roman"/>
               </w:rPr>
               <w:t>Too Fast (Easy to crack)</w:t>
             </w:r>
@@ -5372,12 +5744,12 @@
               <w:pStyle w:val="TableContents"/>
               <w:spacing w:after="140" w:line="274" w:lineRule="auto"/>
               <w:rPr>
-                <w:rFonts w:ascii="Times New Roman" w:hAnsi="Times New Roman"/>
-              </w:rPr>
-            </w:pPr>
-            <w:r>
-              <w:rPr>
-                <w:rFonts w:ascii="Times New Roman" w:hAnsi="Times New Roman"/>
+                <w:rFonts w:ascii="Times New Roman" w:hAnsi="Times New Roman" w:cs="Times New Roman"/>
+              </w:rPr>
+            </w:pPr>
+            <w:r>
+              <w:rPr>
+                <w:rFonts w:ascii="Times New Roman" w:hAnsi="Times New Roman" w:cs="Times New Roman"/>
               </w:rPr>
               <w:t>Optimized (Secure but quick)</w:t>
             </w:r>
@@ -5401,13 +5773,13 @@
               <w:pStyle w:val="TableContents"/>
               <w:spacing w:after="140" w:line="274" w:lineRule="auto"/>
               <w:rPr>
-                <w:rFonts w:ascii="Times New Roman" w:hAnsi="Times New Roman"/>
+                <w:rFonts w:ascii="Times New Roman" w:hAnsi="Times New Roman" w:cs="Times New Roman"/>
                 <w:b/>
               </w:rPr>
             </w:pPr>
             <w:r>
               <w:rPr>
-                <w:rFonts w:ascii="Times New Roman" w:hAnsi="Times New Roman"/>
+                <w:rFonts w:ascii="Times New Roman" w:hAnsi="Times New Roman" w:cs="Times New Roman"/>
                 <w:b/>
               </w:rPr>
               <w:t>Best Use Case</w:t>
@@ -5430,12 +5802,12 @@
               <w:pStyle w:val="TableContents"/>
               <w:spacing w:after="140" w:line="274" w:lineRule="auto"/>
               <w:rPr>
-                <w:rFonts w:ascii="Times New Roman" w:hAnsi="Times New Roman"/>
-              </w:rPr>
-            </w:pPr>
-            <w:r>
-              <w:rPr>
-                <w:rFonts w:ascii="Times New Roman" w:hAnsi="Times New Roman"/>
+                <w:rFonts w:ascii="Times New Roman" w:hAnsi="Times New Roman" w:cs="Times New Roman"/>
+              </w:rPr>
+            </w:pPr>
+            <w:r>
+              <w:rPr>
+                <w:rFonts w:ascii="Times New Roman" w:hAnsi="Times New Roman" w:cs="Times New Roman"/>
               </w:rPr>
               <w:t>Data at rest (Files)</w:t>
             </w:r>
@@ -5457,12 +5829,12 @@
               <w:pStyle w:val="TableContents"/>
               <w:spacing w:after="140" w:line="274" w:lineRule="auto"/>
               <w:rPr>
-                <w:rFonts w:ascii="Times New Roman" w:hAnsi="Times New Roman"/>
-              </w:rPr>
-            </w:pPr>
-            <w:r>
-              <w:rPr>
-                <w:rFonts w:ascii="Times New Roman" w:hAnsi="Times New Roman"/>
+                <w:rFonts w:ascii="Times New Roman" w:hAnsi="Times New Roman" w:cs="Times New Roman"/>
+              </w:rPr>
+            </w:pPr>
+            <w:r>
+              <w:rPr>
+                <w:rFonts w:ascii="Times New Roman" w:hAnsi="Times New Roman" w:cs="Times New Roman"/>
               </w:rPr>
               <w:t>Data integrity</w:t>
             </w:r>
@@ -5484,12 +5856,12 @@
               <w:pStyle w:val="TableContents"/>
               <w:spacing w:after="140" w:line="274" w:lineRule="auto"/>
               <w:rPr>
-                <w:rFonts w:ascii="Times New Roman" w:hAnsi="Times New Roman"/>
-              </w:rPr>
-            </w:pPr>
-            <w:r>
-              <w:rPr>
-                <w:rFonts w:ascii="Times New Roman" w:hAnsi="Times New Roman"/>
+                <w:rFonts w:ascii="Times New Roman" w:hAnsi="Times New Roman" w:cs="Times New Roman"/>
+              </w:rPr>
+            </w:pPr>
+            <w:r>
+              <w:rPr>
+                <w:rFonts w:ascii="Times New Roman" w:hAnsi="Times New Roman" w:cs="Times New Roman"/>
               </w:rPr>
               <w:t>Password Storage</w:t>
             </w:r>
@@ -5501,12 +5873,12 @@
       <w:pPr>
         <w:spacing w:line="240" w:lineRule="auto"/>
         <w:rPr>
-          <w:rFonts w:ascii="Times New Roman" w:hAnsi="Times New Roman"/>
-        </w:rPr>
-      </w:pPr>
-      <w:r>
-        <w:rPr>
-          <w:rFonts w:ascii="Times New Roman" w:hAnsi="Times New Roman"/>
+          <w:rFonts w:ascii="Times New Roman" w:hAnsi="Times New Roman" w:cs="Times New Roman"/>
+        </w:rPr>
+      </w:pPr>
+      <w:r>
+        <w:rPr>
+          <w:rFonts w:ascii="Times New Roman" w:hAnsi="Times New Roman" w:cs="Times New Roman"/>
         </w:rPr>
         <w:tab/>
         <w:t>Gemini recommended that the size of passwords be increased, citing 8 characters as the bare minimum for this use case. It also said that it is vital that the software used to hash the passwords uses a Cryptographically Secure Pseudo-Random Number Generator (CSPRNG) for the system to work as required.</w:t>
@@ -5516,12 +5888,12 @@
       <w:pPr>
         <w:spacing w:line="240" w:lineRule="auto"/>
         <w:rPr>
-          <w:rFonts w:ascii="Times New Roman" w:hAnsi="Times New Roman"/>
-        </w:rPr>
-      </w:pPr>
-      <w:r>
-        <w:rPr>
-          <w:rFonts w:ascii="Times New Roman" w:hAnsi="Times New Roman"/>
+          <w:rFonts w:ascii="Times New Roman" w:hAnsi="Times New Roman" w:cs="Times New Roman"/>
+        </w:rPr>
+      </w:pPr>
+      <w:r>
+        <w:rPr>
+          <w:rFonts w:ascii="Times New Roman" w:hAnsi="Times New Roman" w:cs="Times New Roman"/>
         </w:rPr>
         <w:t>Gemini Answer Conclusion:</w:t>
       </w:r>
@@ -5529,10 +5901,13 @@
     <w:p>
       <w:pPr>
         <w:spacing w:line="240" w:lineRule="auto"/>
-      </w:pPr>
-      <w:r>
-        <w:rPr>
-          <w:rFonts w:ascii="Times New Roman" w:hAnsi="Times New Roman"/>
+        <w:rPr>
+          <w:rFonts w:ascii="Times New Roman" w:hAnsi="Times New Roman" w:cs="Times New Roman"/>
+        </w:rPr>
+      </w:pPr>
+      <w:r>
+        <w:rPr>
+          <w:rFonts w:ascii="Times New Roman" w:hAnsi="Times New Roman" w:cs="Times New Roman"/>
         </w:rPr>
         <w:tab/>
         <w:t>For a datacenter handling 200 employees, the most effective approach is Salted Hashing using Argon2id. This method is the modern gold standard because it provides robust protection against brute-force and hardware-accelerated attacks while maintaining the "zero-lag" performance required for a smooth user experience. By storing a unique, non-reversible hash rather than an encrypted password, the datacenter ensures that even if the database is compromised, the actual passwords remain unreadable. For an 8-character requirement, this approach provides the necessary security depth without requiring expensive infrastructure or causing noticeable login delays. (Gemini, 2026)</w:t>
@@ -5560,21 +5935,49 @@
         <w:spacing w:line="240" w:lineRule="auto"/>
         <w:ind w:firstLine="720"/>
         <w:rPr>
-          <w:rFonts w:ascii="Times New Roman" w:hAnsi="Times New Roman"/>
-        </w:rPr>
-      </w:pPr>
-      <w:r>
-        <w:rPr>
-          <w:rFonts w:ascii="Times New Roman" w:hAnsi="Times New Roman"/>
-        </w:rPr>
-        <w:t>This category seeks to answer the question of whether AI can properly optimize an encryption algorithm. AI must be able to take into account specified requirements as an engineer would to determine what tradeoffs must be made, while maintaining compliancy. The following prompt has been designed to represent both selection features and optimization strategies.</w:t>
+          <w:rFonts w:ascii="Times New Roman" w:hAnsi="Times New Roman" w:cs="Times New Roman"/>
+        </w:rPr>
+      </w:pPr>
+      <w:r>
+        <w:rPr>
+          <w:rFonts w:ascii="Times New Roman" w:hAnsi="Times New Roman" w:cs="Times New Roman"/>
+        </w:rPr>
+        <w:t xml:space="preserve">This category seeks to answer the question of whether AI can properly optimize an encryption algorithm. AI must be able to </w:t>
+      </w:r>
+      <w:proofErr w:type="gramStart"/>
+      <w:r>
+        <w:rPr>
+          <w:rFonts w:ascii="Times New Roman" w:hAnsi="Times New Roman" w:cs="Times New Roman"/>
+        </w:rPr>
+        <w:t>take into account</w:t>
+      </w:r>
+      <w:proofErr w:type="gramEnd"/>
+      <w:r>
+        <w:rPr>
+          <w:rFonts w:ascii="Times New Roman" w:hAnsi="Times New Roman" w:cs="Times New Roman"/>
+        </w:rPr>
+        <w:t xml:space="preserve"> specified requirements as an engineer would to determine what tradeoffs must be made, while maintaining </w:t>
+      </w:r>
+      <w:proofErr w:type="gramStart"/>
+      <w:r>
+        <w:rPr>
+          <w:rFonts w:ascii="Times New Roman" w:hAnsi="Times New Roman" w:cs="Times New Roman"/>
+        </w:rPr>
+        <w:t>compliancy</w:t>
+      </w:r>
+      <w:proofErr w:type="gramEnd"/>
+      <w:r>
+        <w:rPr>
+          <w:rFonts w:ascii="Times New Roman" w:hAnsi="Times New Roman" w:cs="Times New Roman"/>
+        </w:rPr>
+        <w:t>. The following prompt has been designed to represent both selection features and optimization strategies.</w:t>
       </w:r>
     </w:p>
     <w:p>
       <w:pPr>
         <w:spacing w:line="240" w:lineRule="auto"/>
         <w:rPr>
-          <w:rFonts w:ascii="Times New Roman" w:hAnsi="Times New Roman"/>
+          <w:rFonts w:ascii="Times New Roman" w:hAnsi="Times New Roman" w:cs="Times New Roman"/>
           <w:b/>
           <w:bCs/>
           <w:u w:val="single"/>
@@ -5582,7 +5985,7 @@
       </w:pPr>
       <w:r>
         <w:rPr>
-          <w:rFonts w:ascii="Times New Roman" w:hAnsi="Times New Roman"/>
+          <w:rFonts w:ascii="Times New Roman" w:hAnsi="Times New Roman" w:cs="Times New Roman"/>
           <w:b/>
           <w:bCs/>
           <w:u w:val="single"/>
@@ -5653,8 +6056,16 @@
           <w:rFonts w:ascii="Times New Roman" w:hAnsi="Times New Roman" w:cs="Times New Roman"/>
         </w:rPr>
         <w:lastRenderedPageBreak/>
-        <w:t>Performance: AES-GCM is parallelizable, unlike older models like CBC, which is critical for hitting 5GB/hr</w:t>
-      </w:r>
+        <w:t>Performance: AES-GCM is parallelizable, unlike older models like CBC, which is critical for hitting 5GB/</w:t>
+      </w:r>
+      <w:proofErr w:type="spellStart"/>
+      <w:r>
+        <w:rPr>
+          <w:rFonts w:ascii="Times New Roman" w:hAnsi="Times New Roman" w:cs="Times New Roman"/>
+        </w:rPr>
+        <w:t>hr</w:t>
+      </w:r>
+      <w:proofErr w:type="spellEnd"/>
     </w:p>
     <w:p>
       <w:pPr>
@@ -5702,7 +6113,7 @@
           <w:noProof/>
         </w:rPr>
         <w:drawing>
-          <wp:anchor distT="0" distB="0" distL="0" distR="0" simplePos="0" relativeHeight="9" behindDoc="0" locked="0" layoutInCell="0" allowOverlap="1" wp14:anchorId="1A22ADAD" wp14:editId="1A22ADAE">
+          <wp:anchor distT="0" distB="0" distL="0" distR="0" simplePos="0" relativeHeight="9" behindDoc="0" locked="0" layoutInCell="0" allowOverlap="1" wp14:anchorId="1A22ADAD" wp14:editId="300F1AE0">
             <wp:simplePos x="0" y="0"/>
             <wp:positionH relativeFrom="column">
               <wp:posOffset>1210310</wp:posOffset>
@@ -5768,12 +6179,12 @@
       <w:pPr>
         <w:spacing w:line="240" w:lineRule="auto"/>
         <w:rPr>
-          <w:rFonts w:ascii="Times New Roman" w:hAnsi="Times New Roman"/>
-        </w:rPr>
-      </w:pPr>
-      <w:r>
-        <w:rPr>
-          <w:rFonts w:ascii="Times New Roman" w:hAnsi="Times New Roman"/>
+          <w:rFonts w:ascii="Times New Roman" w:hAnsi="Times New Roman" w:cs="Times New Roman"/>
+        </w:rPr>
+      </w:pPr>
+      <w:r>
+        <w:rPr>
+          <w:rFonts w:ascii="Times New Roman" w:hAnsi="Times New Roman" w:cs="Times New Roman"/>
         </w:rPr>
         <w:t>Gemini Answer Conclusion:</w:t>
       </w:r>
@@ -5783,12 +6194,12 @@
         <w:spacing w:line="240" w:lineRule="auto"/>
         <w:ind w:firstLine="720"/>
         <w:rPr>
-          <w:rFonts w:ascii="Times New Roman" w:hAnsi="Times New Roman"/>
-        </w:rPr>
-      </w:pPr>
-      <w:r>
-        <w:rPr>
-          <w:rFonts w:ascii="Times New Roman" w:hAnsi="Times New Roman"/>
+          <w:rFonts w:ascii="Times New Roman" w:hAnsi="Times New Roman" w:cs="Times New Roman"/>
+        </w:rPr>
+      </w:pPr>
+      <w:r>
+        <w:rPr>
+          <w:rFonts w:ascii="Times New Roman" w:hAnsi="Times New Roman" w:cs="Times New Roman"/>
         </w:rPr>
         <w:t>To achieve high-security encryption of 5GB per hour on constrained hardware while maintaining sub-200ms latency, the optimal solution is AES-GCM (Galois/Counter Mode) leveraging AES-NI or ARMv8 cryptography extensions. This approach succeeds because AES-GCM provides both encryption and integrity in a single, parallelizable pass, while hardware acceleration offloads the heavy mathematical lifting from the general CPU cycles. By breaking data into smaller 64KB chunks and utilizing asynchronous, zero-copy memory patterns, you can comfortably meet the ~1.42 MB/s throughput requirement without blocking system resources or exceeding your strict latency budget. (Gemini, 2026)</w:t>
       </w:r>
@@ -5821,14 +6232,28 @@
         <w:rPr>
           <w:rFonts w:ascii="Times New Roman" w:hAnsi="Times New Roman" w:cs="Times New Roman"/>
         </w:rPr>
-        <w:t>This section represents the most crucial research point of our project, since focused on specific time complexity. This section will test AI’s ability to produce solutions that meet a certain computational time requirement.</w:t>
+        <w:t xml:space="preserve">This section represents the most crucial research point of our </w:t>
+      </w:r>
+      <w:proofErr w:type="gramStart"/>
+      <w:r>
+        <w:rPr>
+          <w:rFonts w:ascii="Times New Roman" w:hAnsi="Times New Roman" w:cs="Times New Roman"/>
+        </w:rPr>
+        <w:t>project, since</w:t>
+      </w:r>
+      <w:proofErr w:type="gramEnd"/>
+      <w:r>
+        <w:rPr>
+          <w:rFonts w:ascii="Times New Roman" w:hAnsi="Times New Roman" w:cs="Times New Roman"/>
+        </w:rPr>
+        <w:t xml:space="preserve"> focused on specific time complexity. This section will test AI’s ability to produce solutions that meet a certain computational time requirement.</w:t>
       </w:r>
     </w:p>
     <w:p>
       <w:pPr>
         <w:spacing w:line="240" w:lineRule="auto"/>
         <w:rPr>
-          <w:rFonts w:ascii="Times New Roman" w:hAnsi="Times New Roman"/>
+          <w:rFonts w:ascii="Times New Roman" w:hAnsi="Times New Roman" w:cs="Times New Roman"/>
           <w:b/>
           <w:bCs/>
           <w:u w:val="single"/>
@@ -5836,7 +6261,7 @@
       </w:pPr>
       <w:r>
         <w:rPr>
-          <w:rFonts w:ascii="Times New Roman" w:hAnsi="Times New Roman"/>
+          <w:rFonts w:ascii="Times New Roman" w:hAnsi="Times New Roman" w:cs="Times New Roman"/>
           <w:b/>
           <w:bCs/>
           <w:u w:val="single"/>
@@ -5848,26 +6273,40 @@
       <w:pPr>
         <w:spacing w:line="240" w:lineRule="auto"/>
         <w:rPr>
-          <w:rFonts w:ascii="Times New Roman" w:hAnsi="Times New Roman"/>
-        </w:rPr>
-      </w:pPr>
-      <w:r>
-        <w:rPr>
-          <w:rFonts w:ascii="Times New Roman" w:hAnsi="Times New Roman"/>
-        </w:rPr>
-        <w:t>Design a small encryption algorithm to encrypt license numbers in constant time then in log time in python.</w:t>
+          <w:rFonts w:ascii="Times New Roman" w:hAnsi="Times New Roman" w:cs="Times New Roman"/>
+        </w:rPr>
+      </w:pPr>
+      <w:r>
+        <w:rPr>
+          <w:rFonts w:ascii="Times New Roman" w:hAnsi="Times New Roman" w:cs="Times New Roman"/>
+        </w:rPr>
+        <w:t xml:space="preserve">Design a small encryption algorithm to encrypt license numbers in constant time </w:t>
+      </w:r>
+      <w:proofErr w:type="gramStart"/>
+      <w:r>
+        <w:rPr>
+          <w:rFonts w:ascii="Times New Roman" w:hAnsi="Times New Roman" w:cs="Times New Roman"/>
+        </w:rPr>
+        <w:t>then</w:t>
+      </w:r>
+      <w:proofErr w:type="gramEnd"/>
+      <w:r>
+        <w:rPr>
+          <w:rFonts w:ascii="Times New Roman" w:hAnsi="Times New Roman" w:cs="Times New Roman"/>
+        </w:rPr>
+        <w:t xml:space="preserve"> in log time in python.</w:t>
       </w:r>
     </w:p>
     <w:p>
       <w:pPr>
         <w:spacing w:line="240" w:lineRule="auto"/>
         <w:rPr>
-          <w:rFonts w:ascii="Times New Roman" w:hAnsi="Times New Roman"/>
-        </w:rPr>
-      </w:pPr>
-      <w:r>
-        <w:rPr>
-          <w:rFonts w:ascii="Times New Roman" w:hAnsi="Times New Roman"/>
+          <w:rFonts w:ascii="Times New Roman" w:hAnsi="Times New Roman" w:cs="Times New Roman"/>
+        </w:rPr>
+      </w:pPr>
+      <w:r>
+        <w:rPr>
+          <w:rFonts w:ascii="Times New Roman" w:hAnsi="Times New Roman" w:cs="Times New Roman"/>
         </w:rPr>
         <w:t>Constant time: perform a fixed number of operations regardless of input size. Use static key and bit-shuffling. Hides a number by mixing it with a secret key and rearranging its bits. Reverse those steps to recover the original value.</w:t>
       </w:r>
@@ -5876,14 +6315,28 @@
       <w:pPr>
         <w:spacing w:line="240" w:lineRule="auto"/>
         <w:rPr>
-          <w:rFonts w:ascii="Times New Roman" w:hAnsi="Times New Roman"/>
-        </w:rPr>
-      </w:pPr>
-      <w:r>
-        <w:rPr>
-          <w:rFonts w:ascii="Times New Roman" w:hAnsi="Times New Roman"/>
-        </w:rPr>
-        <w:t>Log time: The number of processing steps grows logarithmically relative to the value of the input as the input grows. Repeatedly scrambles a number multiple times, proportional to the size of the number in bits. Each scramble, use a slightly different key and rotate the bits.</w:t>
+          <w:rFonts w:ascii="Times New Roman" w:hAnsi="Times New Roman" w:cs="Times New Roman"/>
+        </w:rPr>
+      </w:pPr>
+      <w:r>
+        <w:rPr>
+          <w:rFonts w:ascii="Times New Roman" w:hAnsi="Times New Roman" w:cs="Times New Roman"/>
+        </w:rPr>
+        <w:t xml:space="preserve">Log time: The number of processing steps grows logarithmically relative to the value of the input as the input grows. Repeatedly scrambles a </w:t>
+      </w:r>
+      <w:proofErr w:type="gramStart"/>
+      <w:r>
+        <w:rPr>
+          <w:rFonts w:ascii="Times New Roman" w:hAnsi="Times New Roman" w:cs="Times New Roman"/>
+        </w:rPr>
+        <w:t>number</w:t>
+      </w:r>
+      <w:proofErr w:type="gramEnd"/>
+      <w:r>
+        <w:rPr>
+          <w:rFonts w:ascii="Times New Roman" w:hAnsi="Times New Roman" w:cs="Times New Roman"/>
+        </w:rPr>
+        <w:t xml:space="preserve"> multiple times, proportional to the size of the number in bits. Each scramble, use a slightly different key and rotate the bits.</w:t>
       </w:r>
     </w:p>
     <w:tbl>
@@ -5922,11 +6375,14 @@
             <w:pPr>
               <w:pStyle w:val="TableContents"/>
               <w:spacing w:after="0" w:line="274" w:lineRule="auto"/>
+              <w:rPr>
+                <w:rFonts w:ascii="Times New Roman" w:hAnsi="Times New Roman" w:cs="Times New Roman"/>
+              </w:rPr>
             </w:pPr>
             <w:r>
               <w:rPr>
                 <w:rStyle w:val="Strong"/>
-                <w:rFonts w:ascii="Times New Roman" w:hAnsi="Times New Roman"/>
+                <w:rFonts w:ascii="Times New Roman" w:hAnsi="Times New Roman" w:cs="Times New Roman"/>
               </w:rPr>
               <w:t>Feature</w:t>
             </w:r>
@@ -5947,13 +6403,32 @@
             <w:pPr>
               <w:pStyle w:val="TableContents"/>
               <w:spacing w:after="0" w:line="274" w:lineRule="auto"/>
+              <w:rPr>
+                <w:rFonts w:ascii="Times New Roman" w:hAnsi="Times New Roman" w:cs="Times New Roman"/>
+              </w:rPr>
             </w:pPr>
             <w:r>
               <w:rPr>
                 <w:rStyle w:val="Strong"/>
-                <w:rFonts w:ascii="Times New Roman" w:hAnsi="Times New Roman"/>
-              </w:rPr>
-              <w:t>Constant Time O(1)</w:t>
+                <w:rFonts w:ascii="Times New Roman" w:hAnsi="Times New Roman" w:cs="Times New Roman"/>
+              </w:rPr>
+              <w:t xml:space="preserve">Constant Time </w:t>
+            </w:r>
+            <w:proofErr w:type="gramStart"/>
+            <w:r>
+              <w:rPr>
+                <w:rStyle w:val="Strong"/>
+                <w:rFonts w:ascii="Times New Roman" w:hAnsi="Times New Roman" w:cs="Times New Roman"/>
+              </w:rPr>
+              <w:t>O(</w:t>
+            </w:r>
+            <w:proofErr w:type="gramEnd"/>
+            <w:r>
+              <w:rPr>
+                <w:rStyle w:val="Strong"/>
+                <w:rFonts w:ascii="Times New Roman" w:hAnsi="Times New Roman" w:cs="Times New Roman"/>
+              </w:rPr>
+              <w:t>1)</w:t>
             </w:r>
           </w:p>
         </w:tc>
@@ -5972,13 +6447,32 @@
             <w:pPr>
               <w:pStyle w:val="TableContents"/>
               <w:spacing w:after="0" w:line="274" w:lineRule="auto"/>
+              <w:rPr>
+                <w:rFonts w:ascii="Times New Roman" w:hAnsi="Times New Roman" w:cs="Times New Roman"/>
+              </w:rPr>
             </w:pPr>
             <w:r>
               <w:rPr>
                 <w:rStyle w:val="Strong"/>
-                <w:rFonts w:ascii="Times New Roman" w:hAnsi="Times New Roman"/>
-              </w:rPr>
-              <w:t>Log Time O(logn)</w:t>
+                <w:rFonts w:ascii="Times New Roman" w:hAnsi="Times New Roman" w:cs="Times New Roman"/>
+              </w:rPr>
+              <w:t>Log Time O(</w:t>
+            </w:r>
+            <w:proofErr w:type="spellStart"/>
+            <w:r>
+              <w:rPr>
+                <w:rStyle w:val="Strong"/>
+                <w:rFonts w:ascii="Times New Roman" w:hAnsi="Times New Roman" w:cs="Times New Roman"/>
+              </w:rPr>
+              <w:t>logn</w:t>
+            </w:r>
+            <w:proofErr w:type="spellEnd"/>
+            <w:r>
+              <w:rPr>
+                <w:rStyle w:val="Strong"/>
+                <w:rFonts w:ascii="Times New Roman" w:hAnsi="Times New Roman" w:cs="Times New Roman"/>
+              </w:rPr>
+              <w:t>)</w:t>
             </w:r>
           </w:p>
         </w:tc>
@@ -6000,13 +6494,13 @@
               <w:pStyle w:val="TableContents"/>
               <w:spacing w:after="140" w:line="274" w:lineRule="auto"/>
               <w:rPr>
-                <w:rFonts w:ascii="Times New Roman" w:hAnsi="Times New Roman"/>
+                <w:rFonts w:ascii="Times New Roman" w:hAnsi="Times New Roman" w:cs="Times New Roman"/>
                 <w:b/>
               </w:rPr>
             </w:pPr>
             <w:r>
               <w:rPr>
-                <w:rFonts w:ascii="Times New Roman" w:hAnsi="Times New Roman"/>
+                <w:rFonts w:ascii="Times New Roman" w:hAnsi="Times New Roman" w:cs="Times New Roman"/>
                 <w:b/>
               </w:rPr>
               <w:t>Speed</w:t>
@@ -6029,12 +6523,12 @@
               <w:pStyle w:val="TableContents"/>
               <w:spacing w:after="140" w:line="274" w:lineRule="auto"/>
               <w:rPr>
-                <w:rFonts w:ascii="Times New Roman" w:hAnsi="Times New Roman"/>
-              </w:rPr>
-            </w:pPr>
-            <w:r>
-              <w:rPr>
-                <w:rFonts w:ascii="Times New Roman" w:hAnsi="Times New Roman"/>
+                <w:rFonts w:ascii="Times New Roman" w:hAnsi="Times New Roman" w:cs="Times New Roman"/>
+              </w:rPr>
+            </w:pPr>
+            <w:r>
+              <w:rPr>
+                <w:rFonts w:ascii="Times New Roman" w:hAnsi="Times New Roman" w:cs="Times New Roman"/>
               </w:rPr>
               <w:t>Extremely fast; fixed operations.</w:t>
             </w:r>
@@ -6056,12 +6550,12 @@
               <w:pStyle w:val="TableContents"/>
               <w:spacing w:after="140" w:line="274" w:lineRule="auto"/>
               <w:rPr>
-                <w:rFonts w:ascii="Times New Roman" w:hAnsi="Times New Roman"/>
-              </w:rPr>
-            </w:pPr>
-            <w:r>
-              <w:rPr>
-                <w:rFonts w:ascii="Times New Roman" w:hAnsi="Times New Roman"/>
+                <w:rFonts w:ascii="Times New Roman" w:hAnsi="Times New Roman" w:cs="Times New Roman"/>
+              </w:rPr>
+            </w:pPr>
+            <w:r>
+              <w:rPr>
+                <w:rFonts w:ascii="Times New Roman" w:hAnsi="Times New Roman" w:cs="Times New Roman"/>
               </w:rPr>
               <w:t>Slower; scales with input size.</w:t>
             </w:r>
@@ -6085,13 +6579,13 @@
               <w:pStyle w:val="TableContents"/>
               <w:spacing w:after="140" w:line="274" w:lineRule="auto"/>
               <w:rPr>
-                <w:rFonts w:ascii="Times New Roman" w:hAnsi="Times New Roman"/>
+                <w:rFonts w:ascii="Times New Roman" w:hAnsi="Times New Roman" w:cs="Times New Roman"/>
                 <w:b/>
               </w:rPr>
             </w:pPr>
             <w:r>
               <w:rPr>
-                <w:rFonts w:ascii="Times New Roman" w:hAnsi="Times New Roman"/>
+                <w:rFonts w:ascii="Times New Roman" w:hAnsi="Times New Roman" w:cs="Times New Roman"/>
                 <w:b/>
               </w:rPr>
               <w:t>Security</w:t>
@@ -6114,12 +6608,12 @@
               <w:pStyle w:val="TableContents"/>
               <w:spacing w:after="140" w:line="274" w:lineRule="auto"/>
               <w:rPr>
-                <w:rFonts w:ascii="Times New Roman" w:hAnsi="Times New Roman"/>
-              </w:rPr>
-            </w:pPr>
-            <w:r>
-              <w:rPr>
-                <w:rFonts w:ascii="Times New Roman" w:hAnsi="Times New Roman"/>
+                <w:rFonts w:ascii="Times New Roman" w:hAnsi="Times New Roman" w:cs="Times New Roman"/>
+              </w:rPr>
+            </w:pPr>
+            <w:r>
+              <w:rPr>
+                <w:rFonts w:ascii="Times New Roman" w:hAnsi="Times New Roman" w:cs="Times New Roman"/>
               </w:rPr>
               <w:t>Very weak (easily reversible).</w:t>
             </w:r>
@@ -6141,12 +6635,12 @@
               <w:pStyle w:val="TableContents"/>
               <w:spacing w:after="140" w:line="274" w:lineRule="auto"/>
               <w:rPr>
-                <w:rFonts w:ascii="Times New Roman" w:hAnsi="Times New Roman"/>
-              </w:rPr>
-            </w:pPr>
-            <w:r>
-              <w:rPr>
-                <w:rFonts w:ascii="Times New Roman" w:hAnsi="Times New Roman"/>
+                <w:rFonts w:ascii="Times New Roman" w:hAnsi="Times New Roman" w:cs="Times New Roman"/>
+              </w:rPr>
+            </w:pPr>
+            <w:r>
+              <w:rPr>
+                <w:rFonts w:ascii="Times New Roman" w:hAnsi="Times New Roman" w:cs="Times New Roman"/>
               </w:rPr>
               <w:t>Slightly better due to multiple rounds.</w:t>
             </w:r>
@@ -6170,13 +6664,13 @@
               <w:pStyle w:val="TableContents"/>
               <w:spacing w:after="140" w:line="274" w:lineRule="auto"/>
               <w:rPr>
-                <w:rFonts w:ascii="Times New Roman" w:hAnsi="Times New Roman"/>
+                <w:rFonts w:ascii="Times New Roman" w:hAnsi="Times New Roman" w:cs="Times New Roman"/>
                 <w:b/>
               </w:rPr>
             </w:pPr>
             <w:r>
               <w:rPr>
-                <w:rFonts w:ascii="Times New Roman" w:hAnsi="Times New Roman"/>
+                <w:rFonts w:ascii="Times New Roman" w:hAnsi="Times New Roman" w:cs="Times New Roman"/>
                 <w:b/>
               </w:rPr>
               <w:lastRenderedPageBreak/>
@@ -6200,12 +6694,12 @@
               <w:pStyle w:val="TableContents"/>
               <w:spacing w:after="140" w:line="274" w:lineRule="auto"/>
               <w:rPr>
-                <w:rFonts w:ascii="Times New Roman" w:hAnsi="Times New Roman"/>
-              </w:rPr>
-            </w:pPr>
-            <w:r>
-              <w:rPr>
-                <w:rFonts w:ascii="Times New Roman" w:hAnsi="Times New Roman"/>
+                <w:rFonts w:ascii="Times New Roman" w:hAnsi="Times New Roman" w:cs="Times New Roman"/>
+              </w:rPr>
+            </w:pPr>
+            <w:r>
+              <w:rPr>
+                <w:rFonts w:ascii="Times New Roman" w:hAnsi="Times New Roman" w:cs="Times New Roman"/>
               </w:rPr>
               <w:t>Simple obfuscation.</w:t>
             </w:r>
@@ -6227,12 +6721,12 @@
               <w:pStyle w:val="TableContents"/>
               <w:spacing w:after="140" w:line="274" w:lineRule="auto"/>
               <w:rPr>
-                <w:rFonts w:ascii="Times New Roman" w:hAnsi="Times New Roman"/>
-              </w:rPr>
-            </w:pPr>
-            <w:r>
-              <w:rPr>
-                <w:rFonts w:ascii="Times New Roman" w:hAnsi="Times New Roman"/>
+                <w:rFonts w:ascii="Times New Roman" w:hAnsi="Times New Roman" w:cs="Times New Roman"/>
+              </w:rPr>
+            </w:pPr>
+            <w:r>
+              <w:rPr>
+                <w:rFonts w:ascii="Times New Roman" w:hAnsi="Times New Roman" w:cs="Times New Roman"/>
               </w:rPr>
               <w:t>Variable-length ID masking.</w:t>
             </w:r>
@@ -6244,7 +6738,7 @@
       <w:pPr>
         <w:spacing w:line="240" w:lineRule="auto"/>
         <w:rPr>
-          <w:rFonts w:ascii="Times New Roman" w:hAnsi="Times New Roman"/>
+          <w:rFonts w:ascii="Times New Roman" w:hAnsi="Times New Roman" w:cs="Times New Roman"/>
         </w:rPr>
       </w:pPr>
     </w:p>
@@ -6265,12 +6759,12 @@
       <w:pPr>
         <w:spacing w:line="240" w:lineRule="auto"/>
         <w:rPr>
-          <w:rFonts w:ascii="Times New Roman" w:hAnsi="Times New Roman"/>
-        </w:rPr>
-      </w:pPr>
-      <w:r>
-        <w:rPr>
-          <w:rFonts w:ascii="Times New Roman" w:hAnsi="Times New Roman"/>
+          <w:rFonts w:ascii="Times New Roman" w:hAnsi="Times New Roman" w:cs="Times New Roman"/>
+        </w:rPr>
+      </w:pPr>
+      <w:r>
+        <w:rPr>
+          <w:rFonts w:ascii="Times New Roman" w:hAnsi="Times New Roman" w:cs="Times New Roman"/>
           <w:noProof/>
         </w:rPr>
         <w:drawing>
@@ -6342,12 +6836,12 @@
     <w:p>
       <w:pPr>
         <w:rPr>
-          <w:rFonts w:ascii="Times New Roman" w:hAnsi="Times New Roman"/>
-        </w:rPr>
-      </w:pPr>
-      <w:r>
-        <w:rPr>
-          <w:rFonts w:ascii="Times New Roman" w:hAnsi="Times New Roman"/>
+          <w:rFonts w:ascii="Times New Roman" w:hAnsi="Times New Roman" w:cs="Times New Roman"/>
+        </w:rPr>
+      </w:pPr>
+      <w:r>
+        <w:rPr>
+          <w:rFonts w:ascii="Times New Roman" w:hAnsi="Times New Roman" w:cs="Times New Roman"/>
           <w:b/>
           <w:bCs/>
           <w:u w:val="single"/>
@@ -6356,7 +6850,7 @@
       </w:r>
       <w:r>
         <w:rPr>
-          <w:rFonts w:ascii="Times New Roman" w:hAnsi="Times New Roman"/>
+          <w:rFonts w:ascii="Times New Roman" w:hAnsi="Times New Roman" w:cs="Times New Roman"/>
         </w:rPr>
         <w:t>: Provide a solution to hash a bank’s transaction history, sacrifice computational time to prove the best security.</w:t>
       </w:r>
@@ -6365,25 +6859,39 @@
       <w:pPr>
         <w:ind w:firstLine="720"/>
         <w:rPr>
-          <w:rFonts w:ascii="Times New Roman" w:hAnsi="Times New Roman"/>
-        </w:rPr>
-      </w:pPr>
-      <w:r>
-        <w:rPr>
-          <w:rFonts w:ascii="Times New Roman" w:hAnsi="Times New Roman"/>
-        </w:rPr>
-        <w:t>Gemini presented the goal as not just hiding data, but making it computationally expensive to try to crack it (key stretching). To achieve this, Memory-Hard Functions should be used, which resist specialized hardware such as ASICs or GPUs, by requiring a large amount of RAM to compute. Gemini recommended the algorithm Argon2id, and using a Hash Tree structure, not hashing the whole file as one block. Parameters can be set such that a single hash takes ~0.5 to 1 second to complete.</w:t>
-      </w:r>
-    </w:p>
-    <w:p>
-      <w:pPr>
-        <w:rPr>
-          <w:rFonts w:ascii="Times New Roman" w:hAnsi="Times New Roman"/>
-        </w:rPr>
-      </w:pPr>
-      <w:r>
-        <w:rPr>
-          <w:rFonts w:ascii="Times New Roman" w:hAnsi="Times New Roman"/>
+          <w:rFonts w:ascii="Times New Roman" w:hAnsi="Times New Roman" w:cs="Times New Roman"/>
+        </w:rPr>
+      </w:pPr>
+      <w:r>
+        <w:rPr>
+          <w:rFonts w:ascii="Times New Roman" w:hAnsi="Times New Roman" w:cs="Times New Roman"/>
+        </w:rPr>
+        <w:t xml:space="preserve">Gemini presented the goal as not just hiding </w:t>
+      </w:r>
+      <w:proofErr w:type="gramStart"/>
+      <w:r>
+        <w:rPr>
+          <w:rFonts w:ascii="Times New Roman" w:hAnsi="Times New Roman" w:cs="Times New Roman"/>
+        </w:rPr>
+        <w:t>data, but</w:t>
+      </w:r>
+      <w:proofErr w:type="gramEnd"/>
+      <w:r>
+        <w:rPr>
+          <w:rFonts w:ascii="Times New Roman" w:hAnsi="Times New Roman" w:cs="Times New Roman"/>
+        </w:rPr>
+        <w:t xml:space="preserve"> making it computationally expensive to try to crack it (key stretching). To achieve this, Memory-Hard Functions should be used, which resist specialized hardware such as ASICs or GPUs, by requiring a large amount of RAM to compute. Gemini recommended the algorithm Argon2id, and using a Hash Tree structure, not hashing the whole file as one block. Parameters can be set such that a single hash takes ~0.5 to 1 second to complete.</w:t>
+      </w:r>
+    </w:p>
+    <w:p>
+      <w:pPr>
+        <w:rPr>
+          <w:rFonts w:ascii="Times New Roman" w:hAnsi="Times New Roman" w:cs="Times New Roman"/>
+        </w:rPr>
+      </w:pPr>
+      <w:r>
+        <w:rPr>
+          <w:rFonts w:ascii="Times New Roman" w:hAnsi="Times New Roman" w:cs="Times New Roman"/>
         </w:rPr>
         <w:t>The following table was given by Gemini as an overview of each component of the system:</w:t>
       </w:r>
@@ -6424,11 +6932,14 @@
             <w:pPr>
               <w:pStyle w:val="TableContents"/>
               <w:spacing w:after="0" w:line="274" w:lineRule="auto"/>
+              <w:rPr>
+                <w:rFonts w:ascii="Times New Roman" w:hAnsi="Times New Roman" w:cs="Times New Roman"/>
+              </w:rPr>
             </w:pPr>
             <w:r>
               <w:rPr>
                 <w:rStyle w:val="Strong"/>
-                <w:rFonts w:ascii="Times New Roman" w:hAnsi="Times New Roman"/>
+                <w:rFonts w:ascii="Times New Roman" w:hAnsi="Times New Roman" w:cs="Times New Roman"/>
               </w:rPr>
               <w:t>Parameter</w:t>
             </w:r>
@@ -6449,11 +6960,14 @@
             <w:pPr>
               <w:pStyle w:val="TableContents"/>
               <w:spacing w:after="0" w:line="274" w:lineRule="auto"/>
+              <w:rPr>
+                <w:rFonts w:ascii="Times New Roman" w:hAnsi="Times New Roman" w:cs="Times New Roman"/>
+              </w:rPr>
             </w:pPr>
             <w:r>
               <w:rPr>
                 <w:rStyle w:val="Strong"/>
-                <w:rFonts w:ascii="Times New Roman" w:hAnsi="Times New Roman"/>
+                <w:rFonts w:ascii="Times New Roman" w:hAnsi="Times New Roman" w:cs="Times New Roman"/>
               </w:rPr>
               <w:t>Recommended Value</w:t>
             </w:r>
@@ -6474,11 +6988,14 @@
             <w:pPr>
               <w:pStyle w:val="TableContents"/>
               <w:spacing w:after="0" w:line="274" w:lineRule="auto"/>
+              <w:rPr>
+                <w:rFonts w:ascii="Times New Roman" w:hAnsi="Times New Roman" w:cs="Times New Roman"/>
+              </w:rPr>
             </w:pPr>
             <w:r>
               <w:rPr>
                 <w:rStyle w:val="Strong"/>
-                <w:rFonts w:ascii="Times New Roman" w:hAnsi="Times New Roman"/>
+                <w:rFonts w:ascii="Times New Roman" w:hAnsi="Times New Roman" w:cs="Times New Roman"/>
               </w:rPr>
               <w:t>Purpose</w:t>
             </w:r>
@@ -6502,13 +7019,13 @@
               <w:pStyle w:val="TableContents"/>
               <w:spacing w:after="140" w:line="274" w:lineRule="auto"/>
               <w:rPr>
-                <w:rFonts w:ascii="Times New Roman" w:hAnsi="Times New Roman"/>
+                <w:rFonts w:ascii="Times New Roman" w:hAnsi="Times New Roman" w:cs="Times New Roman"/>
                 <w:b/>
               </w:rPr>
             </w:pPr>
             <w:r>
               <w:rPr>
-                <w:rFonts w:ascii="Times New Roman" w:hAnsi="Times New Roman"/>
+                <w:rFonts w:ascii="Times New Roman" w:hAnsi="Times New Roman" w:cs="Times New Roman"/>
                 <w:b/>
               </w:rPr>
               <w:t>Algorithm</w:t>
@@ -6531,12 +7048,12 @@
               <w:pStyle w:val="TableContents"/>
               <w:spacing w:after="140" w:line="274" w:lineRule="auto"/>
               <w:rPr>
-                <w:rFonts w:ascii="Times New Roman" w:hAnsi="Times New Roman"/>
-              </w:rPr>
-            </w:pPr>
-            <w:r>
-              <w:rPr>
-                <w:rFonts w:ascii="Times New Roman" w:hAnsi="Times New Roman"/>
+                <w:rFonts w:ascii="Times New Roman" w:hAnsi="Times New Roman" w:cs="Times New Roman"/>
+              </w:rPr>
+            </w:pPr>
+            <w:r>
+              <w:rPr>
+                <w:rFonts w:ascii="Times New Roman" w:hAnsi="Times New Roman" w:cs="Times New Roman"/>
               </w:rPr>
               <w:t>Argon2id</w:t>
             </w:r>
@@ -6558,12 +7075,12 @@
               <w:pStyle w:val="TableContents"/>
               <w:spacing w:after="140" w:line="274" w:lineRule="auto"/>
               <w:rPr>
-                <w:rFonts w:ascii="Times New Roman" w:hAnsi="Times New Roman"/>
-              </w:rPr>
-            </w:pPr>
-            <w:r>
-              <w:rPr>
-                <w:rFonts w:ascii="Times New Roman" w:hAnsi="Times New Roman"/>
+                <w:rFonts w:ascii="Times New Roman" w:hAnsi="Times New Roman" w:cs="Times New Roman"/>
+              </w:rPr>
+            </w:pPr>
+            <w:r>
+              <w:rPr>
+                <w:rFonts w:ascii="Times New Roman" w:hAnsi="Times New Roman" w:cs="Times New Roman"/>
               </w:rPr>
               <w:t>Hybrid approach for maximum resistance.</w:t>
             </w:r>
@@ -6587,13 +7104,13 @@
               <w:pStyle w:val="TableContents"/>
               <w:spacing w:after="140" w:line="274" w:lineRule="auto"/>
               <w:rPr>
-                <w:rFonts w:ascii="Times New Roman" w:hAnsi="Times New Roman"/>
+                <w:rFonts w:ascii="Times New Roman" w:hAnsi="Times New Roman" w:cs="Times New Roman"/>
                 <w:b/>
               </w:rPr>
             </w:pPr>
             <w:r>
               <w:rPr>
-                <w:rFonts w:ascii="Times New Roman" w:hAnsi="Times New Roman"/>
+                <w:rFonts w:ascii="Times New Roman" w:hAnsi="Times New Roman" w:cs="Times New Roman"/>
                 <w:b/>
               </w:rPr>
               <w:t>Memory Cost</w:t>
@@ -6616,12 +7133,12 @@
               <w:pStyle w:val="TableContents"/>
               <w:spacing w:after="140" w:line="274" w:lineRule="auto"/>
               <w:rPr>
-                <w:rFonts w:ascii="Times New Roman" w:hAnsi="Times New Roman"/>
-              </w:rPr>
-            </w:pPr>
-            <w:r>
-              <w:rPr>
-                <w:rFonts w:ascii="Times New Roman" w:hAnsi="Times New Roman"/>
+                <w:rFonts w:ascii="Times New Roman" w:hAnsi="Times New Roman" w:cs="Times New Roman"/>
+              </w:rPr>
+            </w:pPr>
+            <w:r>
+              <w:rPr>
+                <w:rFonts w:ascii="Times New Roman" w:hAnsi="Times New Roman" w:cs="Times New Roman"/>
               </w:rPr>
               <w:t>2GB - 4GB</w:t>
             </w:r>
@@ -6643,12 +7160,12 @@
               <w:pStyle w:val="TableContents"/>
               <w:spacing w:after="140" w:line="274" w:lineRule="auto"/>
               <w:rPr>
-                <w:rFonts w:ascii="Times New Roman" w:hAnsi="Times New Roman"/>
-              </w:rPr>
-            </w:pPr>
-            <w:r>
-              <w:rPr>
-                <w:rFonts w:ascii="Times New Roman" w:hAnsi="Times New Roman"/>
+                <w:rFonts w:ascii="Times New Roman" w:hAnsi="Times New Roman" w:cs="Times New Roman"/>
+              </w:rPr>
+            </w:pPr>
+            <w:r>
+              <w:rPr>
+                <w:rFonts w:ascii="Times New Roman" w:hAnsi="Times New Roman" w:cs="Times New Roman"/>
               </w:rPr>
               <w:t>Forces attackers to use massive amounts of expensive RAM.</w:t>
             </w:r>
@@ -6672,13 +7189,13 @@
               <w:pStyle w:val="TableContents"/>
               <w:spacing w:after="140" w:line="274" w:lineRule="auto"/>
               <w:rPr>
-                <w:rFonts w:ascii="Times New Roman" w:hAnsi="Times New Roman"/>
+                <w:rFonts w:ascii="Times New Roman" w:hAnsi="Times New Roman" w:cs="Times New Roman"/>
                 <w:b/>
               </w:rPr>
             </w:pPr>
             <w:r>
               <w:rPr>
-                <w:rFonts w:ascii="Times New Roman" w:hAnsi="Times New Roman"/>
+                <w:rFonts w:ascii="Times New Roman" w:hAnsi="Times New Roman" w:cs="Times New Roman"/>
                 <w:b/>
               </w:rPr>
               <w:t>Time Cost</w:t>
@@ -6701,12 +7218,12 @@
               <w:pStyle w:val="TableContents"/>
               <w:spacing w:after="140" w:line="274" w:lineRule="auto"/>
               <w:rPr>
-                <w:rFonts w:ascii="Times New Roman" w:hAnsi="Times New Roman"/>
-              </w:rPr>
-            </w:pPr>
-            <w:r>
-              <w:rPr>
-                <w:rFonts w:ascii="Times New Roman" w:hAnsi="Times New Roman"/>
+                <w:rFonts w:ascii="Times New Roman" w:hAnsi="Times New Roman" w:cs="Times New Roman"/>
+              </w:rPr>
+            </w:pPr>
+            <w:r>
+              <w:rPr>
+                <w:rFonts w:ascii="Times New Roman" w:hAnsi="Times New Roman" w:cs="Times New Roman"/>
               </w:rPr>
               <w:t>10+ Iterations</w:t>
             </w:r>
@@ -6728,14 +7245,22 @@
               <w:pStyle w:val="TableContents"/>
               <w:spacing w:after="140" w:line="274" w:lineRule="auto"/>
               <w:rPr>
-                <w:rFonts w:ascii="Times New Roman" w:hAnsi="Times New Roman"/>
-              </w:rPr>
-            </w:pPr>
-            <w:r>
-              <w:rPr>
-                <w:rFonts w:ascii="Times New Roman" w:hAnsi="Times New Roman"/>
-              </w:rPr>
-              <w:t>Increases the time required for each guess.</w:t>
+                <w:rFonts w:ascii="Times New Roman" w:hAnsi="Times New Roman" w:cs="Times New Roman"/>
+              </w:rPr>
+            </w:pPr>
+            <w:proofErr w:type="gramStart"/>
+            <w:r>
+              <w:rPr>
+                <w:rFonts w:ascii="Times New Roman" w:hAnsi="Times New Roman" w:cs="Times New Roman"/>
+              </w:rPr>
+              <w:t>Increases</w:t>
+            </w:r>
+            <w:proofErr w:type="gramEnd"/>
+            <w:r>
+              <w:rPr>
+                <w:rFonts w:ascii="Times New Roman" w:hAnsi="Times New Roman" w:cs="Times New Roman"/>
+              </w:rPr>
+              <w:t xml:space="preserve"> the time required for each guess.</w:t>
             </w:r>
           </w:p>
         </w:tc>
@@ -6757,13 +7282,13 @@
               <w:pStyle w:val="TableContents"/>
               <w:spacing w:after="140" w:line="274" w:lineRule="auto"/>
               <w:rPr>
-                <w:rFonts w:ascii="Times New Roman" w:hAnsi="Times New Roman"/>
+                <w:rFonts w:ascii="Times New Roman" w:hAnsi="Times New Roman" w:cs="Times New Roman"/>
                 <w:b/>
               </w:rPr>
             </w:pPr>
             <w:r>
               <w:rPr>
-                <w:rFonts w:ascii="Times New Roman" w:hAnsi="Times New Roman"/>
+                <w:rFonts w:ascii="Times New Roman" w:hAnsi="Times New Roman" w:cs="Times New Roman"/>
                 <w:b/>
               </w:rPr>
               <w:t>Salt</w:t>
@@ -6786,12 +7311,12 @@
               <w:pStyle w:val="TableContents"/>
               <w:spacing w:after="140" w:line="274" w:lineRule="auto"/>
               <w:rPr>
-                <w:rFonts w:ascii="Times New Roman" w:hAnsi="Times New Roman"/>
-              </w:rPr>
-            </w:pPr>
-            <w:r>
-              <w:rPr>
-                <w:rFonts w:ascii="Times New Roman" w:hAnsi="Times New Roman"/>
+                <w:rFonts w:ascii="Times New Roman" w:hAnsi="Times New Roman" w:cs="Times New Roman"/>
+              </w:rPr>
+            </w:pPr>
+            <w:r>
+              <w:rPr>
+                <w:rFonts w:ascii="Times New Roman" w:hAnsi="Times New Roman" w:cs="Times New Roman"/>
               </w:rPr>
               <w:t>16+ Bytes</w:t>
             </w:r>
@@ -6813,12 +7338,12 @@
               <w:pStyle w:val="TableContents"/>
               <w:spacing w:after="140" w:line="274" w:lineRule="auto"/>
               <w:rPr>
-                <w:rFonts w:ascii="Times New Roman" w:hAnsi="Times New Roman"/>
-              </w:rPr>
-            </w:pPr>
-            <w:r>
-              <w:rPr>
-                <w:rFonts w:ascii="Times New Roman" w:hAnsi="Times New Roman"/>
+                <w:rFonts w:ascii="Times New Roman" w:hAnsi="Times New Roman" w:cs="Times New Roman"/>
+              </w:rPr>
+            </w:pPr>
+            <w:r>
+              <w:rPr>
+                <w:rFonts w:ascii="Times New Roman" w:hAnsi="Times New Roman" w:cs="Times New Roman"/>
               </w:rPr>
               <w:t>Unique per transaction to prevent Rainbow Table attacks.</w:t>
             </w:r>
@@ -6829,7 +7354,7 @@
     <w:p>
       <w:pPr>
         <w:rPr>
-          <w:rFonts w:ascii="Times New Roman" w:hAnsi="Times New Roman"/>
+          <w:rFonts w:ascii="Times New Roman" w:hAnsi="Times New Roman" w:cs="Times New Roman"/>
         </w:rPr>
       </w:pPr>
     </w:p>
@@ -6837,12 +7362,12 @@
       <w:pPr>
         <w:ind w:firstLine="720"/>
         <w:rPr>
-          <w:rFonts w:ascii="Times New Roman" w:hAnsi="Times New Roman"/>
-        </w:rPr>
-      </w:pPr>
-      <w:r>
-        <w:rPr>
-          <w:rFonts w:ascii="Times New Roman" w:hAnsi="Times New Roman"/>
+          <w:rFonts w:ascii="Times New Roman" w:hAnsi="Times New Roman" w:cs="Times New Roman"/>
+        </w:rPr>
+      </w:pPr>
+      <w:r>
+        <w:rPr>
+          <w:rFonts w:ascii="Times New Roman" w:hAnsi="Times New Roman" w:cs="Times New Roman"/>
         </w:rPr>
         <w:lastRenderedPageBreak/>
         <w:t>The architecture around the function was presented by Gemini as the real source of security, beyond the function used. Gemini is quoted below:</w:t>
@@ -6851,23 +7376,26 @@
     <w:p>
       <w:pPr>
         <w:pStyle w:val="BodyText"/>
-      </w:pPr>
-      <w:r>
-        <w:rPr>
-          <w:rFonts w:ascii="Times New Roman" w:hAnsi="Times New Roman"/>
+        <w:rPr>
+          <w:rFonts w:ascii="Times New Roman" w:hAnsi="Times New Roman" w:cs="Times New Roman"/>
+        </w:rPr>
+      </w:pPr>
+      <w:r>
+        <w:rPr>
+          <w:rFonts w:ascii="Times New Roman" w:hAnsi="Times New Roman" w:cs="Times New Roman"/>
         </w:rPr>
         <w:t>“</w:t>
       </w:r>
       <w:r>
         <w:rPr>
-          <w:rFonts w:ascii="Times New Roman" w:hAnsi="Times New Roman"/>
+          <w:rFonts w:ascii="Times New Roman" w:hAnsi="Times New Roman" w:cs="Times New Roman"/>
           <w:b/>
         </w:rPr>
         <w:t>Peppering:</w:t>
       </w:r>
       <w:r>
         <w:rPr>
-          <w:rFonts w:ascii="Times New Roman" w:hAnsi="Times New Roman"/>
+          <w:rFonts w:ascii="Times New Roman" w:hAnsi="Times New Roman" w:cs="Times New Roman"/>
         </w:rPr>
         <w:t xml:space="preserve"> In addition to a salt, use a "pepper"—a secret key stored in a Hardware Security Module (HSM) or a separate vault. Even if the database is leaked, the hashes cannot be computed without this secret.</w:t>
       </w:r>
@@ -6877,34 +7405,48 @@
         <w:pStyle w:val="BodyText"/>
         <w:spacing w:after="160" w:line="278" w:lineRule="auto"/>
         <w:rPr>
-          <w:rFonts w:ascii="Times New Roman" w:hAnsi="Times New Roman"/>
-        </w:rPr>
-      </w:pPr>
-      <w:r>
-        <w:rPr>
-          <w:rFonts w:ascii="Times New Roman" w:hAnsi="Times New Roman"/>
+          <w:rFonts w:ascii="Times New Roman" w:hAnsi="Times New Roman" w:cs="Times New Roman"/>
+        </w:rPr>
+      </w:pPr>
+      <w:r>
+        <w:rPr>
+          <w:rFonts w:ascii="Times New Roman" w:hAnsi="Times New Roman" w:cs="Times New Roman"/>
           <w:b/>
         </w:rPr>
         <w:t>Chaining:</w:t>
       </w:r>
       <w:r>
         <w:rPr>
-          <w:rFonts w:ascii="Times New Roman" w:hAnsi="Times New Roman"/>
+          <w:rFonts w:ascii="Times New Roman" w:hAnsi="Times New Roman" w:cs="Times New Roman"/>
         </w:rPr>
         <w:t xml:space="preserve"> Each transaction hash should include the hash of the </w:t>
       </w:r>
       <w:r>
         <w:rPr>
-          <w:rFonts w:ascii="Times New Roman" w:hAnsi="Times New Roman"/>
+          <w:rFonts w:ascii="Times New Roman" w:hAnsi="Times New Roman" w:cs="Times New Roman"/>
           <w:i/>
         </w:rPr>
         <w:t>previous</w:t>
       </w:r>
       <w:r>
         <w:rPr>
-          <w:rFonts w:ascii="Times New Roman" w:hAnsi="Times New Roman"/>
-        </w:rPr>
-        <w:t xml:space="preserve"> transaction. This creates a tamper-evident ledger where changing one record invalidates every subsequent record.</w:t>
+          <w:rFonts w:ascii="Times New Roman" w:hAnsi="Times New Roman" w:cs="Times New Roman"/>
+        </w:rPr>
+        <w:t xml:space="preserve"> transaction. This creates a tamper-evident ledger </w:t>
+      </w:r>
+      <w:proofErr w:type="gramStart"/>
+      <w:r>
+        <w:rPr>
+          <w:rFonts w:ascii="Times New Roman" w:hAnsi="Times New Roman" w:cs="Times New Roman"/>
+        </w:rPr>
+        <w:t>where</w:t>
+      </w:r>
+      <w:proofErr w:type="gramEnd"/>
+      <w:r>
+        <w:rPr>
+          <w:rFonts w:ascii="Times New Roman" w:hAnsi="Times New Roman" w:cs="Times New Roman"/>
+        </w:rPr>
+        <w:t xml:space="preserve"> changing one record invalidates every subsequent record.</w:t>
       </w:r>
     </w:p>
     <w:p>
@@ -6912,19 +7454,19 @@
         <w:pStyle w:val="BodyText"/>
         <w:spacing w:after="160" w:line="278" w:lineRule="auto"/>
         <w:rPr>
-          <w:rFonts w:ascii="Times New Roman" w:hAnsi="Times New Roman"/>
-        </w:rPr>
-      </w:pPr>
-      <w:r>
-        <w:rPr>
-          <w:rFonts w:ascii="Times New Roman" w:hAnsi="Times New Roman"/>
+          <w:rFonts w:ascii="Times New Roman" w:hAnsi="Times New Roman" w:cs="Times New Roman"/>
+        </w:rPr>
+      </w:pPr>
+      <w:r>
+        <w:rPr>
+          <w:rFonts w:ascii="Times New Roman" w:hAnsi="Times New Roman" w:cs="Times New Roman"/>
           <w:b/>
         </w:rPr>
         <w:t>Quantum Resistance:</w:t>
       </w:r>
       <w:r>
         <w:rPr>
-          <w:rFonts w:ascii="Times New Roman" w:hAnsi="Times New Roman"/>
+          <w:rFonts w:ascii="Times New Roman" w:hAnsi="Times New Roman" w:cs="Times New Roman"/>
         </w:rPr>
         <w:t xml:space="preserve"> While Argon2 is robust, ensure your overall system uses sufficiently large output lengths (e.g., 512-bit) to remain resilient against future Grover’s algorithm-based attacks”</w:t>
       </w:r>
@@ -6964,7 +7506,35 @@
         <w:rPr>
           <w:rFonts w:ascii="Times New Roman" w:hAnsi="Times New Roman" w:cs="Times New Roman"/>
         </w:rPr>
-        <w:t>Google Gemini performed well in answering all prompts. However, it did not provide a clear overview of each problem before proving the answer. Gemini would provide a strong and usable answer, but would not show any detailed steps of how it worked through the problem to get to that solution. It appeared as if Gemini preferred to, whenever possible, give the bare minimum working solution, and did not want to add any more details in its response. The AI model may be intentionally tuned to use as few tokens as possible while still providing a correct response, rather than exhaustively explaining that response. In addition, Gemini did not by itself provide a summary overview of its solution, and a second prompt was required for each problem, specifically asking for the answer to be summarized into a clear, easy to understand paragraph.</w:t>
+        <w:t xml:space="preserve">Google Gemini performed well in answering all prompts. However, it did not provide a clear overview of each problem before proving the answer. Gemini would provide a strong and usable </w:t>
+      </w:r>
+      <w:proofErr w:type="gramStart"/>
+      <w:r>
+        <w:rPr>
+          <w:rFonts w:ascii="Times New Roman" w:hAnsi="Times New Roman" w:cs="Times New Roman"/>
+        </w:rPr>
+        <w:t>answer, but</w:t>
+      </w:r>
+      <w:proofErr w:type="gramEnd"/>
+      <w:r>
+        <w:rPr>
+          <w:rFonts w:ascii="Times New Roman" w:hAnsi="Times New Roman" w:cs="Times New Roman"/>
+        </w:rPr>
+        <w:t xml:space="preserve"> would not show any detailed steps of how it worked through the problem to get to that solution. It appeared as if Gemini preferred to, whenever possible, give the bare minimum working solution, and did not want to add any more details </w:t>
+      </w:r>
+      <w:proofErr w:type="gramStart"/>
+      <w:r>
+        <w:rPr>
+          <w:rFonts w:ascii="Times New Roman" w:hAnsi="Times New Roman" w:cs="Times New Roman"/>
+        </w:rPr>
+        <w:t>in</w:t>
+      </w:r>
+      <w:proofErr w:type="gramEnd"/>
+      <w:r>
+        <w:rPr>
+          <w:rFonts w:ascii="Times New Roman" w:hAnsi="Times New Roman" w:cs="Times New Roman"/>
+        </w:rPr>
+        <w:t xml:space="preserve"> its response. The AI model may be intentionally tuned to use as few tokens as possible while still providing a correct response, rather than exhaustively explaining that response. In addition, Gemini did not by itself provide a summary overview of its solution, and a second prompt was required for each problem, specifically asking for the answer to be summarized into a clear, easy to understand paragraph.</w:t>
       </w:r>
     </w:p>
     <w:p>
@@ -6995,13 +7565,16 @@
       <w:bookmarkEnd w:id="9"/>
     </w:p>
     <w:p>
-      <w:r>
+      <w:pPr>
+        <w:rPr>
+          <w:rFonts w:ascii="Times New Roman" w:hAnsi="Times New Roman" w:cs="Times New Roman"/>
+        </w:rPr>
+      </w:pPr>
+      <w:r>
+        <w:rPr>
+          <w:rFonts w:ascii="Times New Roman" w:hAnsi="Times New Roman" w:cs="Times New Roman"/>
+        </w:rPr>
         <w:tab/>
-      </w:r>
-      <w:r>
-        <w:rPr>
-          <w:rFonts w:ascii="Times New Roman" w:hAnsi="Times New Roman" w:cs="Times New Roman"/>
-        </w:rPr>
         <w:t>For the third and final AI model, we will prompt Microsoft’s Copilot with the same queries from the four different categories that we used for the other two models. Each prompt will be performed in a new chat to prevent previous memory and history from interfering with the validity or persuasion of the data. Each prompt will be designed with enough information for the model to solve, however, it will be checked for any inflection that would convince the model of a specific solution prior to processing.</w:t>
       </w:r>
     </w:p>
@@ -7072,7 +7645,21 @@
         <w:rPr>
           <w:rFonts w:ascii="Times New Roman" w:hAnsi="Times New Roman" w:cs="Times New Roman"/>
         </w:rPr>
-        <w:t>A datacenter needs to encrypt their employee’s system passwords. The passwords are required to be 8 characters including numbers and special characters. The software needs to encrypt the password upon account creation and verified on relogging in. There needs to be no lag during this process. There are 200 employees in this datacenter that all need accounts. Which encryption approach should be used and why?</w:t>
+        <w:t xml:space="preserve">A datacenter needs to encrypt their employee’s system passwords. The passwords are required to be 8 characters including numbers and special characters. The software needs to encrypt the password upon account creation and </w:t>
+      </w:r>
+      <w:proofErr w:type="gramStart"/>
+      <w:r>
+        <w:rPr>
+          <w:rFonts w:ascii="Times New Roman" w:hAnsi="Times New Roman" w:cs="Times New Roman"/>
+        </w:rPr>
+        <w:t>verified</w:t>
+      </w:r>
+      <w:proofErr w:type="gramEnd"/>
+      <w:r>
+        <w:rPr>
+          <w:rFonts w:ascii="Times New Roman" w:hAnsi="Times New Roman" w:cs="Times New Roman"/>
+        </w:rPr>
+        <w:t xml:space="preserve"> on relogging in. There needs to be no lag during this process. There are 200 employees in this datacenter that all need accounts. Which encryption approach should be used and why?</w:t>
       </w:r>
     </w:p>
     <w:p>
@@ -7357,8 +7944,16 @@
               <w:rPr>
                 <w:rFonts w:ascii="Times New Roman" w:eastAsia="Aptos" w:hAnsi="Times New Roman" w:cs="Times New Roman"/>
               </w:rPr>
-              <w:t>• Tune hashing cost so verification occurs in ~50–200 ms</w:t>
-            </w:r>
+              <w:t xml:space="preserve">• Tune hashing cost so verification occurs in ~50–200 </w:t>
+            </w:r>
+            <w:proofErr w:type="spellStart"/>
+            <w:r>
+              <w:rPr>
+                <w:rFonts w:ascii="Times New Roman" w:eastAsia="Aptos" w:hAnsi="Times New Roman" w:cs="Times New Roman"/>
+              </w:rPr>
+              <w:t>ms</w:t>
+            </w:r>
+            <w:proofErr w:type="spellEnd"/>
           </w:p>
         </w:tc>
         <w:tc>
@@ -7391,7 +7986,35 @@
                 <w:rFonts w:ascii="Times New Roman" w:eastAsia="Aptos" w:hAnsi="Times New Roman" w:cs="Times New Roman"/>
               </w:rPr>
               <w:br/>
-              <w:t xml:space="preserve">1. User creates password. </w:t>
+              <w:t xml:space="preserve">1. </w:t>
+            </w:r>
+            <w:proofErr w:type="gramStart"/>
+            <w:r>
+              <w:rPr>
+                <w:rFonts w:ascii="Times New Roman" w:eastAsia="Aptos" w:hAnsi="Times New Roman" w:cs="Times New Roman"/>
+              </w:rPr>
+              <w:t>User creates</w:t>
+            </w:r>
+            <w:proofErr w:type="gramEnd"/>
+            <w:r>
+              <w:rPr>
+                <w:rFonts w:ascii="Times New Roman" w:eastAsia="Aptos" w:hAnsi="Times New Roman" w:cs="Times New Roman"/>
+              </w:rPr>
+              <w:t xml:space="preserve"> </w:t>
+            </w:r>
+            <w:proofErr w:type="gramStart"/>
+            <w:r>
+              <w:rPr>
+                <w:rFonts w:ascii="Times New Roman" w:eastAsia="Aptos" w:hAnsi="Times New Roman" w:cs="Times New Roman"/>
+              </w:rPr>
+              <w:t>password</w:t>
+            </w:r>
+            <w:proofErr w:type="gramEnd"/>
+            <w:r>
+              <w:rPr>
+                <w:rFonts w:ascii="Times New Roman" w:eastAsia="Aptos" w:hAnsi="Times New Roman" w:cs="Times New Roman"/>
+              </w:rPr>
+              <w:t xml:space="preserve">. </w:t>
             </w:r>
             <w:r>
               <w:rPr>
@@ -7405,7 +8028,21 @@
                 <w:rFonts w:ascii="Times New Roman" w:eastAsia="Aptos" w:hAnsi="Times New Roman" w:cs="Times New Roman"/>
               </w:rPr>
               <w:br/>
-              <w:t xml:space="preserve">3. Compute Argon2id(password + salt). </w:t>
+              <w:t>3. Compute Argon2</w:t>
+            </w:r>
+            <w:proofErr w:type="gramStart"/>
+            <w:r>
+              <w:rPr>
+                <w:rFonts w:ascii="Times New Roman" w:eastAsia="Aptos" w:hAnsi="Times New Roman" w:cs="Times New Roman"/>
+              </w:rPr>
+              <w:t>id(</w:t>
+            </w:r>
+            <w:proofErr w:type="gramEnd"/>
+            <w:r>
+              <w:rPr>
+                <w:rFonts w:ascii="Times New Roman" w:eastAsia="Aptos" w:hAnsi="Times New Roman" w:cs="Times New Roman"/>
+              </w:rPr>
+              <w:t xml:space="preserve">password + salt). </w:t>
             </w:r>
             <w:r>
               <w:rPr>
@@ -7466,7 +8103,21 @@
                 <w:rFonts w:ascii="Times New Roman" w:eastAsia="Aptos" w:hAnsi="Times New Roman" w:cs="Times New Roman"/>
               </w:rPr>
               <w:br/>
-              <w:t>4. Compare to stored hash to authenticate.</w:t>
+              <w:t xml:space="preserve">4. </w:t>
+            </w:r>
+            <w:proofErr w:type="gramStart"/>
+            <w:r>
+              <w:rPr>
+                <w:rFonts w:ascii="Times New Roman" w:eastAsia="Aptos" w:hAnsi="Times New Roman" w:cs="Times New Roman"/>
+              </w:rPr>
+              <w:t>Compare</w:t>
+            </w:r>
+            <w:proofErr w:type="gramEnd"/>
+            <w:r>
+              <w:rPr>
+                <w:rFonts w:ascii="Times New Roman" w:eastAsia="Aptos" w:hAnsi="Times New Roman" w:cs="Times New Roman"/>
+              </w:rPr>
+              <w:t xml:space="preserve"> to stored hash to authenticate.</w:t>
             </w:r>
           </w:p>
           <w:p>
@@ -7604,7 +8255,35 @@
         <w:rPr>
           <w:rFonts w:ascii="Times New Roman" w:hAnsi="Times New Roman" w:cs="Times New Roman"/>
         </w:rPr>
-        <w:t>This category seeks to answer the question of whether AI can properly optimize an encryption algorithm. AI must be able to take into account specified requirements as an engineer would to determine what tradeoffs must be made, while maintaining compliancy. The following prompt has been designed to represent both selection features and optimization strategies.</w:t>
+        <w:t xml:space="preserve">This category seeks to answer the question of whether AI can properly optimize an encryption algorithm. AI must be able to </w:t>
+      </w:r>
+      <w:proofErr w:type="gramStart"/>
+      <w:r>
+        <w:rPr>
+          <w:rFonts w:ascii="Times New Roman" w:hAnsi="Times New Roman" w:cs="Times New Roman"/>
+        </w:rPr>
+        <w:t>take into account</w:t>
+      </w:r>
+      <w:proofErr w:type="gramEnd"/>
+      <w:r>
+        <w:rPr>
+          <w:rFonts w:ascii="Times New Roman" w:hAnsi="Times New Roman" w:cs="Times New Roman"/>
+        </w:rPr>
+        <w:t xml:space="preserve"> specified requirements as an engineer would to determine what tradeoffs must be made, while maintaining </w:t>
+      </w:r>
+      <w:proofErr w:type="gramStart"/>
+      <w:r>
+        <w:rPr>
+          <w:rFonts w:ascii="Times New Roman" w:hAnsi="Times New Roman" w:cs="Times New Roman"/>
+        </w:rPr>
+        <w:t>compliancy</w:t>
+      </w:r>
+      <w:proofErr w:type="gramEnd"/>
+      <w:r>
+        <w:rPr>
+          <w:rFonts w:ascii="Times New Roman" w:hAnsi="Times New Roman" w:cs="Times New Roman"/>
+        </w:rPr>
+        <w:t>. The following prompt has been designed to represent both selection features and optimization strategies.</w:t>
       </w:r>
     </w:p>
     <w:p>
@@ -7786,7 +8465,21 @@
                 <w:rFonts w:ascii="Times New Roman" w:eastAsia="Aptos" w:hAnsi="Times New Roman" w:cs="Times New Roman"/>
               </w:rPr>
               <w:br/>
-              <w:t xml:space="preserve">• &lt;200 ms latency per transaction </w:t>
+              <w:t xml:space="preserve">• &lt;200 </w:t>
+            </w:r>
+            <w:proofErr w:type="spellStart"/>
+            <w:r>
+              <w:rPr>
+                <w:rFonts w:ascii="Times New Roman" w:eastAsia="Aptos" w:hAnsi="Times New Roman" w:cs="Times New Roman"/>
+              </w:rPr>
+              <w:t>ms</w:t>
+            </w:r>
+            <w:proofErr w:type="spellEnd"/>
+            <w:r>
+              <w:rPr>
+                <w:rFonts w:ascii="Times New Roman" w:eastAsia="Aptos" w:hAnsi="Times New Roman" w:cs="Times New Roman"/>
+              </w:rPr>
+              <w:t xml:space="preserve"> latency per transaction </w:t>
             </w:r>
           </w:p>
           <w:p>
@@ -8222,7 +8915,21 @@
           <w:rFonts w:ascii="Times New Roman" w:hAnsi="Times New Roman" w:cs="Times New Roman"/>
         </w:rPr>
         <w:noBreakHyphen/>
-        <w:t>Poly1305 when AES acceleration is unavailable). By combining this with streaming encryption, hardware acceleration, and lightweight key/IV management, the system easily stays within the 200 ms latency window while securely processing the required data volume. (Copilot, 2026)</w:t>
+        <w:t>Poly1305 when AES acceleration is unavailable). By combining this with streaming encryption, hardware acceleration, and lightweight key/IV management, the system easily stays within the 200 </w:t>
+      </w:r>
+      <w:proofErr w:type="spellStart"/>
+      <w:r>
+        <w:rPr>
+          <w:rFonts w:ascii="Times New Roman" w:hAnsi="Times New Roman" w:cs="Times New Roman"/>
+        </w:rPr>
+        <w:t>ms</w:t>
+      </w:r>
+      <w:proofErr w:type="spellEnd"/>
+      <w:r>
+        <w:rPr>
+          <w:rFonts w:ascii="Times New Roman" w:hAnsi="Times New Roman" w:cs="Times New Roman"/>
+        </w:rPr>
+        <w:t xml:space="preserve"> latency window while securely processing the required data volume. (Copilot, 2026)</w:t>
       </w:r>
     </w:p>
     <w:p>
@@ -8253,7 +8960,21 @@
         <w:rPr>
           <w:rFonts w:ascii="Times New Roman" w:hAnsi="Times New Roman" w:cs="Times New Roman"/>
         </w:rPr>
-        <w:t>This section represents the most crucial research point of our project, since focused on specific time complexity. This section will test AI’s ability to produce solutions that meet a certain computational time requirement.</w:t>
+        <w:t xml:space="preserve">This section represents the most crucial research point of our </w:t>
+      </w:r>
+      <w:proofErr w:type="gramStart"/>
+      <w:r>
+        <w:rPr>
+          <w:rFonts w:ascii="Times New Roman" w:hAnsi="Times New Roman" w:cs="Times New Roman"/>
+        </w:rPr>
+        <w:t>project, since</w:t>
+      </w:r>
+      <w:proofErr w:type="gramEnd"/>
+      <w:r>
+        <w:rPr>
+          <w:rFonts w:ascii="Times New Roman" w:hAnsi="Times New Roman" w:cs="Times New Roman"/>
+        </w:rPr>
+        <w:t xml:space="preserve"> focused on specific time complexity. This section will test AI’s ability to produce solutions that meet a certain computational time requirement.</w:t>
       </w:r>
     </w:p>
     <w:p>
@@ -8536,7 +9257,21 @@
               <w:rPr>
                 <w:rFonts w:ascii="Times New Roman" w:eastAsia="Aptos" w:hAnsi="Times New Roman" w:cs="Times New Roman"/>
               </w:rPr>
-              <w:t xml:space="preserve">       → O(1) constant work</w:t>
+              <w:t xml:space="preserve">       → </w:t>
+            </w:r>
+            <w:proofErr w:type="gramStart"/>
+            <w:r>
+              <w:rPr>
+                <w:rFonts w:ascii="Times New Roman" w:eastAsia="Aptos" w:hAnsi="Times New Roman" w:cs="Times New Roman"/>
+              </w:rPr>
+              <w:t>O(</w:t>
+            </w:r>
+            <w:proofErr w:type="gramEnd"/>
+            <w:r>
+              <w:rPr>
+                <w:rFonts w:ascii="Times New Roman" w:eastAsia="Aptos" w:hAnsi="Times New Roman" w:cs="Times New Roman"/>
+              </w:rPr>
+              <w:t>1) constant work</w:t>
             </w:r>
           </w:p>
           <w:p>
@@ -8690,13 +9425,7 @@
               <w:rPr>
                 <w:rFonts w:ascii="Times New Roman" w:eastAsia="Aptos" w:hAnsi="Times New Roman" w:cs="Times New Roman"/>
               </w:rPr>
-              <w:t>Perform modular exponentiation</w:t>
-            </w:r>
-            <w:r>
-              <w:rPr>
-                <w:rFonts w:eastAsia="Aptos"/>
-              </w:rPr>
-              <w:t xml:space="preserve"> </w:t>
+              <w:t xml:space="preserve">Perform modular exponentiation </w:t>
             </w:r>
           </w:p>
           <w:p>
@@ -8752,7 +9481,21 @@
               <w:rPr>
                 <w:rFonts w:ascii="Times New Roman" w:eastAsia="Aptos" w:hAnsi="Times New Roman" w:cs="Times New Roman"/>
               </w:rPr>
-              <w:t xml:space="preserve">       → O(log n) log work</w:t>
+              <w:t xml:space="preserve">       → </w:t>
+            </w:r>
+            <w:proofErr w:type="gramStart"/>
+            <w:r>
+              <w:rPr>
+                <w:rFonts w:ascii="Times New Roman" w:eastAsia="Aptos" w:hAnsi="Times New Roman" w:cs="Times New Roman"/>
+              </w:rPr>
+              <w:t>O(</w:t>
+            </w:r>
+            <w:proofErr w:type="gramEnd"/>
+            <w:r>
+              <w:rPr>
+                <w:rFonts w:ascii="Times New Roman" w:eastAsia="Aptos" w:hAnsi="Times New Roman" w:cs="Times New Roman"/>
+              </w:rPr>
+              <w:t>log n) log work</w:t>
             </w:r>
           </w:p>
         </w:tc>
@@ -8944,13 +9687,23 @@
         <w:noBreakHyphen/>
         <w:t xml:space="preserve">time encryption method demonstrates the use of modular exponentiation, an algorithm whose performance scales logarithmically with the size of the exponent or modulus. Although the specific implementation in this program uses fixed parameters (making it effectively constant in practice), the underlying algorithm is inherently </w:t>
       </w:r>
+      <w:proofErr w:type="gramStart"/>
       <w:r>
         <w:rPr>
           <w:rFonts w:ascii="Times New Roman" w:hAnsi="Times New Roman" w:cs="Times New Roman"/>
           <w:b/>
           <w:bCs/>
         </w:rPr>
-        <w:t>O(log n)</w:t>
+        <w:t>O(</w:t>
+      </w:r>
+      <w:proofErr w:type="gramEnd"/>
+      <w:r>
+        <w:rPr>
+          <w:rFonts w:ascii="Times New Roman" w:hAnsi="Times New Roman" w:cs="Times New Roman"/>
+          <w:b/>
+          <w:bCs/>
+        </w:rPr>
+        <w:t>log n)</w:t>
       </w:r>
       <w:r>
         <w:rPr>
@@ -9001,6 +9754,7 @@
       </w:pPr>
       <w:r>
         <w:rPr>
+          <w:rFonts w:ascii="Times New Roman" w:hAnsi="Times New Roman" w:cs="Times New Roman"/>
           <w:noProof/>
         </w:rPr>
         <w:drawing>
@@ -9103,7 +9857,21 @@
         <w:rPr>
           <w:rFonts w:ascii="Times New Roman" w:hAnsi="Times New Roman" w:cs="Times New Roman"/>
         </w:rPr>
-        <w:t>: Provide a solution to hash a bank’s transaction history, sacrifice computational time to prove the best security</w:t>
+        <w:t xml:space="preserve">: Provide a solution to </w:t>
+      </w:r>
+      <w:proofErr w:type="gramStart"/>
+      <w:r>
+        <w:rPr>
+          <w:rFonts w:ascii="Times New Roman" w:hAnsi="Times New Roman" w:cs="Times New Roman"/>
+        </w:rPr>
+        <w:t>hash</w:t>
+      </w:r>
+      <w:proofErr w:type="gramEnd"/>
+      <w:r>
+        <w:rPr>
+          <w:rFonts w:ascii="Times New Roman" w:hAnsi="Times New Roman" w:cs="Times New Roman"/>
+        </w:rPr>
+        <w:t xml:space="preserve"> a bank’s transaction history, sacrifice computational time to prove the best security</w:t>
       </w:r>
     </w:p>
     <w:p>
@@ -9406,7 +10174,21 @@
               <w:rPr>
                 <w:rFonts w:ascii="Times New Roman" w:eastAsia="Aptos" w:hAnsi="Times New Roman" w:cs="Times New Roman"/>
               </w:rPr>
-              <w:t>Every N transactions, all hashes in that batch are placed into a Merkle tree and the Merkle root is calculated.</w:t>
+              <w:t xml:space="preserve">Every N </w:t>
+            </w:r>
+            <w:proofErr w:type="gramStart"/>
+            <w:r>
+              <w:rPr>
+                <w:rFonts w:ascii="Times New Roman" w:eastAsia="Aptos" w:hAnsi="Times New Roman" w:cs="Times New Roman"/>
+              </w:rPr>
+              <w:t>transactions</w:t>
+            </w:r>
+            <w:proofErr w:type="gramEnd"/>
+            <w:r>
+              <w:rPr>
+                <w:rFonts w:ascii="Times New Roman" w:eastAsia="Aptos" w:hAnsi="Times New Roman" w:cs="Times New Roman"/>
+              </w:rPr>
+              <w:t>, all hashes in that batch are placed into a Merkle tree and the Merkle root is calculated.</w:t>
             </w:r>
           </w:p>
         </w:tc>
@@ -9619,7 +10401,21 @@
         <w:rPr>
           <w:rFonts w:ascii="Times New Roman" w:hAnsi="Times New Roman" w:cs="Times New Roman"/>
         </w:rPr>
-        <w:t>Copilot made this table to show each component and how it effects the security.</w:t>
+        <w:t xml:space="preserve">Copilot made this table to show each component and how it </w:t>
+      </w:r>
+      <w:proofErr w:type="gramStart"/>
+      <w:r>
+        <w:rPr>
+          <w:rFonts w:ascii="Times New Roman" w:hAnsi="Times New Roman" w:cs="Times New Roman"/>
+        </w:rPr>
+        <w:t>effects the security</w:t>
+      </w:r>
+      <w:proofErr w:type="gramEnd"/>
+      <w:r>
+        <w:rPr>
+          <w:rFonts w:ascii="Times New Roman" w:hAnsi="Times New Roman" w:cs="Times New Roman"/>
+        </w:rPr>
+        <w:t>.</w:t>
       </w:r>
     </w:p>
     <w:tbl>
@@ -9978,7 +10774,21 @@
               <w:rPr>
                 <w:rFonts w:ascii="Times New Roman" w:eastAsia="Aptos" w:hAnsi="Times New Roman" w:cs="Times New Roman"/>
               </w:rPr>
-              <w:t>A modern, secure hash function providing strong long</w:t>
+              <w:t xml:space="preserve">A modern, secure hash function </w:t>
+            </w:r>
+            <w:proofErr w:type="gramStart"/>
+            <w:r>
+              <w:rPr>
+                <w:rFonts w:ascii="Times New Roman" w:eastAsia="Aptos" w:hAnsi="Times New Roman" w:cs="Times New Roman"/>
+              </w:rPr>
+              <w:t>providing</w:t>
+            </w:r>
+            <w:proofErr w:type="gramEnd"/>
+            <w:r>
+              <w:rPr>
+                <w:rFonts w:ascii="Times New Roman" w:eastAsia="Aptos" w:hAnsi="Times New Roman" w:cs="Times New Roman"/>
+              </w:rPr>
+              <w:t xml:space="preserve"> strong long</w:t>
             </w:r>
             <w:r>
               <w:rPr>
@@ -10146,13 +10956,25 @@
         </w:rPr>
       </w:pPr>
       <w:r>
+        <w:rPr>
+          <w:rFonts w:ascii="Times New Roman" w:hAnsi="Times New Roman" w:cs="Times New Roman"/>
+        </w:rPr>
         <w:tab/>
-      </w:r>
-      <w:r>
-        <w:rPr>
-          <w:rFonts w:ascii="Times New Roman" w:hAnsi="Times New Roman" w:cs="Times New Roman"/>
-        </w:rPr>
-        <w:t>Overall, the Microsoft Copilot AI model performed well across all four evaluation sections. It was able to formulate logical solutions for each prompt in a timely manner. Breaking each prompt into multiple sections to help with readability and to attempt to show a thought process. Although the model did provide mostly clear concise answers there were a couple problems we ran into while prompting Copilot. The first being unfinished answers for example, after being prompted during one of the experiments Copilot built a table to show its encryption steps but did not fill the table with all the steps it previously described. Although this is not a major error it does raise questions about how fickle some AI models memory or reasoning process really are. Other problems were smaller in comparison but did make the user experience less pleasant than if they were not encountered.</w:t>
+        <w:t xml:space="preserve">Overall, the Microsoft Copilot AI model performed well across all four evaluation sections. It was able to formulate logical solutions for each prompt in a timely manner. Breaking each prompt into multiple sections to help with readability and to attempt to show a thought process. Although the model did provide mostly clear concise answers there were a couple problems we ran into while prompting Copilot. The first being unfinished answers for example, after being prompted during one of the experiments Copilot built a table to show its encryption steps but did not fill the table with all the steps it previously described. Although this is not a major error it does raise questions about how fickle some AI </w:t>
+      </w:r>
+      <w:proofErr w:type="gramStart"/>
+      <w:r>
+        <w:rPr>
+          <w:rFonts w:ascii="Times New Roman" w:hAnsi="Times New Roman" w:cs="Times New Roman"/>
+        </w:rPr>
+        <w:t>models</w:t>
+      </w:r>
+      <w:proofErr w:type="gramEnd"/>
+      <w:r>
+        <w:rPr>
+          <w:rFonts w:ascii="Times New Roman" w:hAnsi="Times New Roman" w:cs="Times New Roman"/>
+        </w:rPr>
+        <w:t xml:space="preserve"> memory or reasoning process really are. Other problems were smaller in comparison but did make the user experience less pleasant than if they were not encountered.</w:t>
       </w:r>
     </w:p>
     <w:p>
@@ -10214,6 +11036,9 @@
         </w:rPr>
       </w:pPr>
       <w:r>
+        <w:rPr>
+          <w:rFonts w:ascii="Times New Roman" w:hAnsi="Times New Roman" w:cs="Times New Roman"/>
+        </w:rPr>
         <w:tab/>
       </w:r>
       <w:r>
@@ -10356,6 +11181,7 @@
         </w:rPr>
         <w:t xml:space="preserve">gave similar recommendations and solutions, while Google Gemini took different </w:t>
       </w:r>
+      <w:proofErr w:type="gramStart"/>
       <w:r>
         <w:rPr>
           <w:rFonts w:ascii="Times New Roman" w:hAnsi="Times New Roman" w:cs="Times New Roman"/>
@@ -10366,7 +11192,28 @@
         <w:rPr>
           <w:rFonts w:ascii="Times New Roman" w:hAnsi="Times New Roman" w:cs="Times New Roman"/>
         </w:rPr>
-        <w:t xml:space="preserve"> approach of solving strategies. All three AI models were able to provide solutions for the encryption and time complexity questions. </w:t>
+        <w:t xml:space="preserve"> approach</w:t>
+      </w:r>
+      <w:proofErr w:type="gramEnd"/>
+      <w:r>
+        <w:rPr>
+          <w:rFonts w:ascii="Times New Roman" w:hAnsi="Times New Roman" w:cs="Times New Roman"/>
+        </w:rPr>
+        <w:t xml:space="preserve"> </w:t>
+      </w:r>
+      <w:proofErr w:type="gramStart"/>
+      <w:r>
+        <w:rPr>
+          <w:rFonts w:ascii="Times New Roman" w:hAnsi="Times New Roman" w:cs="Times New Roman"/>
+        </w:rPr>
+        <w:t>of</w:t>
+      </w:r>
+      <w:proofErr w:type="gramEnd"/>
+      <w:r>
+        <w:rPr>
+          <w:rFonts w:ascii="Times New Roman" w:hAnsi="Times New Roman" w:cs="Times New Roman"/>
+        </w:rPr>
+        <w:t xml:space="preserve"> solving strategies. All three AI models were able to provide solutions for the encryption and time complexity questions. </w:t>
       </w:r>
       <w:r>
         <w:rPr>
@@ -10442,7 +11289,21 @@
         <w:rPr>
           <w:rFonts w:ascii="Times New Roman" w:hAnsi="Times New Roman" w:cs="Times New Roman"/>
         </w:rPr>
-        <w:t xml:space="preserve">The first limitation that was common across the models was the lack of referencing or citations. Since code is intellectual property, AI pulling code from across the internet </w:t>
+        <w:t xml:space="preserve">The first limitation that was common across the models was the lack of </w:t>
+      </w:r>
+      <w:proofErr w:type="gramStart"/>
+      <w:r>
+        <w:rPr>
+          <w:rFonts w:ascii="Times New Roman" w:hAnsi="Times New Roman" w:cs="Times New Roman"/>
+        </w:rPr>
+        <w:t>referencing</w:t>
+      </w:r>
+      <w:proofErr w:type="gramEnd"/>
+      <w:r>
+        <w:rPr>
+          <w:rFonts w:ascii="Times New Roman" w:hAnsi="Times New Roman" w:cs="Times New Roman"/>
+        </w:rPr>
+        <w:t xml:space="preserve"> or citations. Since code is intellectual property, AI pulling code from across the internet </w:t>
       </w:r>
       <w:r>
         <w:rPr>
@@ -10616,13 +11477,7 @@
         <w:rPr>
           <w:rFonts w:ascii="Times New Roman" w:hAnsi="Times New Roman" w:cs="Times New Roman"/>
         </w:rPr>
-        <w:t xml:space="preserve">Overall, </w:t>
-      </w:r>
-      <w:r>
-        <w:rPr>
-          <w:rFonts w:ascii="Times New Roman" w:hAnsi="Times New Roman" w:cs="Times New Roman"/>
-        </w:rPr>
-        <w:t>this project resulted in a high success rate. Each prompt was given a successful answer</w:t>
+        <w:t>Overall, this project resulted in a high success rate. Each prompt was given a successful answer</w:t>
       </w:r>
       <w:r>
         <w:rPr>
@@ -10681,13 +11536,7 @@
         <w:rPr>
           <w:rFonts w:ascii="Times New Roman" w:hAnsi="Times New Roman" w:cs="Times New Roman"/>
         </w:rPr>
-        <w:t xml:space="preserve">To further test </w:t>
-      </w:r>
-      <w:r>
-        <w:rPr>
-          <w:rFonts w:ascii="Times New Roman" w:hAnsi="Times New Roman" w:cs="Times New Roman"/>
-        </w:rPr>
-        <w:t xml:space="preserve">AI’s capabilities, our team would recommend testing </w:t>
+        <w:t xml:space="preserve">To further test AI’s capabilities, our team would recommend testing </w:t>
       </w:r>
       <w:r>
         <w:rPr>
@@ -10777,13 +11626,7 @@
         <w:rPr>
           <w:rFonts w:ascii="Times New Roman" w:hAnsi="Times New Roman" w:cs="Times New Roman"/>
         </w:rPr>
-        <w:t xml:space="preserve">The future of AI </w:t>
-      </w:r>
-      <w:r>
-        <w:rPr>
-          <w:rFonts w:ascii="Times New Roman" w:hAnsi="Times New Roman" w:cs="Times New Roman"/>
-        </w:rPr>
-        <w:t xml:space="preserve">is both exciting and concerning. As </w:t>
+        <w:t xml:space="preserve">The future of AI is both exciting and concerning. As </w:t>
       </w:r>
       <w:r>
         <w:rPr>
@@ -10851,7 +11694,31 @@
           <w:i/>
           <w:iCs/>
         </w:rPr>
-        <w:t>AI Impact by 2040</w:t>
+        <w:t xml:space="preserve">AI Impact by 2040, </w:t>
+      </w:r>
+      <w:r>
+        <w:rPr>
+          <w:rFonts w:ascii="Times New Roman" w:hAnsi="Times New Roman" w:cs="Times New Roman"/>
+        </w:rPr>
+        <w:t>shared insight</w:t>
+      </w:r>
+      <w:r>
+        <w:rPr>
+          <w:rFonts w:ascii="Times New Roman" w:hAnsi="Times New Roman" w:cs="Times New Roman"/>
+        </w:rPr>
+        <w:t xml:space="preserve"> </w:t>
+      </w:r>
+      <w:r>
+        <w:rPr>
+          <w:rFonts w:ascii="Times New Roman" w:hAnsi="Times New Roman" w:cs="Times New Roman"/>
+        </w:rPr>
+        <w:t>into</w:t>
+      </w:r>
+      <w:r>
+        <w:rPr>
+          <w:rFonts w:ascii="Times New Roman" w:hAnsi="Times New Roman" w:cs="Times New Roman"/>
+        </w:rPr>
+        <w:t xml:space="preserve"> what other engineers and experts think the future will hold. </w:t>
       </w:r>
       <w:r>
         <w:rPr>
@@ -10859,31 +11726,7 @@
           <w:i/>
           <w:iCs/>
         </w:rPr>
-        <w:t xml:space="preserve">, </w:t>
-      </w:r>
-      <w:r>
-        <w:rPr>
-          <w:rFonts w:ascii="Times New Roman" w:hAnsi="Times New Roman" w:cs="Times New Roman"/>
-        </w:rPr>
-        <w:t>shared insight</w:t>
-      </w:r>
-      <w:r>
-        <w:rPr>
-          <w:rFonts w:ascii="Times New Roman" w:hAnsi="Times New Roman" w:cs="Times New Roman"/>
-        </w:rPr>
-        <w:t xml:space="preserve"> </w:t>
-      </w:r>
-      <w:r>
-        <w:rPr>
-          <w:rFonts w:ascii="Times New Roman" w:hAnsi="Times New Roman" w:cs="Times New Roman"/>
-        </w:rPr>
-        <w:t>into</w:t>
-      </w:r>
-      <w:r>
-        <w:rPr>
-          <w:rFonts w:ascii="Times New Roman" w:hAnsi="Times New Roman" w:cs="Times New Roman"/>
-        </w:rPr>
-        <w:t xml:space="preserve"> what other engineers and experts think the future will hold. </w:t>
+        <w:t>“Some pointed out that future AI-abetted losses and gains will be unevenly distributed across humanity. Some said the future will be “scary” and some said it will bring “joy and love.” Some said it will initiate “growth and productivity</w:t>
       </w:r>
       <w:r>
         <w:rPr>
@@ -10891,7 +11734,7 @@
           <w:i/>
           <w:iCs/>
         </w:rPr>
-        <w:t>“Some pointed out that future AI-abetted losses and gains will be unevenly distributed across humanity. Some said the future will be “scary” and some said it will bring “joy and love.” Some said it will initiate “growth and productivity</w:t>
+        <w:t>”,</w:t>
       </w:r>
       <w:r>
         <w:rPr>
@@ -10899,7 +11742,7 @@
           <w:i/>
           <w:iCs/>
         </w:rPr>
-        <w:t>”,</w:t>
+        <w:t xml:space="preserve"> but it could result in “rampant unemployment.”</w:t>
       </w:r>
       <w:r>
         <w:rPr>
@@ -10907,14 +11750,6 @@
           <w:i/>
           <w:iCs/>
         </w:rPr>
-        <w:t xml:space="preserve"> but it could result in “rampant unemployment.”</w:t>
-      </w:r>
-      <w:r>
-        <w:rPr>
-          <w:rFonts w:ascii="Times New Roman" w:hAnsi="Times New Roman" w:cs="Times New Roman"/>
-          <w:i/>
-          <w:iCs/>
-        </w:rPr>
         <w:t xml:space="preserve"> </w:t>
       </w:r>
       <w:r>
@@ -11001,7 +11836,21 @@
         <w:rPr>
           <w:rFonts w:ascii="Times New Roman" w:hAnsi="Times New Roman" w:cs="Times New Roman"/>
         </w:rPr>
-        <w:t>development. AI is still considered a newer technology even though it dates back to the 19</w:t>
+        <w:t xml:space="preserve">development. AI is still considered a newer technology even though it </w:t>
+      </w:r>
+      <w:proofErr w:type="gramStart"/>
+      <w:r>
+        <w:rPr>
+          <w:rFonts w:ascii="Times New Roman" w:hAnsi="Times New Roman" w:cs="Times New Roman"/>
+        </w:rPr>
+        <w:t>dates back to</w:t>
+      </w:r>
+      <w:proofErr w:type="gramEnd"/>
+      <w:r>
+        <w:rPr>
+          <w:rFonts w:ascii="Times New Roman" w:hAnsi="Times New Roman" w:cs="Times New Roman"/>
+        </w:rPr>
+        <w:t xml:space="preserve"> the 19</w:t>
       </w:r>
       <w:r>
         <w:rPr>
@@ -11102,7 +11951,21 @@
         <w:rPr>
           <w:rFonts w:ascii="Times New Roman" w:hAnsi="Times New Roman" w:cs="Times New Roman"/>
         </w:rPr>
-        <w:t xml:space="preserve"> models were capable of solving data encryption related problems while </w:t>
+        <w:t xml:space="preserve"> models </w:t>
+      </w:r>
+      <w:proofErr w:type="gramStart"/>
+      <w:r>
+        <w:rPr>
+          <w:rFonts w:ascii="Times New Roman" w:hAnsi="Times New Roman" w:cs="Times New Roman"/>
+        </w:rPr>
+        <w:t>were capable of solving</w:t>
+      </w:r>
+      <w:proofErr w:type="gramEnd"/>
+      <w:r>
+        <w:rPr>
+          <w:rFonts w:ascii="Times New Roman" w:hAnsi="Times New Roman" w:cs="Times New Roman"/>
+        </w:rPr>
+        <w:t xml:space="preserve"> data encryption related problems while </w:t>
       </w:r>
       <w:r>
         <w:rPr>
@@ -11120,13 +11983,27 @@
         <w:rPr>
           <w:rFonts w:ascii="Times New Roman" w:hAnsi="Times New Roman" w:cs="Times New Roman"/>
         </w:rPr>
-        <w:t xml:space="preserve">our team grew in understanding </w:t>
-      </w:r>
-      <w:r>
-        <w:rPr>
-          <w:rFonts w:ascii="Times New Roman" w:hAnsi="Times New Roman" w:cs="Times New Roman"/>
-        </w:rPr>
-        <w:t xml:space="preserve">of how AI models work and </w:t>
+        <w:t xml:space="preserve">our team grew in </w:t>
+      </w:r>
+      <w:proofErr w:type="gramStart"/>
+      <w:r>
+        <w:rPr>
+          <w:rFonts w:ascii="Times New Roman" w:hAnsi="Times New Roman" w:cs="Times New Roman"/>
+        </w:rPr>
+        <w:t xml:space="preserve">understanding </w:t>
+      </w:r>
+      <w:r>
+        <w:rPr>
+          <w:rFonts w:ascii="Times New Roman" w:hAnsi="Times New Roman" w:cs="Times New Roman"/>
+        </w:rPr>
+        <w:t>of</w:t>
+      </w:r>
+      <w:proofErr w:type="gramEnd"/>
+      <w:r>
+        <w:rPr>
+          <w:rFonts w:ascii="Times New Roman" w:hAnsi="Times New Roman" w:cs="Times New Roman"/>
+        </w:rPr>
+        <w:t xml:space="preserve"> how AI models work and </w:t>
       </w:r>
       <w:r>
         <w:rPr>
@@ -11180,7 +12057,21 @@
         <w:rPr>
           <w:rFonts w:ascii="Times New Roman" w:hAnsi="Times New Roman" w:cs="Times New Roman"/>
         </w:rPr>
-        <w:t>of algorithms and computer science. Our team was able to highlight success rates and limitations during this project. Overall, this project was found to be successful. AI is able to build data encryption solutions</w:t>
+        <w:t xml:space="preserve">of algorithms and computer science. Our team was able to highlight success rates and limitations during this project. Overall, this project was found to be successful. AI </w:t>
+      </w:r>
+      <w:proofErr w:type="gramStart"/>
+      <w:r>
+        <w:rPr>
+          <w:rFonts w:ascii="Times New Roman" w:hAnsi="Times New Roman" w:cs="Times New Roman"/>
+        </w:rPr>
+        <w:t>is able to</w:t>
+      </w:r>
+      <w:proofErr w:type="gramEnd"/>
+      <w:r>
+        <w:rPr>
+          <w:rFonts w:ascii="Times New Roman" w:hAnsi="Times New Roman" w:cs="Times New Roman"/>
+        </w:rPr>
+        <w:t xml:space="preserve"> build data encryption solutions</w:t>
       </w:r>
       <w:r>
         <w:rPr>
@@ -11195,7 +12086,13 @@
         <w:t>substitute human intelligence.</w:t>
       </w:r>
     </w:p>
-    <w:p/>
+    <w:p>
+      <w:pPr>
+        <w:rPr>
+          <w:rFonts w:ascii="Times New Roman" w:hAnsi="Times New Roman" w:cs="Times New Roman"/>
+        </w:rPr>
+      </w:pPr>
+    </w:p>
     <w:p>
       <w:pPr>
         <w:pStyle w:val="Heading1"/>
@@ -11296,6 +12193,9 @@
       <w:pPr>
         <w:spacing w:line="240" w:lineRule="auto"/>
         <w:ind w:left="720"/>
+        <w:rPr>
+          <w:rFonts w:ascii="Times New Roman" w:hAnsi="Times New Roman" w:cs="Times New Roman"/>
+        </w:rPr>
       </w:pPr>
       <w:hyperlink r:id="rId17">
         <w:r>
@@ -11310,24 +12210,33 @@
     <w:p>
       <w:pPr>
         <w:spacing w:line="240" w:lineRule="auto"/>
-      </w:pPr>
-      <w:r>
+        <w:rPr>
+          <w:rFonts w:ascii="Times New Roman" w:hAnsi="Times New Roman" w:cs="Times New Roman"/>
+        </w:rPr>
+      </w:pPr>
+      <w:r>
+        <w:rPr>
+          <w:rFonts w:ascii="Times New Roman" w:hAnsi="Times New Roman" w:cs="Times New Roman"/>
+        </w:rPr>
         <w:t>Elo</w:t>
       </w:r>
       <w:r>
+        <w:rPr>
+          <w:rFonts w:ascii="Times New Roman" w:hAnsi="Times New Roman" w:cs="Times New Roman"/>
+        </w:rPr>
         <w:t>n University</w:t>
       </w:r>
       <w:r>
+        <w:rPr>
+          <w:rFonts w:ascii="Times New Roman" w:hAnsi="Times New Roman" w:cs="Times New Roman"/>
+        </w:rPr>
         <w:t xml:space="preserve">. </w:t>
       </w:r>
       <w:r>
-        <w:t xml:space="preserve">(2026). </w:t>
-      </w:r>
-      <w:r>
-        <w:t>AI Impact by 2040</w:t>
-      </w:r>
-      <w:r>
-        <w:t>.</w:t>
+        <w:rPr>
+          <w:rFonts w:ascii="Times New Roman" w:hAnsi="Times New Roman" w:cs="Times New Roman"/>
+        </w:rPr>
+        <w:t>(2026). AI Impact by 2040.</w:t>
       </w:r>
     </w:p>
     <w:p>
@@ -11385,11 +12294,19 @@
           <w:rFonts w:ascii="Times New Roman" w:hAnsi="Times New Roman" w:cs="Times New Roman"/>
         </w:rPr>
       </w:pPr>
-      <w:r>
-        <w:rPr>
-          <w:rFonts w:ascii="Times New Roman" w:hAnsi="Times New Roman" w:cs="Times New Roman"/>
-        </w:rPr>
-        <w:t xml:space="preserve">Statcounter Global Stats. (2026). </w:t>
+      <w:proofErr w:type="spellStart"/>
+      <w:r>
+        <w:rPr>
+          <w:rFonts w:ascii="Times New Roman" w:hAnsi="Times New Roman" w:cs="Times New Roman"/>
+        </w:rPr>
+        <w:t>Statcounter</w:t>
+      </w:r>
+      <w:proofErr w:type="spellEnd"/>
+      <w:r>
+        <w:rPr>
+          <w:rFonts w:ascii="Times New Roman" w:hAnsi="Times New Roman" w:cs="Times New Roman"/>
+        </w:rPr>
+        <w:t xml:space="preserve"> Global Stats. (2026). </w:t>
       </w:r>
       <w:r>
         <w:rPr>

</xml_diff>

<commit_message>
prepare paper for submission
</commit_message>
<xml_diff>
--- a/Project/paper/CMSC-4200-Group1-Project.docx
+++ b/Project/paper/CMSC-4200-Group1-Project.docx
@@ -13,7 +13,6 @@
           <w:docPartUnique/>
         </w:docPartObj>
       </w:sdtPr>
-      <w:sdtEndPr/>
       <w:sdtContent>
         <w:p>
           <w:pPr>
@@ -670,7 +669,6 @@
           <w:docPartUnique/>
         </w:docPartObj>
       </w:sdtPr>
-      <w:sdtEndPr/>
       <w:sdtContent>
         <w:p>
           <w:pPr>
@@ -2187,7 +2185,6 @@
         </w:rPr>
         <w:t xml:space="preserve">AI and Cybersecurity are two fundamental fields in computer science. AI focuses on building systems that can automate performing tasks that require human intelligence. AI implements models to learn, reason, build perception, and understanding to approach problems with strategy. The article, </w:t>
       </w:r>
-      <w:proofErr w:type="gramStart"/>
       <w:r>
         <w:rPr>
           <w:rFonts w:ascii="Times New Roman" w:hAnsi="Times New Roman" w:cs="Times New Roman"/>
@@ -2196,18 +2193,21 @@
           <w:i/>
           <w:iCs/>
         </w:rPr>
-        <w:t>What</w:t>
-      </w:r>
-      <w:proofErr w:type="gramEnd"/>
-      <w:r>
-        <w:rPr>
-          <w:rFonts w:ascii="Times New Roman" w:hAnsi="Times New Roman" w:cs="Times New Roman"/>
-          <w:b/>
-          <w:bCs/>
+        <w:t>What is artificial intelligence (AI)</w:t>
+      </w:r>
+      <w:r>
+        <w:rPr>
+          <w:rFonts w:ascii="Times New Roman" w:hAnsi="Times New Roman" w:cs="Times New Roman"/>
           <w:i/>
           <w:iCs/>
         </w:rPr>
-        <w:t xml:space="preserve"> is artificial intelligence (AI)</w:t>
+        <w:t xml:space="preserve">, </w:t>
+      </w:r>
+      <w:r>
+        <w:rPr>
+          <w:rFonts w:ascii="Times New Roman" w:hAnsi="Times New Roman" w:cs="Times New Roman"/>
+        </w:rPr>
+        <w:t>tells us of this innovation</w:t>
       </w:r>
       <w:r>
         <w:rPr>
@@ -2215,39 +2215,7 @@
           <w:i/>
           <w:iCs/>
         </w:rPr>
-        <w:t xml:space="preserve">, </w:t>
-      </w:r>
-      <w:r>
-        <w:rPr>
-          <w:rFonts w:ascii="Times New Roman" w:hAnsi="Times New Roman" w:cs="Times New Roman"/>
-        </w:rPr>
-        <w:t>tells us of this innovation</w:t>
-      </w:r>
-      <w:r>
-        <w:rPr>
-          <w:rFonts w:ascii="Times New Roman" w:hAnsi="Times New Roman" w:cs="Times New Roman"/>
-          <w:i/>
-          <w:iCs/>
-        </w:rPr>
-        <w:t xml:space="preserve">. “Artificial intelligence is a branch of computer science that creates systems and software capable of tasks once thought to be uniquely human. It enables machines to learn from experience, adapt to new information, and </w:t>
-      </w:r>
-      <w:proofErr w:type="gramStart"/>
-      <w:r>
-        <w:rPr>
-          <w:rFonts w:ascii="Times New Roman" w:hAnsi="Times New Roman" w:cs="Times New Roman"/>
-          <w:i/>
-          <w:iCs/>
-        </w:rPr>
-        <w:t>uses</w:t>
-      </w:r>
-      <w:proofErr w:type="gramEnd"/>
-      <w:r>
-        <w:rPr>
-          <w:rFonts w:ascii="Times New Roman" w:hAnsi="Times New Roman" w:cs="Times New Roman"/>
-          <w:i/>
-          <w:iCs/>
-        </w:rPr>
-        <w:t> data, algorithms and computational power to interpret complex situations and make decisions with minimal human input. AI can understand language, recognize patterns, solve problems and even demonstrate creativity – often at speeds and scales far beyond our own. By harnessing these capabilities, it is reshaping how we interact with technology and pushing the boundaries of what machines can achieve (2026, ISO).”</w:t>
+        <w:t>. “Artificial intelligence is a branch of computer science that creates systems and software capable of tasks once thought to be uniquely human. It enables machines to learn from experience, adapt to new information, and uses data, algorithms and computational power to interpret complex situations and make decisions with minimal human input. AI can understand language, recognize patterns, solve problems and even demonstrate creativity – often at speeds and scales far beyond our own. By harnessing these capabilities, it is reshaping how we interact with technology and pushing the boundaries of what machines can achieve (2026, ISO).”</w:t>
       </w:r>
     </w:p>
     <w:p>
@@ -2333,7 +2301,7 @@
           <w:rFonts w:ascii="Times New Roman" w:hAnsi="Times New Roman" w:cs="Times New Roman"/>
           <w:color w:val="000000" w:themeColor="text1"/>
         </w:rPr>
-        <w:t xml:space="preserve">we would like to see if AI </w:t>
+        <w:t xml:space="preserve">we would like to see if AI is capable of providing and designing encryption solutions when given a computational time constraint. For example, can AI provide optimal data hashing solutions in terms of Big O? Can AI make decisions on security level vs computational cost? Encryption is much more than just formatting data into unreadable and unrecognizable content. Encryption must meet the requirements of the scenario it is used in. These requirements are constraints of time, memory, and computing power. Is an algorithm considered to be correct if it runs several minutes over when it was proposed to give a solution? When designing encryption methods, consideration </w:t>
       </w:r>
       <w:proofErr w:type="gramStart"/>
       <w:r>
@@ -2341,7 +2309,7 @@
           <w:rFonts w:ascii="Times New Roman" w:hAnsi="Times New Roman" w:cs="Times New Roman"/>
           <w:color w:val="000000" w:themeColor="text1"/>
         </w:rPr>
-        <w:t>is capable of providing and designing</w:t>
+        <w:t>is spent</w:t>
       </w:r>
       <w:proofErr w:type="gramEnd"/>
       <w:r>
@@ -2349,15 +2317,47 @@
           <w:rFonts w:ascii="Times New Roman" w:hAnsi="Times New Roman" w:cs="Times New Roman"/>
           <w:color w:val="000000" w:themeColor="text1"/>
         </w:rPr>
-        <w:t xml:space="preserve"> encryption solutions when given a computational time constraint. For example, can AI provide optimal data hashing solutions in terms of Big O? Can AI make decisions on security level vs computational cost? Encryption is much more than just formatting data into unreadable and unrecognizable content. Encryption must meet the requirements of the scenario it is used in. These requirements are constraints of time, memory, and computing power. Is an algorithm considered to be correct if it runs several minutes over when it was proposed to give a solution? When designing encryption methods, consideration is spent on catering the proposed solution in a way that meets the problem’s security and efficiency needs. This careful software design is usually done by a qualified engineer whose goal is to perfect this optimization trade off. Herein lies our project topic. Our team took great interest in whether AI could replace the software engineer’s position of Encryption evaluation based on computational time complexity. This topic of evaluating AI’s ability to problem solve encryption solutions when held to time constraints explores both mathematical and algorithm processing </w:t>
-      </w:r>
+        <w:t xml:space="preserve"> on catering the proposed solution in a way that meets the problem’s security and efficiency needs. This careful software design </w:t>
+      </w:r>
+      <w:proofErr w:type="gramStart"/>
       <w:r>
         <w:rPr>
           <w:rFonts w:ascii="Times New Roman" w:hAnsi="Times New Roman" w:cs="Times New Roman"/>
           <w:color w:val="000000" w:themeColor="text1"/>
         </w:rPr>
+        <w:t>is usually done</w:t>
+      </w:r>
+      <w:proofErr w:type="gramEnd"/>
+      <w:r>
+        <w:rPr>
+          <w:rFonts w:ascii="Times New Roman" w:hAnsi="Times New Roman" w:cs="Times New Roman"/>
+          <w:color w:val="000000" w:themeColor="text1"/>
+        </w:rPr>
+        <w:t xml:space="preserve"> by a qualified engineer whose goal is to perfect this optimization trade off. Herein lies our project topic. Our team took great interest in whether AI could replace the software engineer’s position of Encryption evaluation based on computational time complexity. This topic of evaluating AI’s ability to problem solve encryption solutions when held to time constraints explores both mathematical and algorithm processing </w:t>
+      </w:r>
+      <w:r>
+        <w:rPr>
+          <w:rFonts w:ascii="Times New Roman" w:hAnsi="Times New Roman" w:cs="Times New Roman"/>
+          <w:color w:val="000000" w:themeColor="text1"/>
+        </w:rPr>
         <w:lastRenderedPageBreak/>
-        <w:t>while applying to an important computer science topic. This project has been designed to push generative AI models in both capability and comprehension.</w:t>
+        <w:t xml:space="preserve">while applying to an important computer science topic. This project has </w:t>
+      </w:r>
+      <w:proofErr w:type="gramStart"/>
+      <w:r>
+        <w:rPr>
+          <w:rFonts w:ascii="Times New Roman" w:hAnsi="Times New Roman" w:cs="Times New Roman"/>
+          <w:color w:val="000000" w:themeColor="text1"/>
+        </w:rPr>
+        <w:t>been designed</w:t>
+      </w:r>
+      <w:proofErr w:type="gramEnd"/>
+      <w:r>
+        <w:rPr>
+          <w:rFonts w:ascii="Times New Roman" w:hAnsi="Times New Roman" w:cs="Times New Roman"/>
+          <w:color w:val="000000" w:themeColor="text1"/>
+        </w:rPr>
+        <w:t xml:space="preserve"> to push generative AI models in both capability and comprehension.</w:t>
       </w:r>
       <w:r>
         <w:rPr>
@@ -2416,7 +2416,105 @@
         <w:rPr>
           <w:rFonts w:ascii="Times New Roman" w:hAnsi="Times New Roman" w:cs="Times New Roman"/>
         </w:rPr>
-        <w:t xml:space="preserve">The following research paper will cover four main categories of investigation. Algorithm selection, Optimization, Complexity, and Security Analysis will represent the categories AI will be tested against. Algorithm Selection will test AI’s ability and knowledge of encryption algorithms. Optimization will test the ability to select an algorithm for a specific purpose. The categories of Complexity and Security will examine AI’s ability to create an encryption solution that meets a provided time complexity while ensuring data security. Each category was selected to show contrasting information highlighted to provide the best overall thesis at the end of AI model experimentation. During analysis, both basic and complex problems will be selected to ensure a range of data to gather. These 4 main problem types to investigate will provide an overall conclusion of AI’s ability in data encryption. During these experiments, limitations will be tracked and discussed further in the report. </w:t>
+        <w:t xml:space="preserve">The following research paper will cover four main categories of investigation. Algorithm selection, Optimization, Complexity, and Security Analysis will represent the categories AI will be </w:t>
+      </w:r>
+      <w:proofErr w:type="gramStart"/>
+      <w:r>
+        <w:rPr>
+          <w:rFonts w:ascii="Times New Roman" w:hAnsi="Times New Roman" w:cs="Times New Roman"/>
+        </w:rPr>
+        <w:t>tested</w:t>
+      </w:r>
+      <w:proofErr w:type="gramEnd"/>
+      <w:r>
+        <w:rPr>
+          <w:rFonts w:ascii="Times New Roman" w:hAnsi="Times New Roman" w:cs="Times New Roman"/>
+        </w:rPr>
+        <w:t xml:space="preserve"> against. Algorithm Selection will </w:t>
+      </w:r>
+      <w:proofErr w:type="gramStart"/>
+      <w:r>
+        <w:rPr>
+          <w:rFonts w:ascii="Times New Roman" w:hAnsi="Times New Roman" w:cs="Times New Roman"/>
+        </w:rPr>
+        <w:t>test</w:t>
+      </w:r>
+      <w:proofErr w:type="gramEnd"/>
+      <w:r>
+        <w:rPr>
+          <w:rFonts w:ascii="Times New Roman" w:hAnsi="Times New Roman" w:cs="Times New Roman"/>
+        </w:rPr>
+        <w:t xml:space="preserve"> AI’s ability and knowledge of encryption algorithms. Optimization will </w:t>
+      </w:r>
+      <w:proofErr w:type="gramStart"/>
+      <w:r>
+        <w:rPr>
+          <w:rFonts w:ascii="Times New Roman" w:hAnsi="Times New Roman" w:cs="Times New Roman"/>
+        </w:rPr>
+        <w:t>test</w:t>
+      </w:r>
+      <w:proofErr w:type="gramEnd"/>
+      <w:r>
+        <w:rPr>
+          <w:rFonts w:ascii="Times New Roman" w:hAnsi="Times New Roman" w:cs="Times New Roman"/>
+        </w:rPr>
+        <w:t xml:space="preserve"> the ability to select an algorithm for a specific purpose. The categories of Complexity and Security will examine AI’s ability to create an encryption solution that meets a provided time complexity while ensuring data security. Each category </w:t>
+      </w:r>
+      <w:proofErr w:type="gramStart"/>
+      <w:r>
+        <w:rPr>
+          <w:rFonts w:ascii="Times New Roman" w:hAnsi="Times New Roman" w:cs="Times New Roman"/>
+        </w:rPr>
+        <w:t>was selected</w:t>
+      </w:r>
+      <w:proofErr w:type="gramEnd"/>
+      <w:r>
+        <w:rPr>
+          <w:rFonts w:ascii="Times New Roman" w:hAnsi="Times New Roman" w:cs="Times New Roman"/>
+        </w:rPr>
+        <w:t xml:space="preserve"> to show contrasting information highlighted to provide the best overall thesis at the end of AI model experimentation. During analysis, both basic and complex problems will </w:t>
+      </w:r>
+      <w:proofErr w:type="gramStart"/>
+      <w:r>
+        <w:rPr>
+          <w:rFonts w:ascii="Times New Roman" w:hAnsi="Times New Roman" w:cs="Times New Roman"/>
+        </w:rPr>
+        <w:t>be selected</w:t>
+      </w:r>
+      <w:proofErr w:type="gramEnd"/>
+      <w:r>
+        <w:rPr>
+          <w:rFonts w:ascii="Times New Roman" w:hAnsi="Times New Roman" w:cs="Times New Roman"/>
+        </w:rPr>
+        <w:t xml:space="preserve"> to ensure a range of data to gather. These </w:t>
+      </w:r>
+      <w:proofErr w:type="gramStart"/>
+      <w:r>
+        <w:rPr>
+          <w:rFonts w:ascii="Times New Roman" w:hAnsi="Times New Roman" w:cs="Times New Roman"/>
+        </w:rPr>
+        <w:t>4</w:t>
+      </w:r>
+      <w:proofErr w:type="gramEnd"/>
+      <w:r>
+        <w:rPr>
+          <w:rFonts w:ascii="Times New Roman" w:hAnsi="Times New Roman" w:cs="Times New Roman"/>
+        </w:rPr>
+        <w:t xml:space="preserve"> main problem types to investigate will provide an overall conclusion of AI’s ability in data encryption. During these experiments, limitations will </w:t>
+      </w:r>
+      <w:proofErr w:type="gramStart"/>
+      <w:r>
+        <w:rPr>
+          <w:rFonts w:ascii="Times New Roman" w:hAnsi="Times New Roman" w:cs="Times New Roman"/>
+        </w:rPr>
+        <w:t>be tracked</w:t>
+      </w:r>
+      <w:proofErr w:type="gramEnd"/>
+      <w:r>
+        <w:rPr>
+          <w:rFonts w:ascii="Times New Roman" w:hAnsi="Times New Roman" w:cs="Times New Roman"/>
+        </w:rPr>
+        <w:t xml:space="preserve"> and discussed further in the report. </w:t>
       </w:r>
     </w:p>
     <w:p>
@@ -2458,7 +2556,63 @@
         <w:rPr>
           <w:rFonts w:ascii="Times New Roman" w:hAnsi="Times New Roman" w:cs="Times New Roman"/>
         </w:rPr>
-        <w:t xml:space="preserve">Each team member has been assigned an AI model for experimentation. The AI model will be prompted with specific queries to generate encryption algorithms. Generated content will then be tested for optimization and complexity. Additionally, a final security analysis will be given on each generated encryption algorithm. For smooth processing and cohesive project analysis, our team will stay in consistent communication during experimentation and provide peer reviews of team solutions. Each member of the team will additionally provide report documentation under specified categories to summarize findings. This contribution will allow for </w:t>
+        <w:t xml:space="preserve">Each team member has </w:t>
+      </w:r>
+      <w:proofErr w:type="gramStart"/>
+      <w:r>
+        <w:rPr>
+          <w:rFonts w:ascii="Times New Roman" w:hAnsi="Times New Roman" w:cs="Times New Roman"/>
+        </w:rPr>
+        <w:t>been assigned</w:t>
+      </w:r>
+      <w:proofErr w:type="gramEnd"/>
+      <w:r>
+        <w:rPr>
+          <w:rFonts w:ascii="Times New Roman" w:hAnsi="Times New Roman" w:cs="Times New Roman"/>
+        </w:rPr>
+        <w:t xml:space="preserve"> an AI model for experimentation. The AI model will </w:t>
+      </w:r>
+      <w:proofErr w:type="gramStart"/>
+      <w:r>
+        <w:rPr>
+          <w:rFonts w:ascii="Times New Roman" w:hAnsi="Times New Roman" w:cs="Times New Roman"/>
+        </w:rPr>
+        <w:t>be prompted</w:t>
+      </w:r>
+      <w:proofErr w:type="gramEnd"/>
+      <w:r>
+        <w:rPr>
+          <w:rFonts w:ascii="Times New Roman" w:hAnsi="Times New Roman" w:cs="Times New Roman"/>
+        </w:rPr>
+        <w:t xml:space="preserve"> with specific queries to generate encryption algorithms. Generated content will then be </w:t>
+      </w:r>
+      <w:proofErr w:type="gramStart"/>
+      <w:r>
+        <w:rPr>
+          <w:rFonts w:ascii="Times New Roman" w:hAnsi="Times New Roman" w:cs="Times New Roman"/>
+        </w:rPr>
+        <w:t>tested</w:t>
+      </w:r>
+      <w:proofErr w:type="gramEnd"/>
+      <w:r>
+        <w:rPr>
+          <w:rFonts w:ascii="Times New Roman" w:hAnsi="Times New Roman" w:cs="Times New Roman"/>
+        </w:rPr>
+        <w:t xml:space="preserve"> for optimization and complexity. Additionally, a final security analysis will </w:t>
+      </w:r>
+      <w:proofErr w:type="gramStart"/>
+      <w:r>
+        <w:rPr>
+          <w:rFonts w:ascii="Times New Roman" w:hAnsi="Times New Roman" w:cs="Times New Roman"/>
+        </w:rPr>
+        <w:t>be given</w:t>
+      </w:r>
+      <w:proofErr w:type="gramEnd"/>
+      <w:r>
+        <w:rPr>
+          <w:rFonts w:ascii="Times New Roman" w:hAnsi="Times New Roman" w:cs="Times New Roman"/>
+        </w:rPr>
+        <w:t xml:space="preserve"> on each generated encryption algorithm. For smooth processing and cohesive project analysis, our team will stay in consistent communication during experimentation and provide peer reviews of team solutions. Each member of the team will additionally provide report documentation under specified categories to summarize findings. This contribution will allow for </w:t>
       </w:r>
       <w:proofErr w:type="gramStart"/>
       <w:r>
@@ -2859,7 +3013,77 @@
           <w:rFonts w:ascii="Times New Roman" w:hAnsi="Times New Roman" w:cs="Times New Roman"/>
         </w:rPr>
         <w:tab/>
-        <w:t>For the first AI model experimentation, ChatGPT will be prompted by queries from the four different categories in attempt to move towards an answer based on the findings. Each prompt will be performed on a new chat to prevent previous memory and history from interfering with the validity or persuasion of the data. Each prompt will be designed with enough information for the model to solve, however, it will be checked for any inflection that would convince the model of a specific solution prior to processing.</w:t>
+        <w:t xml:space="preserve">For the first AI model experimentation, ChatGPT will </w:t>
+      </w:r>
+      <w:proofErr w:type="gramStart"/>
+      <w:r>
+        <w:rPr>
+          <w:rFonts w:ascii="Times New Roman" w:hAnsi="Times New Roman" w:cs="Times New Roman"/>
+        </w:rPr>
+        <w:t>be prompted</w:t>
+      </w:r>
+      <w:proofErr w:type="gramEnd"/>
+      <w:r>
+        <w:rPr>
+          <w:rFonts w:ascii="Times New Roman" w:hAnsi="Times New Roman" w:cs="Times New Roman"/>
+        </w:rPr>
+        <w:t xml:space="preserve"> by queries from the four </w:t>
+      </w:r>
+      <w:proofErr w:type="gramStart"/>
+      <w:r>
+        <w:rPr>
+          <w:rFonts w:ascii="Times New Roman" w:hAnsi="Times New Roman" w:cs="Times New Roman"/>
+        </w:rPr>
+        <w:t>different categories</w:t>
+      </w:r>
+      <w:proofErr w:type="gramEnd"/>
+      <w:r>
+        <w:rPr>
+          <w:rFonts w:ascii="Times New Roman" w:hAnsi="Times New Roman" w:cs="Times New Roman"/>
+        </w:rPr>
+        <w:t xml:space="preserve"> in attempt to move towards an answer based on the findings. Each prompt will </w:t>
+      </w:r>
+      <w:proofErr w:type="gramStart"/>
+      <w:r>
+        <w:rPr>
+          <w:rFonts w:ascii="Times New Roman" w:hAnsi="Times New Roman" w:cs="Times New Roman"/>
+        </w:rPr>
+        <w:t>be performed</w:t>
+      </w:r>
+      <w:proofErr w:type="gramEnd"/>
+      <w:r>
+        <w:rPr>
+          <w:rFonts w:ascii="Times New Roman" w:hAnsi="Times New Roman" w:cs="Times New Roman"/>
+        </w:rPr>
+        <w:t xml:space="preserve"> on a new chat to prevent previous memory and history from interfering with the validity or persuasion of the data. Each prompt will </w:t>
+      </w:r>
+      <w:proofErr w:type="gramStart"/>
+      <w:r>
+        <w:rPr>
+          <w:rFonts w:ascii="Times New Roman" w:hAnsi="Times New Roman" w:cs="Times New Roman"/>
+        </w:rPr>
+        <w:t>be designed</w:t>
+      </w:r>
+      <w:proofErr w:type="gramEnd"/>
+      <w:r>
+        <w:rPr>
+          <w:rFonts w:ascii="Times New Roman" w:hAnsi="Times New Roman" w:cs="Times New Roman"/>
+        </w:rPr>
+        <w:t xml:space="preserve"> with enough information for the model to solve, however, it will </w:t>
+      </w:r>
+      <w:proofErr w:type="gramStart"/>
+      <w:r>
+        <w:rPr>
+          <w:rFonts w:ascii="Times New Roman" w:hAnsi="Times New Roman" w:cs="Times New Roman"/>
+        </w:rPr>
+        <w:t>be checked</w:t>
+      </w:r>
+      <w:proofErr w:type="gramEnd"/>
+      <w:r>
+        <w:rPr>
+          <w:rFonts w:ascii="Times New Roman" w:hAnsi="Times New Roman" w:cs="Times New Roman"/>
+        </w:rPr>
+        <w:t xml:space="preserve"> for any inflection that would convince the model of a specific solution prior to processing.</w:t>
       </w:r>
     </w:p>
     <w:p>
@@ -2891,7 +3115,21 @@
         <w:rPr>
           <w:rFonts w:ascii="Times New Roman" w:hAnsi="Times New Roman" w:cs="Times New Roman"/>
         </w:rPr>
-        <w:t>This category seeks to answer the question of whether AI can properly choose an encryption algorithm while keeping in mind speed, efficiency, and security.</w:t>
+        <w:t xml:space="preserve">This category seeks to answer the question of whether AI can </w:t>
+      </w:r>
+      <w:proofErr w:type="gramStart"/>
+      <w:r>
+        <w:rPr>
+          <w:rFonts w:ascii="Times New Roman" w:hAnsi="Times New Roman" w:cs="Times New Roman"/>
+        </w:rPr>
+        <w:t>properly choose</w:t>
+      </w:r>
+      <w:proofErr w:type="gramEnd"/>
+      <w:r>
+        <w:rPr>
+          <w:rFonts w:ascii="Times New Roman" w:hAnsi="Times New Roman" w:cs="Times New Roman"/>
+        </w:rPr>
+        <w:t xml:space="preserve"> an encryption algorithm while keeping in mind speed, efficiency, and security.</w:t>
       </w:r>
     </w:p>
     <w:p>
@@ -2929,7 +3167,63 @@
         <w:rPr>
           <w:rFonts w:ascii="Times New Roman" w:hAnsi="Times New Roman" w:cs="Times New Roman"/>
         </w:rPr>
-        <w:t>A datacenter needs to encrypt their employee’s system passwords. The passwords are required to be 8 characters including numbers and special characters. The software needs to encrypt the password upon account creation and verified on relogging in. There needs to be no lag during this process. There are 200 employees in this datacenter that all need accounts. Which encryption approach should be used and why?</w:t>
+        <w:t xml:space="preserve">A datacenter needs to encrypt their employee’s system passwords. The passwords </w:t>
+      </w:r>
+      <w:proofErr w:type="gramStart"/>
+      <w:r>
+        <w:rPr>
+          <w:rFonts w:ascii="Times New Roman" w:hAnsi="Times New Roman" w:cs="Times New Roman"/>
+        </w:rPr>
+        <w:t>are required</w:t>
+      </w:r>
+      <w:proofErr w:type="gramEnd"/>
+      <w:r>
+        <w:rPr>
+          <w:rFonts w:ascii="Times New Roman" w:hAnsi="Times New Roman" w:cs="Times New Roman"/>
+        </w:rPr>
+        <w:t xml:space="preserve"> to be </w:t>
+      </w:r>
+      <w:proofErr w:type="gramStart"/>
+      <w:r>
+        <w:rPr>
+          <w:rFonts w:ascii="Times New Roman" w:hAnsi="Times New Roman" w:cs="Times New Roman"/>
+        </w:rPr>
+        <w:t>8</w:t>
+      </w:r>
+      <w:proofErr w:type="gramEnd"/>
+      <w:r>
+        <w:rPr>
+          <w:rFonts w:ascii="Times New Roman" w:hAnsi="Times New Roman" w:cs="Times New Roman"/>
+        </w:rPr>
+        <w:t xml:space="preserve"> characters including numbers and special characters. The software needs to encrypt the password upon account creation and verified on relogging in. There needs to be no lag during this process. There are </w:t>
+      </w:r>
+      <w:proofErr w:type="gramStart"/>
+      <w:r>
+        <w:rPr>
+          <w:rFonts w:ascii="Times New Roman" w:hAnsi="Times New Roman" w:cs="Times New Roman"/>
+        </w:rPr>
+        <w:t>200</w:t>
+      </w:r>
+      <w:proofErr w:type="gramEnd"/>
+      <w:r>
+        <w:rPr>
+          <w:rFonts w:ascii="Times New Roman" w:hAnsi="Times New Roman" w:cs="Times New Roman"/>
+        </w:rPr>
+        <w:t xml:space="preserve"> employees in this datacenter that all need accounts. Which encryption approach should </w:t>
+      </w:r>
+      <w:proofErr w:type="gramStart"/>
+      <w:r>
+        <w:rPr>
+          <w:rFonts w:ascii="Times New Roman" w:hAnsi="Times New Roman" w:cs="Times New Roman"/>
+        </w:rPr>
+        <w:t>be used</w:t>
+      </w:r>
+      <w:proofErr w:type="gramEnd"/>
+      <w:r>
+        <w:rPr>
+          <w:rFonts w:ascii="Times New Roman" w:hAnsi="Times New Roman" w:cs="Times New Roman"/>
+        </w:rPr>
+        <w:t xml:space="preserve"> and why?</w:t>
       </w:r>
     </w:p>
     <w:p>
@@ -2943,7 +3237,35 @@
         <w:rPr>
           <w:rFonts w:ascii="Times New Roman" w:hAnsi="Times New Roman" w:cs="Times New Roman"/>
         </w:rPr>
-        <w:t>ChatGPT broke prompt 2 into the several components below represented in the table.</w:t>
+        <w:t xml:space="preserve">ChatGPT broke prompt </w:t>
+      </w:r>
+      <w:proofErr w:type="gramStart"/>
+      <w:r>
+        <w:rPr>
+          <w:rFonts w:ascii="Times New Roman" w:hAnsi="Times New Roman" w:cs="Times New Roman"/>
+        </w:rPr>
+        <w:t>2</w:t>
+      </w:r>
+      <w:proofErr w:type="gramEnd"/>
+      <w:r>
+        <w:rPr>
+          <w:rFonts w:ascii="Times New Roman" w:hAnsi="Times New Roman" w:cs="Times New Roman"/>
+        </w:rPr>
+        <w:t xml:space="preserve"> into the </w:t>
+      </w:r>
+      <w:proofErr w:type="gramStart"/>
+      <w:r>
+        <w:rPr>
+          <w:rFonts w:ascii="Times New Roman" w:hAnsi="Times New Roman" w:cs="Times New Roman"/>
+        </w:rPr>
+        <w:t>several</w:t>
+      </w:r>
+      <w:proofErr w:type="gramEnd"/>
+      <w:r>
+        <w:rPr>
+          <w:rFonts w:ascii="Times New Roman" w:hAnsi="Times New Roman" w:cs="Times New Roman"/>
+        </w:rPr>
+        <w:t xml:space="preserve"> components below represented in the table.</w:t>
       </w:r>
     </w:p>
     <w:tbl>
@@ -3054,8 +3376,16 @@
               <w:rPr>
                 <w:rFonts w:ascii="Times New Roman" w:eastAsia="Aptos" w:hAnsi="Times New Roman" w:cs="Times New Roman"/>
               </w:rPr>
-              <w:t>Hashing a single password takes milliseconds</w:t>
-            </w:r>
+              <w:t xml:space="preserve">Hashing a single password takes </w:t>
+            </w:r>
+            <w:proofErr w:type="gramStart"/>
+            <w:r>
+              <w:rPr>
+                <w:rFonts w:ascii="Times New Roman" w:eastAsia="Aptos" w:hAnsi="Times New Roman" w:cs="Times New Roman"/>
+              </w:rPr>
+              <w:t>milliseconds</w:t>
+            </w:r>
+            <w:proofErr w:type="gramEnd"/>
           </w:p>
           <w:p>
             <w:pPr>
@@ -3072,8 +3402,16 @@
               <w:rPr>
                 <w:rFonts w:ascii="Times New Roman" w:eastAsia="Aptos" w:hAnsi="Times New Roman" w:cs="Times New Roman"/>
               </w:rPr>
-              <w:t>Login verification is extremely fast</w:t>
-            </w:r>
+              <w:t xml:space="preserve">Login verification is extremely </w:t>
+            </w:r>
+            <w:proofErr w:type="gramStart"/>
+            <w:r>
+              <w:rPr>
+                <w:rFonts w:ascii="Times New Roman" w:eastAsia="Aptos" w:hAnsi="Times New Roman" w:cs="Times New Roman"/>
+              </w:rPr>
+              <w:t>fast</w:t>
+            </w:r>
+            <w:proofErr w:type="gramEnd"/>
           </w:p>
           <w:p>
             <w:pPr>
@@ -3122,8 +3460,16 @@
               <w:rPr>
                 <w:rFonts w:ascii="Times New Roman" w:eastAsia="Aptos" w:hAnsi="Times New Roman" w:cs="Times New Roman"/>
               </w:rPr>
-              <w:t>Use salt to prevent rainbow table attacks</w:t>
-            </w:r>
+              <w:t xml:space="preserve">Use salt to prevent rainbow table </w:t>
+            </w:r>
+            <w:proofErr w:type="gramStart"/>
+            <w:r>
+              <w:rPr>
+                <w:rFonts w:ascii="Times New Roman" w:eastAsia="Aptos" w:hAnsi="Times New Roman" w:cs="Times New Roman"/>
+              </w:rPr>
+              <w:t>attacks</w:t>
+            </w:r>
+            <w:proofErr w:type="gramEnd"/>
           </w:p>
           <w:p>
             <w:pPr>
@@ -3150,7 +3496,21 @@
               <w:rPr>
                 <w:rFonts w:ascii="Times New Roman" w:eastAsia="Aptos" w:hAnsi="Times New Roman" w:cs="Times New Roman"/>
               </w:rPr>
-              <w:t>Passwords are 8 characters, so hashing is extremely fast and efficient.</w:t>
+              <w:t xml:space="preserve">Passwords are </w:t>
+            </w:r>
+            <w:proofErr w:type="gramStart"/>
+            <w:r>
+              <w:rPr>
+                <w:rFonts w:ascii="Times New Roman" w:eastAsia="Aptos" w:hAnsi="Times New Roman" w:cs="Times New Roman"/>
+              </w:rPr>
+              <w:t>8</w:t>
+            </w:r>
+            <w:proofErr w:type="gramEnd"/>
+            <w:r>
+              <w:rPr>
+                <w:rFonts w:ascii="Times New Roman" w:eastAsia="Aptos" w:hAnsi="Times New Roman" w:cs="Times New Roman"/>
+              </w:rPr>
+              <w:t xml:space="preserve"> characters, so hashing is extremely fast and efficient.</w:t>
             </w:r>
           </w:p>
         </w:tc>
@@ -3169,7 +3529,21 @@
               <w:rPr>
                 <w:rFonts w:ascii="Times New Roman" w:eastAsia="Aptos" w:hAnsi="Times New Roman" w:cs="Times New Roman"/>
               </w:rPr>
-              <w:t>Encryption can be reversed with a key = dangerous</w:t>
+              <w:t xml:space="preserve">Encryption can </w:t>
+            </w:r>
+            <w:proofErr w:type="gramStart"/>
+            <w:r>
+              <w:rPr>
+                <w:rFonts w:ascii="Times New Roman" w:eastAsia="Aptos" w:hAnsi="Times New Roman" w:cs="Times New Roman"/>
+              </w:rPr>
+              <w:t>be reversed</w:t>
+            </w:r>
+            <w:proofErr w:type="gramEnd"/>
+            <w:r>
+              <w:rPr>
+                <w:rFonts w:ascii="Times New Roman" w:eastAsia="Aptos" w:hAnsi="Times New Roman" w:cs="Times New Roman"/>
+              </w:rPr>
+              <w:t xml:space="preserve"> with a key = dangerous</w:t>
             </w:r>
           </w:p>
           <w:p>
@@ -3201,8 +3575,16 @@
               <w:rPr>
                 <w:rFonts w:ascii="Times New Roman" w:eastAsia="Aptos" w:hAnsi="Times New Roman" w:cs="Times New Roman"/>
               </w:rPr>
-              <w:t>User creates password</w:t>
-            </w:r>
+              <w:t xml:space="preserve">User creates </w:t>
+            </w:r>
+            <w:proofErr w:type="gramStart"/>
+            <w:r>
+              <w:rPr>
+                <w:rFonts w:ascii="Times New Roman" w:eastAsia="Aptos" w:hAnsi="Times New Roman" w:cs="Times New Roman"/>
+              </w:rPr>
+              <w:t>password</w:t>
+            </w:r>
+            <w:proofErr w:type="gramEnd"/>
           </w:p>
           <w:p>
             <w:pPr>
@@ -3219,8 +3601,16 @@
               <w:rPr>
                 <w:rFonts w:ascii="Times New Roman" w:eastAsia="Aptos" w:hAnsi="Times New Roman" w:cs="Times New Roman"/>
               </w:rPr>
-              <w:t>System generates a random salt, hashed</w:t>
-            </w:r>
+              <w:t xml:space="preserve">System generates a random salt, </w:t>
+            </w:r>
+            <w:proofErr w:type="gramStart"/>
+            <w:r>
+              <w:rPr>
+                <w:rFonts w:ascii="Times New Roman" w:eastAsia="Aptos" w:hAnsi="Times New Roman" w:cs="Times New Roman"/>
+              </w:rPr>
+              <w:t>hashed</w:t>
+            </w:r>
+            <w:proofErr w:type="gramEnd"/>
           </w:p>
           <w:p>
             <w:pPr>
@@ -3237,8 +3627,16 @@
               <w:rPr>
                 <w:rFonts w:ascii="Times New Roman" w:eastAsia="Aptos" w:hAnsi="Times New Roman" w:cs="Times New Roman"/>
               </w:rPr>
-              <w:t>Only the hash and salt are stored</w:t>
-            </w:r>
+              <w:t xml:space="preserve">Only the hash and salt are </w:t>
+            </w:r>
+            <w:proofErr w:type="gramStart"/>
+            <w:r>
+              <w:rPr>
+                <w:rFonts w:ascii="Times New Roman" w:eastAsia="Aptos" w:hAnsi="Times New Roman" w:cs="Times New Roman"/>
+              </w:rPr>
+              <w:t>stored</w:t>
+            </w:r>
+            <w:proofErr w:type="gramEnd"/>
           </w:p>
           <w:p>
             <w:pPr>
@@ -3269,8 +3667,30 @@
               <w:rPr>
                 <w:rFonts w:ascii="Times New Roman" w:eastAsia="Aptos" w:hAnsi="Times New Roman" w:cs="Times New Roman"/>
               </w:rPr>
-              <w:t>The entered password is hashed again with the stored salt</w:t>
-            </w:r>
+              <w:t xml:space="preserve">The entered password </w:t>
+            </w:r>
+            <w:proofErr w:type="gramStart"/>
+            <w:r>
+              <w:rPr>
+                <w:rFonts w:ascii="Times New Roman" w:eastAsia="Aptos" w:hAnsi="Times New Roman" w:cs="Times New Roman"/>
+              </w:rPr>
+              <w:t>is hashed</w:t>
+            </w:r>
+            <w:proofErr w:type="gramEnd"/>
+            <w:r>
+              <w:rPr>
+                <w:rFonts w:ascii="Times New Roman" w:eastAsia="Aptos" w:hAnsi="Times New Roman" w:cs="Times New Roman"/>
+              </w:rPr>
+              <w:t xml:space="preserve"> again with the stored </w:t>
+            </w:r>
+            <w:proofErr w:type="gramStart"/>
+            <w:r>
+              <w:rPr>
+                <w:rFonts w:ascii="Times New Roman" w:eastAsia="Aptos" w:hAnsi="Times New Roman" w:cs="Times New Roman"/>
+              </w:rPr>
+              <w:t>salt</w:t>
+            </w:r>
+            <w:proofErr w:type="gramEnd"/>
           </w:p>
           <w:p>
             <w:pPr>
@@ -3287,8 +3707,16 @@
               <w:rPr>
                 <w:rFonts w:ascii="Times New Roman" w:eastAsia="Aptos" w:hAnsi="Times New Roman" w:cs="Times New Roman"/>
               </w:rPr>
-              <w:t>Compare hash to store</w:t>
-            </w:r>
+              <w:t xml:space="preserve">Compare hash to </w:t>
+            </w:r>
+            <w:proofErr w:type="gramStart"/>
+            <w:r>
+              <w:rPr>
+                <w:rFonts w:ascii="Times New Roman" w:eastAsia="Aptos" w:hAnsi="Times New Roman" w:cs="Times New Roman"/>
+              </w:rPr>
+              <w:t>store</w:t>
+            </w:r>
+            <w:proofErr w:type="gramEnd"/>
           </w:p>
           <w:p>
             <w:pPr>
@@ -3338,8 +3766,16 @@
               <w:rPr>
                 <w:rFonts w:ascii="Times New Roman" w:eastAsia="Aptos" w:hAnsi="Times New Roman" w:cs="Times New Roman"/>
               </w:rPr>
-              <w:t>password -&gt; add salt -&gt; hash with Argon2 -&gt; store hash + salt</w:t>
-            </w:r>
+              <w:t xml:space="preserve">password -&gt; add salt -&gt; hash with Argon2 -&gt; store hash + </w:t>
+            </w:r>
+            <w:proofErr w:type="gramStart"/>
+            <w:r>
+              <w:rPr>
+                <w:rFonts w:ascii="Times New Roman" w:eastAsia="Aptos" w:hAnsi="Times New Roman" w:cs="Times New Roman"/>
+              </w:rPr>
+              <w:t>salt</w:t>
+            </w:r>
+            <w:proofErr w:type="gramEnd"/>
           </w:p>
           <w:p>
             <w:pPr>
@@ -3366,29 +3802,51 @@
               <w:rPr>
                 <w:rFonts w:ascii="Times New Roman" w:eastAsia="Aptos" w:hAnsi="Times New Roman" w:cs="Times New Roman"/>
               </w:rPr>
-              <w:t>entered password -&gt; retrieve salt -&gt; hash again -&gt; compare hashes</w:t>
-            </w:r>
-          </w:p>
-          <w:p>
-            <w:pPr>
-              <w:spacing w:after="0" w:line="240" w:lineRule="auto"/>
-              <w:rPr>
-                <w:rFonts w:ascii="Times New Roman" w:hAnsi="Times New Roman" w:cs="Times New Roman"/>
-              </w:rPr>
-            </w:pPr>
-          </w:p>
-          <w:p>
-            <w:pPr>
-              <w:spacing w:after="0" w:line="240" w:lineRule="auto"/>
-              <w:rPr>
-                <w:rFonts w:ascii="Times New Roman" w:hAnsi="Times New Roman" w:cs="Times New Roman"/>
-              </w:rPr>
-            </w:pPr>
-            <w:r>
-              <w:rPr>
-                <w:rFonts w:ascii="Times New Roman" w:eastAsia="Aptos" w:hAnsi="Times New Roman" w:cs="Times New Roman"/>
-              </w:rPr>
-              <w:t>The actual password is never stored.</w:t>
+              <w:t xml:space="preserve">entered password -&gt; retrieve salt -&gt; hash again -&gt; compare </w:t>
+            </w:r>
+            <w:proofErr w:type="gramStart"/>
+            <w:r>
+              <w:rPr>
+                <w:rFonts w:ascii="Times New Roman" w:eastAsia="Aptos" w:hAnsi="Times New Roman" w:cs="Times New Roman"/>
+              </w:rPr>
+              <w:t>hashes</w:t>
+            </w:r>
+            <w:proofErr w:type="gramEnd"/>
+          </w:p>
+          <w:p>
+            <w:pPr>
+              <w:spacing w:after="0" w:line="240" w:lineRule="auto"/>
+              <w:rPr>
+                <w:rFonts w:ascii="Times New Roman" w:hAnsi="Times New Roman" w:cs="Times New Roman"/>
+              </w:rPr>
+            </w:pPr>
+          </w:p>
+          <w:p>
+            <w:pPr>
+              <w:spacing w:after="0" w:line="240" w:lineRule="auto"/>
+              <w:rPr>
+                <w:rFonts w:ascii="Times New Roman" w:hAnsi="Times New Roman" w:cs="Times New Roman"/>
+              </w:rPr>
+            </w:pPr>
+            <w:r>
+              <w:rPr>
+                <w:rFonts w:ascii="Times New Roman" w:eastAsia="Aptos" w:hAnsi="Times New Roman" w:cs="Times New Roman"/>
+              </w:rPr>
+              <w:t xml:space="preserve">The actual password </w:t>
+            </w:r>
+            <w:proofErr w:type="gramStart"/>
+            <w:r>
+              <w:rPr>
+                <w:rFonts w:ascii="Times New Roman" w:eastAsia="Aptos" w:hAnsi="Times New Roman" w:cs="Times New Roman"/>
+              </w:rPr>
+              <w:t>is never stored</w:t>
+            </w:r>
+            <w:proofErr w:type="gramEnd"/>
+            <w:r>
+              <w:rPr>
+                <w:rFonts w:ascii="Times New Roman" w:eastAsia="Aptos" w:hAnsi="Times New Roman" w:cs="Times New Roman"/>
+              </w:rPr>
+              <w:t>.</w:t>
             </w:r>
           </w:p>
         </w:tc>
@@ -3473,7 +3931,49 @@
         <w:rPr>
           <w:rFonts w:ascii="Times New Roman" w:hAnsi="Times New Roman" w:cs="Times New Roman"/>
         </w:rPr>
-        <w:t>The system should use secure salted password hashing with an algorithm such as Argon2 or bcrypt rather than encryption. These algorithms are designed specifically for password storage, provide strong protection against brute force attacks, and are fast enough that hashing and verification for 200 employees will occur with virtually no noticeable latency during account creation or login. (GPT, 2026)</w:t>
+        <w:t xml:space="preserve">The system should use secure salted password hashing with an algorithm such as Argon2 or bcrypt rather than encryption. These algorithms </w:t>
+      </w:r>
+      <w:proofErr w:type="gramStart"/>
+      <w:r>
+        <w:rPr>
+          <w:rFonts w:ascii="Times New Roman" w:hAnsi="Times New Roman" w:cs="Times New Roman"/>
+        </w:rPr>
+        <w:t>are designed</w:t>
+      </w:r>
+      <w:proofErr w:type="gramEnd"/>
+      <w:r>
+        <w:rPr>
+          <w:rFonts w:ascii="Times New Roman" w:hAnsi="Times New Roman" w:cs="Times New Roman"/>
+        </w:rPr>
+        <w:t xml:space="preserve"> specifically for password storage, provide strong protection against brute force attacks, and are fast enough that hashing and verification for </w:t>
+      </w:r>
+      <w:proofErr w:type="gramStart"/>
+      <w:r>
+        <w:rPr>
+          <w:rFonts w:ascii="Times New Roman" w:hAnsi="Times New Roman" w:cs="Times New Roman"/>
+        </w:rPr>
+        <w:t>200</w:t>
+      </w:r>
+      <w:proofErr w:type="gramEnd"/>
+      <w:r>
+        <w:rPr>
+          <w:rFonts w:ascii="Times New Roman" w:hAnsi="Times New Roman" w:cs="Times New Roman"/>
+        </w:rPr>
+        <w:t xml:space="preserve"> employees will occur with </w:t>
+      </w:r>
+      <w:proofErr w:type="gramStart"/>
+      <w:r>
+        <w:rPr>
+          <w:rFonts w:ascii="Times New Roman" w:hAnsi="Times New Roman" w:cs="Times New Roman"/>
+        </w:rPr>
+        <w:t>virtually no</w:t>
+      </w:r>
+      <w:proofErr w:type="gramEnd"/>
+      <w:r>
+        <w:rPr>
+          <w:rFonts w:ascii="Times New Roman" w:hAnsi="Times New Roman" w:cs="Times New Roman"/>
+        </w:rPr>
+        <w:t xml:space="preserve"> noticeable latency during account creation or login. (GPT, 2026)</w:t>
       </w:r>
     </w:p>
     <w:p>
@@ -3519,7 +4019,35 @@
         <w:rPr>
           <w:rFonts w:ascii="Times New Roman" w:hAnsi="Times New Roman" w:cs="Times New Roman"/>
         </w:rPr>
-        <w:t xml:space="preserve"> specified requirements as an engineer would to determine what tradeoffs must be made, while maintaining compliancy. The following prompt has been designed to represent both selection features and optimization strategies.</w:t>
+        <w:t xml:space="preserve"> specified requirements as an engineer would to determine what tradeoffs must </w:t>
+      </w:r>
+      <w:proofErr w:type="gramStart"/>
+      <w:r>
+        <w:rPr>
+          <w:rFonts w:ascii="Times New Roman" w:hAnsi="Times New Roman" w:cs="Times New Roman"/>
+        </w:rPr>
+        <w:t>be made</w:t>
+      </w:r>
+      <w:proofErr w:type="gramEnd"/>
+      <w:r>
+        <w:rPr>
+          <w:rFonts w:ascii="Times New Roman" w:hAnsi="Times New Roman" w:cs="Times New Roman"/>
+        </w:rPr>
+        <w:t xml:space="preserve">, while maintaining compliancy. The following prompt has </w:t>
+      </w:r>
+      <w:proofErr w:type="gramStart"/>
+      <w:r>
+        <w:rPr>
+          <w:rFonts w:ascii="Times New Roman" w:hAnsi="Times New Roman" w:cs="Times New Roman"/>
+        </w:rPr>
+        <w:t>been designed</w:t>
+      </w:r>
+      <w:proofErr w:type="gramEnd"/>
+      <w:r>
+        <w:rPr>
+          <w:rFonts w:ascii="Times New Roman" w:hAnsi="Times New Roman" w:cs="Times New Roman"/>
+        </w:rPr>
+        <w:t xml:space="preserve"> to represent both selection features and optimization strategies.</w:t>
       </w:r>
     </w:p>
     <w:p>
@@ -3557,7 +4085,49 @@
         <w:rPr>
           <w:rFonts w:ascii="Times New Roman" w:hAnsi="Times New Roman" w:cs="Times New Roman"/>
         </w:rPr>
-        <w:t>A system must encrypt 5GB of data per hour on limited hardware. High security is required, but latency must remain under 200ms per transaction. Which encryption approach should be used and how can it be optimized?</w:t>
+        <w:t xml:space="preserve">A system must encrypt 5GB of data per hour on limited hardware. High security </w:t>
+      </w:r>
+      <w:proofErr w:type="gramStart"/>
+      <w:r>
+        <w:rPr>
+          <w:rFonts w:ascii="Times New Roman" w:hAnsi="Times New Roman" w:cs="Times New Roman"/>
+        </w:rPr>
+        <w:t>is required</w:t>
+      </w:r>
+      <w:proofErr w:type="gramEnd"/>
+      <w:r>
+        <w:rPr>
+          <w:rFonts w:ascii="Times New Roman" w:hAnsi="Times New Roman" w:cs="Times New Roman"/>
+        </w:rPr>
+        <w:t xml:space="preserve">, but latency must remain under 200ms per transaction. Which encryption approach should </w:t>
+      </w:r>
+      <w:proofErr w:type="gramStart"/>
+      <w:r>
+        <w:rPr>
+          <w:rFonts w:ascii="Times New Roman" w:hAnsi="Times New Roman" w:cs="Times New Roman"/>
+        </w:rPr>
+        <w:t>be used</w:t>
+      </w:r>
+      <w:proofErr w:type="gramEnd"/>
+      <w:r>
+        <w:rPr>
+          <w:rFonts w:ascii="Times New Roman" w:hAnsi="Times New Roman" w:cs="Times New Roman"/>
+        </w:rPr>
+        <w:t xml:space="preserve"> and how can it </w:t>
+      </w:r>
+      <w:proofErr w:type="gramStart"/>
+      <w:r>
+        <w:rPr>
+          <w:rFonts w:ascii="Times New Roman" w:hAnsi="Times New Roman" w:cs="Times New Roman"/>
+        </w:rPr>
+        <w:t>be optimized</w:t>
+      </w:r>
+      <w:proofErr w:type="gramEnd"/>
+      <w:r>
+        <w:rPr>
+          <w:rFonts w:ascii="Times New Roman" w:hAnsi="Times New Roman" w:cs="Times New Roman"/>
+        </w:rPr>
+        <w:t>?</w:t>
       </w:r>
     </w:p>
     <w:p>
@@ -3571,7 +4141,35 @@
         <w:rPr>
           <w:rFonts w:ascii="Times New Roman" w:hAnsi="Times New Roman" w:cs="Times New Roman"/>
         </w:rPr>
-        <w:t>ChatGPT broke prompt 1 into the several components below represented in the table.</w:t>
+        <w:t xml:space="preserve">ChatGPT broke prompt </w:t>
+      </w:r>
+      <w:proofErr w:type="gramStart"/>
+      <w:r>
+        <w:rPr>
+          <w:rFonts w:ascii="Times New Roman" w:hAnsi="Times New Roman" w:cs="Times New Roman"/>
+        </w:rPr>
+        <w:t>1</w:t>
+      </w:r>
+      <w:proofErr w:type="gramEnd"/>
+      <w:r>
+        <w:rPr>
+          <w:rFonts w:ascii="Times New Roman" w:hAnsi="Times New Roman" w:cs="Times New Roman"/>
+        </w:rPr>
+        <w:t xml:space="preserve"> into the </w:t>
+      </w:r>
+      <w:proofErr w:type="gramStart"/>
+      <w:r>
+        <w:rPr>
+          <w:rFonts w:ascii="Times New Roman" w:hAnsi="Times New Roman" w:cs="Times New Roman"/>
+        </w:rPr>
+        <w:t>several</w:t>
+      </w:r>
+      <w:proofErr w:type="gramEnd"/>
+      <w:r>
+        <w:rPr>
+          <w:rFonts w:ascii="Times New Roman" w:hAnsi="Times New Roman" w:cs="Times New Roman"/>
+        </w:rPr>
+        <w:t xml:space="preserve"> components below represented in the table.</w:t>
       </w:r>
     </w:p>
     <w:tbl>
@@ -3794,8 +4392,16 @@
               <w:rPr>
                 <w:rFonts w:ascii="Times New Roman" w:eastAsia="Aptos" w:hAnsi="Times New Roman" w:cs="Times New Roman"/>
               </w:rPr>
-              <w:t>Client generates random AES session key</w:t>
-            </w:r>
+              <w:t xml:space="preserve">Client generates random AES session </w:t>
+            </w:r>
+            <w:proofErr w:type="gramStart"/>
+            <w:r>
+              <w:rPr>
+                <w:rFonts w:ascii="Times New Roman" w:eastAsia="Aptos" w:hAnsi="Times New Roman" w:cs="Times New Roman"/>
+              </w:rPr>
+              <w:t>key</w:t>
+            </w:r>
+            <w:proofErr w:type="gramEnd"/>
           </w:p>
           <w:p>
             <w:pPr>
@@ -3989,8 +4595,16 @@
               <w:rPr>
                 <w:rFonts w:ascii="Times New Roman" w:eastAsia="Aptos" w:hAnsi="Times New Roman" w:cs="Times New Roman"/>
               </w:rPr>
-              <w:t>AES-256 GCM provides authentication &amp; encryption</w:t>
-            </w:r>
+              <w:t xml:space="preserve">AES-256 GCM provides authentication &amp; </w:t>
+            </w:r>
+            <w:proofErr w:type="gramStart"/>
+            <w:r>
+              <w:rPr>
+                <w:rFonts w:ascii="Times New Roman" w:eastAsia="Aptos" w:hAnsi="Times New Roman" w:cs="Times New Roman"/>
+              </w:rPr>
+              <w:t>encryption</w:t>
+            </w:r>
+            <w:proofErr w:type="gramEnd"/>
           </w:p>
           <w:p>
             <w:pPr>
@@ -4027,7 +4641,21 @@
               <w:rPr>
                 <w:rFonts w:ascii="Times New Roman" w:eastAsia="Aptos" w:hAnsi="Times New Roman" w:cs="Times New Roman"/>
               </w:rPr>
-              <w:t xml:space="preserve">Allows large data handling </w:t>
+              <w:t xml:space="preserve">Allows large data </w:t>
+            </w:r>
+            <w:proofErr w:type="gramStart"/>
+            <w:r>
+              <w:rPr>
+                <w:rFonts w:ascii="Times New Roman" w:eastAsia="Aptos" w:hAnsi="Times New Roman" w:cs="Times New Roman"/>
+              </w:rPr>
+              <w:t>handling</w:t>
+            </w:r>
+            <w:proofErr w:type="gramEnd"/>
+            <w:r>
+              <w:rPr>
+                <w:rFonts w:ascii="Times New Roman" w:eastAsia="Aptos" w:hAnsi="Times New Roman" w:cs="Times New Roman"/>
+              </w:rPr>
+              <w:t xml:space="preserve"> </w:t>
             </w:r>
           </w:p>
           <w:p>
@@ -4260,7 +4888,49 @@
         <w:rPr>
           <w:rFonts w:ascii="Times New Roman" w:hAnsi="Times New Roman" w:cs="Times New Roman"/>
         </w:rPr>
-        <w:t>The use of hybrid encryption: AES-256-GCM for bulk data encryption with ECC for secure key exchange provides optimization, because symmetric encryption provides the necessary throughput and low latency. Asymmetric cryptography ensures secure key distribution. The combination of asymmetric and symmetric encryption reduces slow and CPU intensive processing. Single asymmetric encryption would also exceed the latency since it is not feasible for large data streams or payloads. Optimization can be further achieved through session key reuse within secure time windows. Additionally, efficient memory buffering of large data streams could be implemented. These optimizations reduce the frequency of expensive cryptographic operations while maintaining strong security guarantees. As a result, the system can reliably encrypt large volumes of data while operating within strict hardware and latency constraints. (GPT, 2026)</w:t>
+        <w:t xml:space="preserve">The use of hybrid encryption: AES-256-GCM for bulk data encryption with ECC for secure key exchange provides </w:t>
+      </w:r>
+      <w:proofErr w:type="gramStart"/>
+      <w:r>
+        <w:rPr>
+          <w:rFonts w:ascii="Times New Roman" w:hAnsi="Times New Roman" w:cs="Times New Roman"/>
+        </w:rPr>
+        <w:t>optimization, because</w:t>
+      </w:r>
+      <w:proofErr w:type="gramEnd"/>
+      <w:r>
+        <w:rPr>
+          <w:rFonts w:ascii="Times New Roman" w:hAnsi="Times New Roman" w:cs="Times New Roman"/>
+        </w:rPr>
+        <w:t xml:space="preserve"> symmetric encryption provides the necessary throughput and low latency. Asymmetric cryptography ensures secure key distribution. The combination of asymmetric and symmetric encryption reduces slow and CPU intensive processing. Single asymmetric encryption would also exceed the latency since it is not feasible for large data streams or payloads. Optimization can </w:t>
+      </w:r>
+      <w:proofErr w:type="gramStart"/>
+      <w:r>
+        <w:rPr>
+          <w:rFonts w:ascii="Times New Roman" w:hAnsi="Times New Roman" w:cs="Times New Roman"/>
+        </w:rPr>
+        <w:t>be further achieved</w:t>
+      </w:r>
+      <w:proofErr w:type="gramEnd"/>
+      <w:r>
+        <w:rPr>
+          <w:rFonts w:ascii="Times New Roman" w:hAnsi="Times New Roman" w:cs="Times New Roman"/>
+        </w:rPr>
+        <w:t xml:space="preserve"> through session key reuse within secure time windows. Additionally, efficient memory buffering of large data streams could </w:t>
+      </w:r>
+      <w:proofErr w:type="gramStart"/>
+      <w:r>
+        <w:rPr>
+          <w:rFonts w:ascii="Times New Roman" w:hAnsi="Times New Roman" w:cs="Times New Roman"/>
+        </w:rPr>
+        <w:t>be implemented</w:t>
+      </w:r>
+      <w:proofErr w:type="gramEnd"/>
+      <w:r>
+        <w:rPr>
+          <w:rFonts w:ascii="Times New Roman" w:hAnsi="Times New Roman" w:cs="Times New Roman"/>
+        </w:rPr>
+        <w:t>. These optimizations reduce the frequency of expensive cryptographic operations while maintaining strong security guarantees. As a result, the system can reliably encrypt large volumes of data while operating within strict hardware and latency constraints. (GPT, 2026)</w:t>
       </w:r>
     </w:p>
     <w:p>
@@ -4305,7 +4975,21 @@
         <w:rPr>
           <w:rFonts w:ascii="Times New Roman" w:hAnsi="Times New Roman" w:cs="Times New Roman"/>
         </w:rPr>
-        <w:t xml:space="preserve"> focused on specific time complexity. This section will test AI’s ability to produce solutions that meet a certain computational time requirement.</w:t>
+        <w:t xml:space="preserve"> focused on specific time complexity. This section will </w:t>
+      </w:r>
+      <w:proofErr w:type="gramStart"/>
+      <w:r>
+        <w:rPr>
+          <w:rFonts w:ascii="Times New Roman" w:hAnsi="Times New Roman" w:cs="Times New Roman"/>
+        </w:rPr>
+        <w:t>test</w:t>
+      </w:r>
+      <w:proofErr w:type="gramEnd"/>
+      <w:r>
+        <w:rPr>
+          <w:rFonts w:ascii="Times New Roman" w:hAnsi="Times New Roman" w:cs="Times New Roman"/>
+        </w:rPr>
+        <w:t xml:space="preserve"> AI’s ability to produce solutions that meet a certain computational time requirement.</w:t>
       </w:r>
     </w:p>
     <w:p>
@@ -4419,8 +5103,16 @@
               <w:rPr>
                 <w:rFonts w:ascii="Times New Roman" w:eastAsia="Aptos" w:hAnsi="Times New Roman" w:cs="Times New Roman"/>
               </w:rPr>
-              <w:t>Convert characters → ASCII</w:t>
-            </w:r>
+              <w:t xml:space="preserve">Convert characters → </w:t>
+            </w:r>
+            <w:proofErr w:type="gramStart"/>
+            <w:r>
+              <w:rPr>
+                <w:rFonts w:ascii="Times New Roman" w:eastAsia="Aptos" w:hAnsi="Times New Roman" w:cs="Times New Roman"/>
+              </w:rPr>
+              <w:t>ASCII</w:t>
+            </w:r>
+            <w:proofErr w:type="gramEnd"/>
           </w:p>
           <w:p>
             <w:pPr>
@@ -4437,8 +5129,16 @@
               <w:rPr>
                 <w:rFonts w:ascii="Times New Roman" w:eastAsia="Aptos" w:hAnsi="Times New Roman" w:cs="Times New Roman"/>
               </w:rPr>
-              <w:t>XOR with a secret key</w:t>
-            </w:r>
+              <w:t xml:space="preserve">XOR with a secret </w:t>
+            </w:r>
+            <w:proofErr w:type="gramStart"/>
+            <w:r>
+              <w:rPr>
+                <w:rFonts w:ascii="Times New Roman" w:eastAsia="Aptos" w:hAnsi="Times New Roman" w:cs="Times New Roman"/>
+              </w:rPr>
+              <w:t>key</w:t>
+            </w:r>
+            <w:proofErr w:type="gramEnd"/>
           </w:p>
           <w:p>
             <w:pPr>
@@ -4455,8 +5155,16 @@
               <w:rPr>
                 <w:rFonts w:ascii="Times New Roman" w:eastAsia="Aptos" w:hAnsi="Times New Roman" w:cs="Times New Roman"/>
               </w:rPr>
-              <w:t>Rotate bits</w:t>
-            </w:r>
+              <w:t xml:space="preserve">Rotate </w:t>
+            </w:r>
+            <w:proofErr w:type="gramStart"/>
+            <w:r>
+              <w:rPr>
+                <w:rFonts w:ascii="Times New Roman" w:eastAsia="Aptos" w:hAnsi="Times New Roman" w:cs="Times New Roman"/>
+              </w:rPr>
+              <w:t>bits</w:t>
+            </w:r>
+            <w:proofErr w:type="gramEnd"/>
           </w:p>
           <w:p>
             <w:pPr>
@@ -4683,7 +5391,21 @@
           <w:rFonts w:ascii="Times New Roman" w:hAnsi="Times New Roman" w:cs="Times New Roman"/>
         </w:rPr>
         <w:tab/>
-        <w:t xml:space="preserve">By implementing a fixed key, apply XOR, and bit rotations to each character of the license number, constant time encryption can be achieved. Since licenses numbers have fixed lengths, the number of operations remains constant, giving an </w:t>
+        <w:t xml:space="preserve">By implementing a fixed key, apply XOR, and bit rotations to each character of the license number, constant time encryption can </w:t>
+      </w:r>
+      <w:proofErr w:type="gramStart"/>
+      <w:r>
+        <w:rPr>
+          <w:rFonts w:ascii="Times New Roman" w:hAnsi="Times New Roman" w:cs="Times New Roman"/>
+        </w:rPr>
+        <w:t>be achieved</w:t>
+      </w:r>
+      <w:proofErr w:type="gramEnd"/>
+      <w:r>
+        <w:rPr>
+          <w:rFonts w:ascii="Times New Roman" w:hAnsi="Times New Roman" w:cs="Times New Roman"/>
+        </w:rPr>
+        <w:t xml:space="preserve">. Since licenses numbers have fixed lengths, the number of operations remains constant, giving an </w:t>
       </w:r>
       <w:r>
         <w:rPr>
@@ -4735,7 +5457,35 @@
           <w:rFonts w:ascii="Times New Roman" w:hAnsi="Times New Roman" w:cs="Times New Roman"/>
         </w:rPr>
         <w:tab/>
-        <w:t xml:space="preserve">However to specifically achieve Log Time, encryption keys need to be stored by a balanced binary search tree. For further processing, they must be selected with a key based on a hash of the license number. Tree lookups require </w:t>
+        <w:t xml:space="preserve">However to specifically achieve Log Time, encryption keys need to </w:t>
+      </w:r>
+      <w:proofErr w:type="gramStart"/>
+      <w:r>
+        <w:rPr>
+          <w:rFonts w:ascii="Times New Roman" w:hAnsi="Times New Roman" w:cs="Times New Roman"/>
+        </w:rPr>
+        <w:t>be stored</w:t>
+      </w:r>
+      <w:proofErr w:type="gramEnd"/>
+      <w:r>
+        <w:rPr>
+          <w:rFonts w:ascii="Times New Roman" w:hAnsi="Times New Roman" w:cs="Times New Roman"/>
+        </w:rPr>
+        <w:t xml:space="preserve"> by a balanced binary search tree. For further processing, they must </w:t>
+      </w:r>
+      <w:proofErr w:type="gramStart"/>
+      <w:r>
+        <w:rPr>
+          <w:rFonts w:ascii="Times New Roman" w:hAnsi="Times New Roman" w:cs="Times New Roman"/>
+        </w:rPr>
+        <w:t>be selected</w:t>
+      </w:r>
+      <w:proofErr w:type="gramEnd"/>
+      <w:r>
+        <w:rPr>
+          <w:rFonts w:ascii="Times New Roman" w:hAnsi="Times New Roman" w:cs="Times New Roman"/>
+        </w:rPr>
+        <w:t xml:space="preserve"> with a key based on a hash of the license number. Tree lookups require </w:t>
       </w:r>
       <w:r>
         <w:rPr>
@@ -4762,7 +5512,21 @@
         <w:rPr>
           <w:rFonts w:ascii="Times New Roman" w:hAnsi="Times New Roman" w:cs="Times New Roman"/>
         </w:rPr>
-        <w:t>The figure below demonstrates the code generated from ChatGPT AI model. Code will be included upon submission.</w:t>
+        <w:t xml:space="preserve">The figure below demonstrates the code generated from ChatGPT AI model. Code will </w:t>
+      </w:r>
+      <w:proofErr w:type="gramStart"/>
+      <w:r>
+        <w:rPr>
+          <w:rFonts w:ascii="Times New Roman" w:hAnsi="Times New Roman" w:cs="Times New Roman"/>
+        </w:rPr>
+        <w:t>be included</w:t>
+      </w:r>
+      <w:proofErr w:type="gramEnd"/>
+      <w:r>
+        <w:rPr>
+          <w:rFonts w:ascii="Times New Roman" w:hAnsi="Times New Roman" w:cs="Times New Roman"/>
+        </w:rPr>
+        <w:t xml:space="preserve"> upon submission.</w:t>
       </w:r>
     </w:p>
     <w:p>
@@ -5059,7 +5823,21 @@
           <w:rFonts w:ascii="Times New Roman" w:hAnsi="Times New Roman" w:cs="Times New Roman"/>
         </w:rPr>
         <w:lastRenderedPageBreak/>
-        <w:t>The figure below demonstrates the code generated from ChatGPT AI model. Code will be included upon submission.</w:t>
+        <w:t xml:space="preserve">The figure below demonstrates the code generated from ChatGPT AI model. Code will </w:t>
+      </w:r>
+      <w:proofErr w:type="gramStart"/>
+      <w:r>
+        <w:rPr>
+          <w:rFonts w:ascii="Times New Roman" w:hAnsi="Times New Roman" w:cs="Times New Roman"/>
+        </w:rPr>
+        <w:t>be included</w:t>
+      </w:r>
+      <w:proofErr w:type="gramEnd"/>
+      <w:r>
+        <w:rPr>
+          <w:rFonts w:ascii="Times New Roman" w:hAnsi="Times New Roman" w:cs="Times New Roman"/>
+        </w:rPr>
+        <w:t xml:space="preserve"> upon submission.</w:t>
       </w:r>
     </w:p>
     <w:p>
@@ -5142,7 +5920,77 @@
         <w:rPr>
           <w:rFonts w:ascii="Times New Roman" w:hAnsi="Times New Roman" w:cs="Times New Roman"/>
         </w:rPr>
-        <w:t xml:space="preserve">Chat GPT AI model was able to take the proposed questions and formulate solutions. Breaking the prompts into sections allowed for thorough and logical processing. Each section prompt allowed for diverse testing information. During this ChatGPT experimentation, our team was able to see both pros and cons. The AI model has great capabilities of processing the prompt. It can separate specific requirements from the prompt seamlessly. By formatting the requirements into tabular representations, the AI model reached optimal problem organization. Solutions were provided quickly with through explanations. However, it was noticed that ChatGPT provided no references or reasons behind these solutions. The user or engineer is required to blindly trust AI or do external research that would add additional time to project composition. This produces a detrimental cost when dealing specifically with code since it is the intellectual property of the author. However, without proper documentation, who is the author of the AI generated code or logic? Has it been sourced from an external internet source? Has it been reused or modified? Overall credibility is a major concern regarding this AI model. </w:t>
+        <w:t xml:space="preserve">Chat GPT AI model was able to take the proposed questions and formulate solutions. Breaking the prompts into sections allowed for thorough and logical processing. Each section prompt allowed for diverse testing information. During this ChatGPT experimentation, our team was able to see both pros and cons. The AI model has great capabilities of processing the prompt. It can separate specific requirements from the prompt seamlessly. By formatting the requirements into tabular representations, the AI model reached optimal problem organization. Solutions </w:t>
+      </w:r>
+      <w:proofErr w:type="gramStart"/>
+      <w:r>
+        <w:rPr>
+          <w:rFonts w:ascii="Times New Roman" w:hAnsi="Times New Roman" w:cs="Times New Roman"/>
+        </w:rPr>
+        <w:t>were provided</w:t>
+      </w:r>
+      <w:proofErr w:type="gramEnd"/>
+      <w:r>
+        <w:rPr>
+          <w:rFonts w:ascii="Times New Roman" w:hAnsi="Times New Roman" w:cs="Times New Roman"/>
+        </w:rPr>
+        <w:t xml:space="preserve"> quickly with through explanations. However, it </w:t>
+      </w:r>
+      <w:proofErr w:type="gramStart"/>
+      <w:r>
+        <w:rPr>
+          <w:rFonts w:ascii="Times New Roman" w:hAnsi="Times New Roman" w:cs="Times New Roman"/>
+        </w:rPr>
+        <w:t>was noticed</w:t>
+      </w:r>
+      <w:proofErr w:type="gramEnd"/>
+      <w:r>
+        <w:rPr>
+          <w:rFonts w:ascii="Times New Roman" w:hAnsi="Times New Roman" w:cs="Times New Roman"/>
+        </w:rPr>
+        <w:t xml:space="preserve"> that ChatGPT provided no references or reasons behind these solutions. The user or engineer </w:t>
+      </w:r>
+      <w:proofErr w:type="gramStart"/>
+      <w:r>
+        <w:rPr>
+          <w:rFonts w:ascii="Times New Roman" w:hAnsi="Times New Roman" w:cs="Times New Roman"/>
+        </w:rPr>
+        <w:t>is required</w:t>
+      </w:r>
+      <w:proofErr w:type="gramEnd"/>
+      <w:r>
+        <w:rPr>
+          <w:rFonts w:ascii="Times New Roman" w:hAnsi="Times New Roman" w:cs="Times New Roman"/>
+        </w:rPr>
+        <w:t xml:space="preserve"> to blindly trust AI or do external research that would add additional time to project composition. This produces a detrimental cost when dealing specifically with code since it is the intellectual property of the author. However, without proper documentation, who is the author of the AI generated code or logic? Has it </w:t>
+      </w:r>
+      <w:proofErr w:type="gramStart"/>
+      <w:r>
+        <w:rPr>
+          <w:rFonts w:ascii="Times New Roman" w:hAnsi="Times New Roman" w:cs="Times New Roman"/>
+        </w:rPr>
+        <w:t>been sourced</w:t>
+      </w:r>
+      <w:proofErr w:type="gramEnd"/>
+      <w:r>
+        <w:rPr>
+          <w:rFonts w:ascii="Times New Roman" w:hAnsi="Times New Roman" w:cs="Times New Roman"/>
+        </w:rPr>
+        <w:t xml:space="preserve"> from an external internet source? Has it </w:t>
+      </w:r>
+      <w:proofErr w:type="gramStart"/>
+      <w:r>
+        <w:rPr>
+          <w:rFonts w:ascii="Times New Roman" w:hAnsi="Times New Roman" w:cs="Times New Roman"/>
+        </w:rPr>
+        <w:t>been reused</w:t>
+      </w:r>
+      <w:proofErr w:type="gramEnd"/>
+      <w:r>
+        <w:rPr>
+          <w:rFonts w:ascii="Times New Roman" w:hAnsi="Times New Roman" w:cs="Times New Roman"/>
+        </w:rPr>
+        <w:t xml:space="preserve"> or modified? Overall credibility is a major concern regarding this AI model. </w:t>
       </w:r>
     </w:p>
     <w:p>
@@ -5193,7 +6041,49 @@
           <w:rFonts w:ascii="Times New Roman" w:hAnsi="Times New Roman" w:cs="Times New Roman"/>
         </w:rPr>
         <w:tab/>
-        <w:t>For the second AI model experimentation, Google Gemini will be prompted with the exact same prompts that were sent to ChatGPT. Each prompt will be performed on a new chat to prevent previous memory and history from interfering with the validity or persuasion of the data. Gemini is unique from the other two models explored in this paper, in that it has its own unique foundational LLM; it does not use a GPT model, as ChatGPT and Copilot do.</w:t>
+        <w:t xml:space="preserve">For the second AI model experimentation, Google Gemini will </w:t>
+      </w:r>
+      <w:proofErr w:type="gramStart"/>
+      <w:r>
+        <w:rPr>
+          <w:rFonts w:ascii="Times New Roman" w:hAnsi="Times New Roman" w:cs="Times New Roman"/>
+        </w:rPr>
+        <w:t>be prompted</w:t>
+      </w:r>
+      <w:proofErr w:type="gramEnd"/>
+      <w:r>
+        <w:rPr>
+          <w:rFonts w:ascii="Times New Roman" w:hAnsi="Times New Roman" w:cs="Times New Roman"/>
+        </w:rPr>
+        <w:t xml:space="preserve"> with the exact same prompts that </w:t>
+      </w:r>
+      <w:proofErr w:type="gramStart"/>
+      <w:r>
+        <w:rPr>
+          <w:rFonts w:ascii="Times New Roman" w:hAnsi="Times New Roman" w:cs="Times New Roman"/>
+        </w:rPr>
+        <w:t>were sent</w:t>
+      </w:r>
+      <w:proofErr w:type="gramEnd"/>
+      <w:r>
+        <w:rPr>
+          <w:rFonts w:ascii="Times New Roman" w:hAnsi="Times New Roman" w:cs="Times New Roman"/>
+        </w:rPr>
+        <w:t xml:space="preserve"> to ChatGPT. Each prompt will </w:t>
+      </w:r>
+      <w:proofErr w:type="gramStart"/>
+      <w:r>
+        <w:rPr>
+          <w:rFonts w:ascii="Times New Roman" w:hAnsi="Times New Roman" w:cs="Times New Roman"/>
+        </w:rPr>
+        <w:t>be performed</w:t>
+      </w:r>
+      <w:proofErr w:type="gramEnd"/>
+      <w:r>
+        <w:rPr>
+          <w:rFonts w:ascii="Times New Roman" w:hAnsi="Times New Roman" w:cs="Times New Roman"/>
+        </w:rPr>
+        <w:t xml:space="preserve"> on a new chat to prevent previous memory and history from interfering with the validity or persuasion of the data. Gemini is unique from the other two models explored in this paper, in that it has its own unique foundational LLM; it does not use a GPT model, as ChatGPT and Copilot do.</w:t>
       </w:r>
     </w:p>
     <w:p>
@@ -5225,7 +6115,21 @@
         <w:rPr>
           <w:rFonts w:ascii="Times New Roman" w:hAnsi="Times New Roman" w:cs="Times New Roman"/>
         </w:rPr>
-        <w:t>This category seeks to answer the question of whether AI can properly choose an encryption algorithm while keeping in mind speed, efficiency, and security.</w:t>
+        <w:t xml:space="preserve">This category seeks to answer the question of whether AI can </w:t>
+      </w:r>
+      <w:proofErr w:type="gramStart"/>
+      <w:r>
+        <w:rPr>
+          <w:rFonts w:ascii="Times New Roman" w:hAnsi="Times New Roman" w:cs="Times New Roman"/>
+        </w:rPr>
+        <w:t>properly choose</w:t>
+      </w:r>
+      <w:proofErr w:type="gramEnd"/>
+      <w:r>
+        <w:rPr>
+          <w:rFonts w:ascii="Times New Roman" w:hAnsi="Times New Roman" w:cs="Times New Roman"/>
+        </w:rPr>
+        <w:t xml:space="preserve"> an encryption algorithm while keeping in mind speed, efficiency, and security.</w:t>
       </w:r>
     </w:p>
     <w:p>
@@ -5260,14 +6164,70 @@
           <w:rFonts w:ascii="Times New Roman" w:hAnsi="Times New Roman" w:cs="Times New Roman"/>
         </w:rPr>
         <w:tab/>
-        <w:t xml:space="preserve">A datacenter needs to encrypt their employee’s system passwords. The passwords are required to be 8 characters including numbers and special characters. The software needs to encrypt the password upon account creation and verified on relogging in. There needs to be no </w:t>
+        <w:t xml:space="preserve">A datacenter needs to encrypt their employee’s system passwords. The passwords </w:t>
+      </w:r>
+      <w:proofErr w:type="gramStart"/>
+      <w:r>
+        <w:rPr>
+          <w:rFonts w:ascii="Times New Roman" w:hAnsi="Times New Roman" w:cs="Times New Roman"/>
+        </w:rPr>
+        <w:t>are required</w:t>
+      </w:r>
+      <w:proofErr w:type="gramEnd"/>
+      <w:r>
+        <w:rPr>
+          <w:rFonts w:ascii="Times New Roman" w:hAnsi="Times New Roman" w:cs="Times New Roman"/>
+        </w:rPr>
+        <w:t xml:space="preserve"> to be </w:t>
+      </w:r>
+      <w:proofErr w:type="gramStart"/>
+      <w:r>
+        <w:rPr>
+          <w:rFonts w:ascii="Times New Roman" w:hAnsi="Times New Roman" w:cs="Times New Roman"/>
+        </w:rPr>
+        <w:t>8</w:t>
+      </w:r>
+      <w:proofErr w:type="gramEnd"/>
+      <w:r>
+        <w:rPr>
+          <w:rFonts w:ascii="Times New Roman" w:hAnsi="Times New Roman" w:cs="Times New Roman"/>
+        </w:rPr>
+        <w:t xml:space="preserve"> characters including numbers and special characters. The software needs to encrypt the password upon account creation and verified on relogging in. There needs to be no </w:t>
       </w:r>
       <w:r>
         <w:rPr>
           <w:rFonts w:ascii="Times New Roman" w:hAnsi="Times New Roman" w:cs="Times New Roman"/>
         </w:rPr>
         <w:lastRenderedPageBreak/>
-        <w:t>lag during this process. There are 200 employees in this datacenter that all need accounts. Which encryption approach should be used and why?</w:t>
+        <w:t xml:space="preserve">lag during this process. There are </w:t>
+      </w:r>
+      <w:proofErr w:type="gramStart"/>
+      <w:r>
+        <w:rPr>
+          <w:rFonts w:ascii="Times New Roman" w:hAnsi="Times New Roman" w:cs="Times New Roman"/>
+        </w:rPr>
+        <w:t>200</w:t>
+      </w:r>
+      <w:proofErr w:type="gramEnd"/>
+      <w:r>
+        <w:rPr>
+          <w:rFonts w:ascii="Times New Roman" w:hAnsi="Times New Roman" w:cs="Times New Roman"/>
+        </w:rPr>
+        <w:t xml:space="preserve"> employees in this datacenter that all need accounts. Which encryption approach should </w:t>
+      </w:r>
+      <w:proofErr w:type="gramStart"/>
+      <w:r>
+        <w:rPr>
+          <w:rFonts w:ascii="Times New Roman" w:hAnsi="Times New Roman" w:cs="Times New Roman"/>
+        </w:rPr>
+        <w:t>be used</w:t>
+      </w:r>
+      <w:proofErr w:type="gramEnd"/>
+      <w:r>
+        <w:rPr>
+          <w:rFonts w:ascii="Times New Roman" w:hAnsi="Times New Roman" w:cs="Times New Roman"/>
+        </w:rPr>
+        <w:t xml:space="preserve"> and why?</w:t>
       </w:r>
     </w:p>
     <w:p>
@@ -5295,7 +6255,35 @@
         <w:rPr>
           <w:rFonts w:ascii="Times New Roman" w:hAnsi="Times New Roman" w:cs="Times New Roman"/>
         </w:rPr>
-        <w:t>. It specified that “encrypt” is not the correct action for what is needed, as encryptions can be decrypted. It presents hashing as distinct from encryption, and provided the following table:</w:t>
+        <w:t xml:space="preserve">. It specified that “encrypt” is not the correct action for what </w:t>
+      </w:r>
+      <w:proofErr w:type="gramStart"/>
+      <w:r>
+        <w:rPr>
+          <w:rFonts w:ascii="Times New Roman" w:hAnsi="Times New Roman" w:cs="Times New Roman"/>
+        </w:rPr>
+        <w:t>is needed</w:t>
+      </w:r>
+      <w:proofErr w:type="gramEnd"/>
+      <w:r>
+        <w:rPr>
+          <w:rFonts w:ascii="Times New Roman" w:hAnsi="Times New Roman" w:cs="Times New Roman"/>
+        </w:rPr>
+        <w:t xml:space="preserve">, as encryptions can </w:t>
+      </w:r>
+      <w:proofErr w:type="gramStart"/>
+      <w:r>
+        <w:rPr>
+          <w:rFonts w:ascii="Times New Roman" w:hAnsi="Times New Roman" w:cs="Times New Roman"/>
+        </w:rPr>
+        <w:t>be decrypted</w:t>
+      </w:r>
+      <w:proofErr w:type="gramEnd"/>
+      <w:r>
+        <w:rPr>
+          <w:rFonts w:ascii="Times New Roman" w:hAnsi="Times New Roman" w:cs="Times New Roman"/>
+        </w:rPr>
+        <w:t>. It presents hashing as distinct from encryption, and provided the following table:</w:t>
       </w:r>
     </w:p>
     <w:tbl>
@@ -5798,7 +6786,35 @@
           <w:rFonts w:ascii="Times New Roman" w:hAnsi="Times New Roman" w:cs="Times New Roman"/>
         </w:rPr>
         <w:tab/>
-        <w:t>Gemini recommended that the size of passwords be increased, citing 8 characters as the bare minimum for this use case. It also said that it is vital that the software used to hash the passwords uses a Cryptographically Secure Pseudo-Random Number Generator (CSPRNG) for the system to work as required.</w:t>
+        <w:t xml:space="preserve">Gemini recommended that the size of passwords </w:t>
+      </w:r>
+      <w:proofErr w:type="gramStart"/>
+      <w:r>
+        <w:rPr>
+          <w:rFonts w:ascii="Times New Roman" w:hAnsi="Times New Roman" w:cs="Times New Roman"/>
+        </w:rPr>
+        <w:t>be increased</w:t>
+      </w:r>
+      <w:proofErr w:type="gramEnd"/>
+      <w:r>
+        <w:rPr>
+          <w:rFonts w:ascii="Times New Roman" w:hAnsi="Times New Roman" w:cs="Times New Roman"/>
+        </w:rPr>
+        <w:t xml:space="preserve">, citing </w:t>
+      </w:r>
+      <w:proofErr w:type="gramStart"/>
+      <w:r>
+        <w:rPr>
+          <w:rFonts w:ascii="Times New Roman" w:hAnsi="Times New Roman" w:cs="Times New Roman"/>
+        </w:rPr>
+        <w:t>8</w:t>
+      </w:r>
+      <w:proofErr w:type="gramEnd"/>
+      <w:r>
+        <w:rPr>
+          <w:rFonts w:ascii="Times New Roman" w:hAnsi="Times New Roman" w:cs="Times New Roman"/>
+        </w:rPr>
+        <w:t xml:space="preserve"> characters as the bare minimum for this use case. It also said that it is vital that the software used to hash the passwords uses a Cryptographically Secure Pseudo-Random Number Generator (CSPRNG) for the system to work as required.</w:t>
       </w:r>
     </w:p>
     <w:p>
@@ -5827,7 +6843,49 @@
           <w:rFonts w:ascii="Times New Roman" w:hAnsi="Times New Roman" w:cs="Times New Roman"/>
         </w:rPr>
         <w:tab/>
-        <w:t>For a datacenter handling 200 employees, the most effective approach is Salted Hashing using Argon2id. This method is the modern gold standard because it provides robust protection against brute-force and hardware-accelerated attacks while maintaining the "zero-lag" performance required for a smooth user experience. By storing a unique, non-reversible hash rather than an encrypted password, the datacenter ensures that even if the database is compromised, the actual passwords remain unreadable. For an 8-character requirement, this approach provides the necessary security depth without requiring expensive infrastructure or causing noticeable login delays. (Gemini, 2026)</w:t>
+        <w:t xml:space="preserve">For a datacenter </w:t>
+      </w:r>
+      <w:proofErr w:type="gramStart"/>
+      <w:r>
+        <w:rPr>
+          <w:rFonts w:ascii="Times New Roman" w:hAnsi="Times New Roman" w:cs="Times New Roman"/>
+        </w:rPr>
+        <w:t>handling</w:t>
+      </w:r>
+      <w:proofErr w:type="gramEnd"/>
+      <w:r>
+        <w:rPr>
+          <w:rFonts w:ascii="Times New Roman" w:hAnsi="Times New Roman" w:cs="Times New Roman"/>
+        </w:rPr>
+        <w:t xml:space="preserve"> </w:t>
+      </w:r>
+      <w:proofErr w:type="gramStart"/>
+      <w:r>
+        <w:rPr>
+          <w:rFonts w:ascii="Times New Roman" w:hAnsi="Times New Roman" w:cs="Times New Roman"/>
+        </w:rPr>
+        <w:t>200</w:t>
+      </w:r>
+      <w:proofErr w:type="gramEnd"/>
+      <w:r>
+        <w:rPr>
+          <w:rFonts w:ascii="Times New Roman" w:hAnsi="Times New Roman" w:cs="Times New Roman"/>
+        </w:rPr>
+        <w:t xml:space="preserve"> employees, the most effective approach is Salted Hashing using Argon2id. This method is the modern gold standard because it provides robust protection against brute-force and hardware-accelerated attacks while maintaining the "zero-lag" performance required for a smooth user experience. By storing a unique, non-reversible hash rather than an encrypted password, the datacenter ensures that even if the database </w:t>
+      </w:r>
+      <w:proofErr w:type="gramStart"/>
+      <w:r>
+        <w:rPr>
+          <w:rFonts w:ascii="Times New Roman" w:hAnsi="Times New Roman" w:cs="Times New Roman"/>
+        </w:rPr>
+        <w:t>is compromised</w:t>
+      </w:r>
+      <w:proofErr w:type="gramEnd"/>
+      <w:r>
+        <w:rPr>
+          <w:rFonts w:ascii="Times New Roman" w:hAnsi="Times New Roman" w:cs="Times New Roman"/>
+        </w:rPr>
+        <w:t>, the actual passwords remain unreadable. For an 8-character requirement, this approach provides the necessary security depth without requiring expensive infrastructure or causing noticeable login delays. (Gemini, 2026)</w:t>
       </w:r>
     </w:p>
     <w:p>
@@ -5873,7 +6931,35 @@
         <w:rPr>
           <w:rFonts w:ascii="Times New Roman" w:hAnsi="Times New Roman" w:cs="Times New Roman"/>
         </w:rPr>
-        <w:t xml:space="preserve"> specified requirements as an engineer would to determine what tradeoffs must be made, while maintaining compliancy. The following prompt has been designed to represent both selection features and optimization strategies.</w:t>
+        <w:t xml:space="preserve"> specified requirements as an engineer would to determine what tradeoffs must </w:t>
+      </w:r>
+      <w:proofErr w:type="gramStart"/>
+      <w:r>
+        <w:rPr>
+          <w:rFonts w:ascii="Times New Roman" w:hAnsi="Times New Roman" w:cs="Times New Roman"/>
+        </w:rPr>
+        <w:t>be made</w:t>
+      </w:r>
+      <w:proofErr w:type="gramEnd"/>
+      <w:r>
+        <w:rPr>
+          <w:rFonts w:ascii="Times New Roman" w:hAnsi="Times New Roman" w:cs="Times New Roman"/>
+        </w:rPr>
+        <w:t xml:space="preserve">, while maintaining compliancy. The following prompt has </w:t>
+      </w:r>
+      <w:proofErr w:type="gramStart"/>
+      <w:r>
+        <w:rPr>
+          <w:rFonts w:ascii="Times New Roman" w:hAnsi="Times New Roman" w:cs="Times New Roman"/>
+        </w:rPr>
+        <w:t>been designed</w:t>
+      </w:r>
+      <w:proofErr w:type="gramEnd"/>
+      <w:r>
+        <w:rPr>
+          <w:rFonts w:ascii="Times New Roman" w:hAnsi="Times New Roman" w:cs="Times New Roman"/>
+        </w:rPr>
+        <w:t xml:space="preserve"> to represent both selection features and optimization strategies.</w:t>
       </w:r>
     </w:p>
     <w:p>
@@ -5908,7 +6994,49 @@
         <w:rPr>
           <w:rFonts w:ascii="Times New Roman" w:hAnsi="Times New Roman" w:cs="Times New Roman"/>
         </w:rPr>
-        <w:t>A system must encrypt 5GB of data per hour on limited hardware. High security is required, but latency must remain under 200ms per transaction. Which encryption approach should be used and how can it be optimized?</w:t>
+        <w:t xml:space="preserve">A system must encrypt 5GB of data per hour on limited hardware. High security </w:t>
+      </w:r>
+      <w:proofErr w:type="gramStart"/>
+      <w:r>
+        <w:rPr>
+          <w:rFonts w:ascii="Times New Roman" w:hAnsi="Times New Roman" w:cs="Times New Roman"/>
+        </w:rPr>
+        <w:t>is required</w:t>
+      </w:r>
+      <w:proofErr w:type="gramEnd"/>
+      <w:r>
+        <w:rPr>
+          <w:rFonts w:ascii="Times New Roman" w:hAnsi="Times New Roman" w:cs="Times New Roman"/>
+        </w:rPr>
+        <w:t xml:space="preserve">, but latency must remain under 200ms per transaction. Which encryption approach should </w:t>
+      </w:r>
+      <w:proofErr w:type="gramStart"/>
+      <w:r>
+        <w:rPr>
+          <w:rFonts w:ascii="Times New Roman" w:hAnsi="Times New Roman" w:cs="Times New Roman"/>
+        </w:rPr>
+        <w:t>be used</w:t>
+      </w:r>
+      <w:proofErr w:type="gramEnd"/>
+      <w:r>
+        <w:rPr>
+          <w:rFonts w:ascii="Times New Roman" w:hAnsi="Times New Roman" w:cs="Times New Roman"/>
+        </w:rPr>
+        <w:t xml:space="preserve"> and how can it </w:t>
+      </w:r>
+      <w:proofErr w:type="gramStart"/>
+      <w:r>
+        <w:rPr>
+          <w:rFonts w:ascii="Times New Roman" w:hAnsi="Times New Roman" w:cs="Times New Roman"/>
+        </w:rPr>
+        <w:t>be optimized</w:t>
+      </w:r>
+      <w:proofErr w:type="gramEnd"/>
+      <w:r>
+        <w:rPr>
+          <w:rFonts w:ascii="Times New Roman" w:hAnsi="Times New Roman" w:cs="Times New Roman"/>
+        </w:rPr>
+        <w:t>?</w:t>
       </w:r>
     </w:p>
     <w:p>
@@ -5940,7 +7068,21 @@
         <w:rPr>
           <w:rFonts w:ascii="Times New Roman" w:hAnsi="Times New Roman" w:cs="Times New Roman"/>
         </w:rPr>
-        <w:t>Security: AES-GCM is virtually unbreakable by brute force</w:t>
+        <w:t xml:space="preserve">Security: AES-GCM is </w:t>
+      </w:r>
+      <w:proofErr w:type="gramStart"/>
+      <w:r>
+        <w:rPr>
+          <w:rFonts w:ascii="Times New Roman" w:hAnsi="Times New Roman" w:cs="Times New Roman"/>
+        </w:rPr>
+        <w:t>virtually unbreakable</w:t>
+      </w:r>
+      <w:proofErr w:type="gramEnd"/>
+      <w:r>
+        <w:rPr>
+          <w:rFonts w:ascii="Times New Roman" w:hAnsi="Times New Roman" w:cs="Times New Roman"/>
+        </w:rPr>
+        <w:t xml:space="preserve"> by brute force</w:t>
       </w:r>
     </w:p>
     <w:p>
@@ -6149,7 +7291,21 @@
         <w:rPr>
           <w:rFonts w:ascii="Times New Roman" w:hAnsi="Times New Roman" w:cs="Times New Roman"/>
         </w:rPr>
-        <w:t xml:space="preserve"> focused on specific time complexity. This section will test AI’s ability to produce solutions that meet a certain computational time requirement.</w:t>
+        <w:t xml:space="preserve"> focused on specific time complexity. This section will </w:t>
+      </w:r>
+      <w:proofErr w:type="gramStart"/>
+      <w:r>
+        <w:rPr>
+          <w:rFonts w:ascii="Times New Roman" w:hAnsi="Times New Roman" w:cs="Times New Roman"/>
+        </w:rPr>
+        <w:t>test</w:t>
+      </w:r>
+      <w:proofErr w:type="gramEnd"/>
+      <w:r>
+        <w:rPr>
+          <w:rFonts w:ascii="Times New Roman" w:hAnsi="Times New Roman" w:cs="Times New Roman"/>
+        </w:rPr>
+        <w:t xml:space="preserve"> AI’s ability to produce solutions that meet a certain computational time requirement.</w:t>
       </w:r>
     </w:p>
     <w:p>
@@ -6655,7 +7811,21 @@
         <w:rPr>
           <w:rFonts w:ascii="Times New Roman" w:hAnsi="Times New Roman" w:cs="Times New Roman"/>
         </w:rPr>
-        <w:t>The figure below demonstrates the output of the code generated by Google Gemini. Code will be included upon submission.</w:t>
+        <w:t xml:space="preserve">The figure below demonstrates the output of the code generated by Google Gemini. Code will </w:t>
+      </w:r>
+      <w:proofErr w:type="gramStart"/>
+      <w:r>
+        <w:rPr>
+          <w:rFonts w:ascii="Times New Roman" w:hAnsi="Times New Roman" w:cs="Times New Roman"/>
+        </w:rPr>
+        <w:t>be included</w:t>
+      </w:r>
+      <w:proofErr w:type="gramEnd"/>
+      <w:r>
+        <w:rPr>
+          <w:rFonts w:ascii="Times New Roman" w:hAnsi="Times New Roman" w:cs="Times New Roman"/>
+        </w:rPr>
+        <w:t xml:space="preserve"> upon submission.</w:t>
       </w:r>
     </w:p>
     <w:p>
@@ -6783,20 +7953,42 @@
         <w:rPr>
           <w:rFonts w:ascii="Times New Roman" w:hAnsi="Times New Roman" w:cs="Times New Roman"/>
         </w:rPr>
-        <w:t xml:space="preserve"> making it computationally expensive to try to crack it (key stretching). To achieve this, Memory-Hard Functions should be used, which resist specialized hardware such as ASICs or GPUs, by requiring a large amount of RAM to compute. Gemini recommended the algorithm Argon2id, and using a Hash Tree structure, not hashing the whole file as one block. Parameters can be set such that a single hash takes ~0.5 to 1 second to complete.</w:t>
-      </w:r>
-    </w:p>
-    <w:p>
-      <w:pPr>
-        <w:rPr>
-          <w:rFonts w:ascii="Times New Roman" w:hAnsi="Times New Roman" w:cs="Times New Roman"/>
-        </w:rPr>
-      </w:pPr>
-      <w:r>
-        <w:rPr>
-          <w:rFonts w:ascii="Times New Roman" w:hAnsi="Times New Roman" w:cs="Times New Roman"/>
-        </w:rPr>
-        <w:t>The following table was given by Gemini as an overview of each component of the system:</w:t>
+        <w:t xml:space="preserve"> making it computationally expensive to try to crack it (key stretching). To achieve this, Memory-Hard Functions should </w:t>
+      </w:r>
+      <w:proofErr w:type="gramStart"/>
+      <w:r>
+        <w:rPr>
+          <w:rFonts w:ascii="Times New Roman" w:hAnsi="Times New Roman" w:cs="Times New Roman"/>
+        </w:rPr>
+        <w:t>be used</w:t>
+      </w:r>
+      <w:proofErr w:type="gramEnd"/>
+      <w:r>
+        <w:rPr>
+          <w:rFonts w:ascii="Times New Roman" w:hAnsi="Times New Roman" w:cs="Times New Roman"/>
+        </w:rPr>
+        <w:t>, which resist specialized hardware such as ASICs or GPUs, by requiring a large amount of RAM to compute. Gemini recommended the algorithm Argon2id, and using a Hash Tree structure, not hashing the whole file as one block. Parameters can be set such that a single hash takes ~0.5 to 1 second to complete.</w:t>
+      </w:r>
+    </w:p>
+    <w:p>
+      <w:pPr>
+        <w:rPr>
+          <w:rFonts w:ascii="Times New Roman" w:hAnsi="Times New Roman" w:cs="Times New Roman"/>
+        </w:rPr>
+      </w:pPr>
+      <w:proofErr w:type="gramStart"/>
+      <w:r>
+        <w:rPr>
+          <w:rFonts w:ascii="Times New Roman" w:hAnsi="Times New Roman" w:cs="Times New Roman"/>
+        </w:rPr>
+        <w:t>The following table was given by Gemini</w:t>
+      </w:r>
+      <w:proofErr w:type="gramEnd"/>
+      <w:r>
+        <w:rPr>
+          <w:rFonts w:ascii="Times New Roman" w:hAnsi="Times New Roman" w:cs="Times New Roman"/>
+        </w:rPr>
+        <w:t xml:space="preserve"> as an overview of each component of the system:</w:t>
       </w:r>
     </w:p>
     <w:tbl>
@@ -7265,7 +8457,35 @@
           <w:rFonts w:ascii="Times New Roman" w:hAnsi="Times New Roman" w:cs="Times New Roman"/>
         </w:rPr>
         <w:lastRenderedPageBreak/>
-        <w:t>The architecture around the function was presented by Gemini as the real source of security, beyond the function used. Gemini is quoted below:</w:t>
+        <w:t xml:space="preserve">The architecture around the function </w:t>
+      </w:r>
+      <w:proofErr w:type="gramStart"/>
+      <w:r>
+        <w:rPr>
+          <w:rFonts w:ascii="Times New Roman" w:hAnsi="Times New Roman" w:cs="Times New Roman"/>
+        </w:rPr>
+        <w:t>was presented</w:t>
+      </w:r>
+      <w:proofErr w:type="gramEnd"/>
+      <w:r>
+        <w:rPr>
+          <w:rFonts w:ascii="Times New Roman" w:hAnsi="Times New Roman" w:cs="Times New Roman"/>
+        </w:rPr>
+        <w:t xml:space="preserve"> by Gemini as the real source of security, beyond the function used. Gemini </w:t>
+      </w:r>
+      <w:proofErr w:type="gramStart"/>
+      <w:r>
+        <w:rPr>
+          <w:rFonts w:ascii="Times New Roman" w:hAnsi="Times New Roman" w:cs="Times New Roman"/>
+        </w:rPr>
+        <w:t>is quoted</w:t>
+      </w:r>
+      <w:proofErr w:type="gramEnd"/>
+      <w:r>
+        <w:rPr>
+          <w:rFonts w:ascii="Times New Roman" w:hAnsi="Times New Roman" w:cs="Times New Roman"/>
+        </w:rPr>
+        <w:t xml:space="preserve"> below:</w:t>
       </w:r>
     </w:p>
     <w:p>
@@ -7292,7 +8512,35 @@
         <w:rPr>
           <w:rFonts w:ascii="Times New Roman" w:hAnsi="Times New Roman" w:cs="Times New Roman"/>
         </w:rPr>
-        <w:t xml:space="preserve"> In addition to a salt, use a "pepper"—a secret key stored in a Hardware Security Module (HSM) or a separate vault. Even if the database is leaked, the hashes cannot be computed without this secret.</w:t>
+        <w:t xml:space="preserve"> In addition to a salt, use a "pepper"—a secret key stored in a Hardware Security Module (HSM) or a separate vault. Even if the database </w:t>
+      </w:r>
+      <w:proofErr w:type="gramStart"/>
+      <w:r>
+        <w:rPr>
+          <w:rFonts w:ascii="Times New Roman" w:hAnsi="Times New Roman" w:cs="Times New Roman"/>
+        </w:rPr>
+        <w:t>is leaked</w:t>
+      </w:r>
+      <w:proofErr w:type="gramEnd"/>
+      <w:r>
+        <w:rPr>
+          <w:rFonts w:ascii="Times New Roman" w:hAnsi="Times New Roman" w:cs="Times New Roman"/>
+        </w:rPr>
+        <w:t xml:space="preserve">, the hashes cannot </w:t>
+      </w:r>
+      <w:proofErr w:type="gramStart"/>
+      <w:r>
+        <w:rPr>
+          <w:rFonts w:ascii="Times New Roman" w:hAnsi="Times New Roman" w:cs="Times New Roman"/>
+        </w:rPr>
+        <w:t>be computed</w:t>
+      </w:r>
+      <w:proofErr w:type="gramEnd"/>
+      <w:r>
+        <w:rPr>
+          <w:rFonts w:ascii="Times New Roman" w:hAnsi="Times New Roman" w:cs="Times New Roman"/>
+        </w:rPr>
+        <w:t xml:space="preserve"> without this secret.</w:t>
       </w:r>
     </w:p>
     <w:p>
@@ -7429,7 +8677,49 @@
         <w:rPr>
           <w:rFonts w:ascii="Times New Roman" w:hAnsi="Times New Roman" w:cs="Times New Roman"/>
         </w:rPr>
-        <w:t xml:space="preserve"> its response. The AI model may be intentionally tuned to use as few tokens as possible while still providing a correct response, rather than exhaustively explaining that response. In addition, Gemini did not by itself provide a summary overview of its solution, and a second prompt was required for each problem, specifically asking for the answer to be summarized into a clear, easy to understand paragraph.</w:t>
+        <w:t xml:space="preserve"> its response. The AI model may </w:t>
+      </w:r>
+      <w:proofErr w:type="gramStart"/>
+      <w:r>
+        <w:rPr>
+          <w:rFonts w:ascii="Times New Roman" w:hAnsi="Times New Roman" w:cs="Times New Roman"/>
+        </w:rPr>
+        <w:t>be intentionally tuned</w:t>
+      </w:r>
+      <w:proofErr w:type="gramEnd"/>
+      <w:r>
+        <w:rPr>
+          <w:rFonts w:ascii="Times New Roman" w:hAnsi="Times New Roman" w:cs="Times New Roman"/>
+        </w:rPr>
+        <w:t xml:space="preserve"> to use as few tokens as possible while still providing a correct response, rather than exhaustively explaining that response. In addition, Gemini did not by itself provide a summary overview of its solution, and a second prompt </w:t>
+      </w:r>
+      <w:proofErr w:type="gramStart"/>
+      <w:r>
+        <w:rPr>
+          <w:rFonts w:ascii="Times New Roman" w:hAnsi="Times New Roman" w:cs="Times New Roman"/>
+        </w:rPr>
+        <w:t>was required</w:t>
+      </w:r>
+      <w:proofErr w:type="gramEnd"/>
+      <w:r>
+        <w:rPr>
+          <w:rFonts w:ascii="Times New Roman" w:hAnsi="Times New Roman" w:cs="Times New Roman"/>
+        </w:rPr>
+        <w:t xml:space="preserve"> for each problem, specifically asking for the answer to </w:t>
+      </w:r>
+      <w:proofErr w:type="gramStart"/>
+      <w:r>
+        <w:rPr>
+          <w:rFonts w:ascii="Times New Roman" w:hAnsi="Times New Roman" w:cs="Times New Roman"/>
+        </w:rPr>
+        <w:t>be summarized</w:t>
+      </w:r>
+      <w:proofErr w:type="gramEnd"/>
+      <w:r>
+        <w:rPr>
+          <w:rFonts w:ascii="Times New Roman" w:hAnsi="Times New Roman" w:cs="Times New Roman"/>
+        </w:rPr>
+        <w:t xml:space="preserve"> into a clear, easy to understand paragraph.</w:t>
       </w:r>
     </w:p>
     <w:p>
@@ -7470,7 +8760,63 @@
           <w:rFonts w:ascii="Times New Roman" w:hAnsi="Times New Roman" w:cs="Times New Roman"/>
         </w:rPr>
         <w:tab/>
-        <w:t>For the third and final AI model, we will prompt Microsoft’s Copilot with the same queries from the four different categories that we used for the other two models. Each prompt will be performed in a new chat to prevent previous memory and history from interfering with the validity or persuasion of the data. Each prompt will be designed with enough information for the model to solve, however, it will be checked for any inflection that would convince the model of a specific solution prior to processing.</w:t>
+        <w:t xml:space="preserve">For the third and final AI model, we will prompt Microsoft’s Copilot with the same queries from the four </w:t>
+      </w:r>
+      <w:proofErr w:type="gramStart"/>
+      <w:r>
+        <w:rPr>
+          <w:rFonts w:ascii="Times New Roman" w:hAnsi="Times New Roman" w:cs="Times New Roman"/>
+        </w:rPr>
+        <w:t>different categories</w:t>
+      </w:r>
+      <w:proofErr w:type="gramEnd"/>
+      <w:r>
+        <w:rPr>
+          <w:rFonts w:ascii="Times New Roman" w:hAnsi="Times New Roman" w:cs="Times New Roman"/>
+        </w:rPr>
+        <w:t xml:space="preserve"> that we used for the other two models. Each prompt will </w:t>
+      </w:r>
+      <w:proofErr w:type="gramStart"/>
+      <w:r>
+        <w:rPr>
+          <w:rFonts w:ascii="Times New Roman" w:hAnsi="Times New Roman" w:cs="Times New Roman"/>
+        </w:rPr>
+        <w:t>be performed</w:t>
+      </w:r>
+      <w:proofErr w:type="gramEnd"/>
+      <w:r>
+        <w:rPr>
+          <w:rFonts w:ascii="Times New Roman" w:hAnsi="Times New Roman" w:cs="Times New Roman"/>
+        </w:rPr>
+        <w:t xml:space="preserve"> in a new chat to prevent previous memory and history from interfering with the validity or persuasion of the data. Each prompt will </w:t>
+      </w:r>
+      <w:proofErr w:type="gramStart"/>
+      <w:r>
+        <w:rPr>
+          <w:rFonts w:ascii="Times New Roman" w:hAnsi="Times New Roman" w:cs="Times New Roman"/>
+        </w:rPr>
+        <w:t>be designed</w:t>
+      </w:r>
+      <w:proofErr w:type="gramEnd"/>
+      <w:r>
+        <w:rPr>
+          <w:rFonts w:ascii="Times New Roman" w:hAnsi="Times New Roman" w:cs="Times New Roman"/>
+        </w:rPr>
+        <w:t xml:space="preserve"> with enough information for the model to solve, however, it will </w:t>
+      </w:r>
+      <w:proofErr w:type="gramStart"/>
+      <w:r>
+        <w:rPr>
+          <w:rFonts w:ascii="Times New Roman" w:hAnsi="Times New Roman" w:cs="Times New Roman"/>
+        </w:rPr>
+        <w:t>be checked</w:t>
+      </w:r>
+      <w:proofErr w:type="gramEnd"/>
+      <w:r>
+        <w:rPr>
+          <w:rFonts w:ascii="Times New Roman" w:hAnsi="Times New Roman" w:cs="Times New Roman"/>
+        </w:rPr>
+        <w:t xml:space="preserve"> for any inflection that would convince the model of a specific solution prior to processing.</w:t>
       </w:r>
     </w:p>
     <w:p>
@@ -7502,7 +8848,21 @@
         <w:rPr>
           <w:rFonts w:ascii="Times New Roman" w:hAnsi="Times New Roman" w:cs="Times New Roman"/>
         </w:rPr>
-        <w:t>This category seeks to answer the question of whether AI can properly choose an encryption algorithm while keeping in mind speed, efficiency, and security.</w:t>
+        <w:t xml:space="preserve">This category seeks to answer the question of whether AI can </w:t>
+      </w:r>
+      <w:proofErr w:type="gramStart"/>
+      <w:r>
+        <w:rPr>
+          <w:rFonts w:ascii="Times New Roman" w:hAnsi="Times New Roman" w:cs="Times New Roman"/>
+        </w:rPr>
+        <w:t>properly choose</w:t>
+      </w:r>
+      <w:proofErr w:type="gramEnd"/>
+      <w:r>
+        <w:rPr>
+          <w:rFonts w:ascii="Times New Roman" w:hAnsi="Times New Roman" w:cs="Times New Roman"/>
+        </w:rPr>
+        <w:t xml:space="preserve"> an encryption algorithm while keeping in mind speed, efficiency, and security.</w:t>
       </w:r>
     </w:p>
     <w:p>
@@ -7540,7 +8900,63 @@
         <w:rPr>
           <w:rFonts w:ascii="Times New Roman" w:hAnsi="Times New Roman" w:cs="Times New Roman"/>
         </w:rPr>
-        <w:t>A datacenter needs to encrypt their employee’s system passwords. The passwords are required to be 8 characters including numbers and special characters. The software needs to encrypt the password upon account creation and verified on relogging in. There needs to be no lag during this process. There are 200 employees in this datacenter that all need accounts. Which encryption approach should be used and why?</w:t>
+        <w:t xml:space="preserve">A datacenter needs to encrypt their employee’s system passwords. The passwords </w:t>
+      </w:r>
+      <w:proofErr w:type="gramStart"/>
+      <w:r>
+        <w:rPr>
+          <w:rFonts w:ascii="Times New Roman" w:hAnsi="Times New Roman" w:cs="Times New Roman"/>
+        </w:rPr>
+        <w:t>are required</w:t>
+      </w:r>
+      <w:proofErr w:type="gramEnd"/>
+      <w:r>
+        <w:rPr>
+          <w:rFonts w:ascii="Times New Roman" w:hAnsi="Times New Roman" w:cs="Times New Roman"/>
+        </w:rPr>
+        <w:t xml:space="preserve"> to be </w:t>
+      </w:r>
+      <w:proofErr w:type="gramStart"/>
+      <w:r>
+        <w:rPr>
+          <w:rFonts w:ascii="Times New Roman" w:hAnsi="Times New Roman" w:cs="Times New Roman"/>
+        </w:rPr>
+        <w:t>8</w:t>
+      </w:r>
+      <w:proofErr w:type="gramEnd"/>
+      <w:r>
+        <w:rPr>
+          <w:rFonts w:ascii="Times New Roman" w:hAnsi="Times New Roman" w:cs="Times New Roman"/>
+        </w:rPr>
+        <w:t xml:space="preserve"> characters including numbers and special characters. The software needs to encrypt the password upon account creation and verified on relogging in. There needs to be no lag during this process. There are </w:t>
+      </w:r>
+      <w:proofErr w:type="gramStart"/>
+      <w:r>
+        <w:rPr>
+          <w:rFonts w:ascii="Times New Roman" w:hAnsi="Times New Roman" w:cs="Times New Roman"/>
+        </w:rPr>
+        <w:t>200</w:t>
+      </w:r>
+      <w:proofErr w:type="gramEnd"/>
+      <w:r>
+        <w:rPr>
+          <w:rFonts w:ascii="Times New Roman" w:hAnsi="Times New Roman" w:cs="Times New Roman"/>
+        </w:rPr>
+        <w:t xml:space="preserve"> employees in this datacenter that all need accounts. Which encryption approach should </w:t>
+      </w:r>
+      <w:proofErr w:type="gramStart"/>
+      <w:r>
+        <w:rPr>
+          <w:rFonts w:ascii="Times New Roman" w:hAnsi="Times New Roman" w:cs="Times New Roman"/>
+        </w:rPr>
+        <w:t>be used</w:t>
+      </w:r>
+      <w:proofErr w:type="gramEnd"/>
+      <w:r>
+        <w:rPr>
+          <w:rFonts w:ascii="Times New Roman" w:hAnsi="Times New Roman" w:cs="Times New Roman"/>
+        </w:rPr>
+        <w:t xml:space="preserve"> and why?</w:t>
       </w:r>
     </w:p>
     <w:p>
@@ -7555,7 +8971,21 @@
           <w:rFonts w:ascii="Times New Roman" w:hAnsi="Times New Roman" w:cs="Times New Roman"/>
         </w:rPr>
         <w:lastRenderedPageBreak/>
-        <w:t>Copilot broke the prompt into many components represented in the table below.</w:t>
+        <w:t xml:space="preserve">Copilot broke the prompt into </w:t>
+      </w:r>
+      <w:proofErr w:type="gramStart"/>
+      <w:r>
+        <w:rPr>
+          <w:rFonts w:ascii="Times New Roman" w:hAnsi="Times New Roman" w:cs="Times New Roman"/>
+        </w:rPr>
+        <w:t>many</w:t>
+      </w:r>
+      <w:proofErr w:type="gramEnd"/>
+      <w:r>
+        <w:rPr>
+          <w:rFonts w:ascii="Times New Roman" w:hAnsi="Times New Roman" w:cs="Times New Roman"/>
+        </w:rPr>
+        <w:t xml:space="preserve"> components represented in the table below.</w:t>
       </w:r>
     </w:p>
     <w:tbl>
@@ -7648,30 +9078,52 @@
               <w:rPr>
                 <w:rFonts w:ascii="Times New Roman" w:eastAsia="Aptos" w:hAnsi="Times New Roman" w:cs="Times New Roman"/>
               </w:rPr>
-              <w:t>• Passwords must be stored securely.</w:t>
-            </w:r>
-          </w:p>
-          <w:p>
-            <w:pPr>
-              <w:spacing w:after="0" w:line="240" w:lineRule="auto"/>
-              <w:rPr>
-                <w:rFonts w:ascii="Times New Roman" w:hAnsi="Times New Roman" w:cs="Times New Roman"/>
-              </w:rPr>
-            </w:pPr>
-          </w:p>
-          <w:p>
-            <w:pPr>
-              <w:spacing w:after="0" w:line="240" w:lineRule="auto"/>
-              <w:rPr>
-                <w:rFonts w:ascii="Times New Roman" w:hAnsi="Times New Roman" w:cs="Times New Roman"/>
-              </w:rPr>
-            </w:pPr>
-            <w:r>
-              <w:rPr>
-                <w:rFonts w:ascii="Times New Roman" w:eastAsia="Aptos" w:hAnsi="Times New Roman" w:cs="Times New Roman"/>
-              </w:rPr>
-              <w:t>• Must support 8</w:t>
-            </w:r>
+              <w:t xml:space="preserve">• Passwords must </w:t>
+            </w:r>
+            <w:proofErr w:type="gramStart"/>
+            <w:r>
+              <w:rPr>
+                <w:rFonts w:ascii="Times New Roman" w:eastAsia="Aptos" w:hAnsi="Times New Roman" w:cs="Times New Roman"/>
+              </w:rPr>
+              <w:t>be stored</w:t>
+            </w:r>
+            <w:proofErr w:type="gramEnd"/>
+            <w:r>
+              <w:rPr>
+                <w:rFonts w:ascii="Times New Roman" w:eastAsia="Aptos" w:hAnsi="Times New Roman" w:cs="Times New Roman"/>
+              </w:rPr>
+              <w:t xml:space="preserve"> securely.</w:t>
+            </w:r>
+          </w:p>
+          <w:p>
+            <w:pPr>
+              <w:spacing w:after="0" w:line="240" w:lineRule="auto"/>
+              <w:rPr>
+                <w:rFonts w:ascii="Times New Roman" w:hAnsi="Times New Roman" w:cs="Times New Roman"/>
+              </w:rPr>
+            </w:pPr>
+          </w:p>
+          <w:p>
+            <w:pPr>
+              <w:spacing w:after="0" w:line="240" w:lineRule="auto"/>
+              <w:rPr>
+                <w:rFonts w:ascii="Times New Roman" w:hAnsi="Times New Roman" w:cs="Times New Roman"/>
+              </w:rPr>
+            </w:pPr>
+            <w:r>
+              <w:rPr>
+                <w:rFonts w:ascii="Times New Roman" w:eastAsia="Aptos" w:hAnsi="Times New Roman" w:cs="Times New Roman"/>
+              </w:rPr>
+              <w:t xml:space="preserve">• Must support </w:t>
+            </w:r>
+            <w:proofErr w:type="gramStart"/>
+            <w:r>
+              <w:rPr>
+                <w:rFonts w:ascii="Times New Roman" w:eastAsia="Aptos" w:hAnsi="Times New Roman" w:cs="Times New Roman"/>
+              </w:rPr>
+              <w:t>8</w:t>
+            </w:r>
+            <w:proofErr w:type="gramEnd"/>
             <w:r>
               <w:rPr>
                 <w:rFonts w:ascii="Times New Roman" w:eastAsia="Aptos" w:hAnsi="Times New Roman" w:cs="Times New Roman"/>
@@ -7721,7 +9173,21 @@
               <w:rPr>
                 <w:rFonts w:ascii="Times New Roman" w:eastAsia="Aptos" w:hAnsi="Times New Roman" w:cs="Times New Roman"/>
               </w:rPr>
-              <w:t>• System must support 200 employee accounts</w:t>
+              <w:t xml:space="preserve">• System must support </w:t>
+            </w:r>
+            <w:proofErr w:type="gramStart"/>
+            <w:r>
+              <w:rPr>
+                <w:rFonts w:ascii="Times New Roman" w:eastAsia="Aptos" w:hAnsi="Times New Roman" w:cs="Times New Roman"/>
+              </w:rPr>
+              <w:t>200</w:t>
+            </w:r>
+            <w:proofErr w:type="gramEnd"/>
+            <w:r>
+              <w:rPr>
+                <w:rFonts w:ascii="Times New Roman" w:eastAsia="Aptos" w:hAnsi="Times New Roman" w:cs="Times New Roman"/>
+              </w:rPr>
+              <w:t xml:space="preserve"> employee accounts</w:t>
             </w:r>
           </w:p>
         </w:tc>
@@ -7867,7 +9333,20 @@
                 <w:rFonts w:ascii="Times New Roman" w:eastAsia="Aptos" w:hAnsi="Times New Roman" w:cs="Times New Roman"/>
               </w:rPr>
               <w:br/>
-              <w:t xml:space="preserve">1. </w:t>
+            </w:r>
+            <w:proofErr w:type="gramStart"/>
+            <w:r>
+              <w:rPr>
+                <w:rFonts w:ascii="Times New Roman" w:eastAsia="Aptos" w:hAnsi="Times New Roman" w:cs="Times New Roman"/>
+              </w:rPr>
+              <w:t>1</w:t>
+            </w:r>
+            <w:proofErr w:type="gramEnd"/>
+            <w:r>
+              <w:rPr>
+                <w:rFonts w:ascii="Times New Roman" w:eastAsia="Aptos" w:hAnsi="Times New Roman" w:cs="Times New Roman"/>
+              </w:rPr>
+              <w:t xml:space="preserve">. </w:t>
             </w:r>
             <w:proofErr w:type="gramStart"/>
             <w:r>
@@ -7963,7 +9442,20 @@
                 <w:rFonts w:ascii="Times New Roman" w:eastAsia="Aptos" w:hAnsi="Times New Roman" w:cs="Times New Roman"/>
               </w:rPr>
               <w:br/>
-              <w:t xml:space="preserve">1. User enters password. </w:t>
+            </w:r>
+            <w:proofErr w:type="gramStart"/>
+            <w:r>
+              <w:rPr>
+                <w:rFonts w:ascii="Times New Roman" w:eastAsia="Aptos" w:hAnsi="Times New Roman" w:cs="Times New Roman"/>
+              </w:rPr>
+              <w:t>1</w:t>
+            </w:r>
+            <w:proofErr w:type="gramEnd"/>
+            <w:r>
+              <w:rPr>
+                <w:rFonts w:ascii="Times New Roman" w:eastAsia="Aptos" w:hAnsi="Times New Roman" w:cs="Times New Roman"/>
+              </w:rPr>
+              <w:t xml:space="preserve">. User enters password. </w:t>
             </w:r>
             <w:r>
               <w:rPr>
@@ -8097,7 +9589,21 @@
           <w:rFonts w:ascii="Times New Roman" w:hAnsi="Times New Roman" w:cs="Times New Roman"/>
         </w:rPr>
         <w:noBreakHyphen/>
-        <w:t>way password hashing algorithm—preferably Argon2id—because it securely stores passwords without ever needing to decrypt them, protects against modern attacks, and runs fast enough to avoid any noticeable delay for your 200 users. (Copilot, 2026)</w:t>
+        <w:t xml:space="preserve">way password hashing algorithm—preferably Argon2id—because it securely stores passwords without ever needing to decrypt them, protects against modern attacks, and runs fast enough to avoid any noticeable delay for your </w:t>
+      </w:r>
+      <w:proofErr w:type="gramStart"/>
+      <w:r>
+        <w:rPr>
+          <w:rFonts w:ascii="Times New Roman" w:hAnsi="Times New Roman" w:cs="Times New Roman"/>
+        </w:rPr>
+        <w:t>200</w:t>
+      </w:r>
+      <w:proofErr w:type="gramEnd"/>
+      <w:r>
+        <w:rPr>
+          <w:rFonts w:ascii="Times New Roman" w:hAnsi="Times New Roman" w:cs="Times New Roman"/>
+        </w:rPr>
+        <w:t xml:space="preserve"> users. (Copilot, 2026)</w:t>
       </w:r>
     </w:p>
     <w:p>
@@ -8150,7 +9656,35 @@
         <w:rPr>
           <w:rFonts w:ascii="Times New Roman" w:hAnsi="Times New Roman" w:cs="Times New Roman"/>
         </w:rPr>
-        <w:t xml:space="preserve"> specified requirements as an engineer would to determine what tradeoffs must be made, while maintaining compliancy. The following prompt has been designed to represent both selection features and optimization strategies.</w:t>
+        <w:t xml:space="preserve"> specified requirements as an engineer would to determine what tradeoffs must </w:t>
+      </w:r>
+      <w:proofErr w:type="gramStart"/>
+      <w:r>
+        <w:rPr>
+          <w:rFonts w:ascii="Times New Roman" w:hAnsi="Times New Roman" w:cs="Times New Roman"/>
+        </w:rPr>
+        <w:t>be made</w:t>
+      </w:r>
+      <w:proofErr w:type="gramEnd"/>
+      <w:r>
+        <w:rPr>
+          <w:rFonts w:ascii="Times New Roman" w:hAnsi="Times New Roman" w:cs="Times New Roman"/>
+        </w:rPr>
+        <w:t xml:space="preserve">, while maintaining compliancy. The following prompt has </w:t>
+      </w:r>
+      <w:proofErr w:type="gramStart"/>
+      <w:r>
+        <w:rPr>
+          <w:rFonts w:ascii="Times New Roman" w:hAnsi="Times New Roman" w:cs="Times New Roman"/>
+        </w:rPr>
+        <w:t>been designed</w:t>
+      </w:r>
+      <w:proofErr w:type="gramEnd"/>
+      <w:r>
+        <w:rPr>
+          <w:rFonts w:ascii="Times New Roman" w:hAnsi="Times New Roman" w:cs="Times New Roman"/>
+        </w:rPr>
+        <w:t xml:space="preserve"> to represent both selection features and optimization strategies.</w:t>
       </w:r>
     </w:p>
     <w:p>
@@ -8188,7 +9722,49 @@
         <w:rPr>
           <w:rFonts w:ascii="Times New Roman" w:hAnsi="Times New Roman" w:cs="Times New Roman"/>
         </w:rPr>
-        <w:t>A system must encrypt 5GB of data per hour on limited hardware. High security is required, but latency must remain under 200ms per transaction. Which encryption approach should be used and how can it be optimized?</w:t>
+        <w:t xml:space="preserve">A system must encrypt 5GB of data per hour on limited hardware. High security </w:t>
+      </w:r>
+      <w:proofErr w:type="gramStart"/>
+      <w:r>
+        <w:rPr>
+          <w:rFonts w:ascii="Times New Roman" w:hAnsi="Times New Roman" w:cs="Times New Roman"/>
+        </w:rPr>
+        <w:t>is required</w:t>
+      </w:r>
+      <w:proofErr w:type="gramEnd"/>
+      <w:r>
+        <w:rPr>
+          <w:rFonts w:ascii="Times New Roman" w:hAnsi="Times New Roman" w:cs="Times New Roman"/>
+        </w:rPr>
+        <w:t xml:space="preserve">, but latency must remain under 200ms per transaction. Which encryption approach should </w:t>
+      </w:r>
+      <w:proofErr w:type="gramStart"/>
+      <w:r>
+        <w:rPr>
+          <w:rFonts w:ascii="Times New Roman" w:hAnsi="Times New Roman" w:cs="Times New Roman"/>
+        </w:rPr>
+        <w:t>be used</w:t>
+      </w:r>
+      <w:proofErr w:type="gramEnd"/>
+      <w:r>
+        <w:rPr>
+          <w:rFonts w:ascii="Times New Roman" w:hAnsi="Times New Roman" w:cs="Times New Roman"/>
+        </w:rPr>
+        <w:t xml:space="preserve"> and how can it </w:t>
+      </w:r>
+      <w:proofErr w:type="gramStart"/>
+      <w:r>
+        <w:rPr>
+          <w:rFonts w:ascii="Times New Roman" w:hAnsi="Times New Roman" w:cs="Times New Roman"/>
+        </w:rPr>
+        <w:t>be optimized</w:t>
+      </w:r>
+      <w:proofErr w:type="gramEnd"/>
+      <w:r>
+        <w:rPr>
+          <w:rFonts w:ascii="Times New Roman" w:hAnsi="Times New Roman" w:cs="Times New Roman"/>
+        </w:rPr>
+        <w:t>?</w:t>
       </w:r>
     </w:p>
     <w:p>
@@ -8202,7 +9778,21 @@
         <w:rPr>
           <w:rFonts w:ascii="Times New Roman" w:hAnsi="Times New Roman" w:cs="Times New Roman"/>
         </w:rPr>
-        <w:t>Copilot broke the prompt into many components represented in the table below.</w:t>
+        <w:t xml:space="preserve">Copilot broke the prompt into </w:t>
+      </w:r>
+      <w:proofErr w:type="gramStart"/>
+      <w:r>
+        <w:rPr>
+          <w:rFonts w:ascii="Times New Roman" w:hAnsi="Times New Roman" w:cs="Times New Roman"/>
+        </w:rPr>
+        <w:t>many</w:t>
+      </w:r>
+      <w:proofErr w:type="gramEnd"/>
+      <w:r>
+        <w:rPr>
+          <w:rFonts w:ascii="Times New Roman" w:hAnsi="Times New Roman" w:cs="Times New Roman"/>
+        </w:rPr>
+        <w:t xml:space="preserve"> components represented in the table below.</w:t>
       </w:r>
     </w:p>
     <w:tbl>
@@ -8587,7 +10177,21 @@
                 <w:rFonts w:ascii="Times New Roman" w:eastAsia="Aptos" w:hAnsi="Times New Roman" w:cs="Times New Roman"/>
               </w:rPr>
               <w:noBreakHyphen/>
-              <w:t xml:space="preserve">NI, ARM Crypto Extensions, etc.) when available </w:t>
+              <w:t xml:space="preserve">NI, ARM Crypto Extensions, </w:t>
+            </w:r>
+            <w:proofErr w:type="gramStart"/>
+            <w:r>
+              <w:rPr>
+                <w:rFonts w:ascii="Times New Roman" w:eastAsia="Aptos" w:hAnsi="Times New Roman" w:cs="Times New Roman"/>
+              </w:rPr>
+              <w:t>etc.</w:t>
+            </w:r>
+            <w:proofErr w:type="gramEnd"/>
+            <w:r>
+              <w:rPr>
+                <w:rFonts w:ascii="Times New Roman" w:eastAsia="Aptos" w:hAnsi="Times New Roman" w:cs="Times New Roman"/>
+              </w:rPr>
+              <w:t xml:space="preserve">) when available </w:t>
             </w:r>
           </w:p>
           <w:p>
@@ -8782,7 +10386,21 @@
           <w:rFonts w:ascii="Times New Roman" w:hAnsi="Times New Roman" w:cs="Times New Roman"/>
         </w:rPr>
         <w:noBreakHyphen/>
-        <w:t>Poly1305 when AES acceleration is unavailable). By combining this with streaming encryption, hardware acceleration, and lightweight key/IV management, the system easily stays within the 200 </w:t>
+        <w:t xml:space="preserve">Poly1305 when AES acceleration is unavailable). By combining this with streaming encryption, hardware acceleration, and lightweight key/IV management, the system easily stays within the </w:t>
+      </w:r>
+      <w:proofErr w:type="gramStart"/>
+      <w:r>
+        <w:rPr>
+          <w:rFonts w:ascii="Times New Roman" w:hAnsi="Times New Roman" w:cs="Times New Roman"/>
+        </w:rPr>
+        <w:t>200</w:t>
+      </w:r>
+      <w:proofErr w:type="gramEnd"/>
+      <w:r>
+        <w:rPr>
+          <w:rFonts w:ascii="Times New Roman" w:hAnsi="Times New Roman" w:cs="Times New Roman"/>
+        </w:rPr>
+        <w:t> </w:t>
       </w:r>
       <w:proofErr w:type="spellStart"/>
       <w:r>
@@ -8841,7 +10459,21 @@
         <w:rPr>
           <w:rFonts w:ascii="Times New Roman" w:hAnsi="Times New Roman" w:cs="Times New Roman"/>
         </w:rPr>
-        <w:t xml:space="preserve"> focused on specific time complexity. This section will test AI’s ability to produce solutions that meet a certain computational time requirement.</w:t>
+        <w:t xml:space="preserve"> focused on specific time complexity. This section will </w:t>
+      </w:r>
+      <w:proofErr w:type="gramStart"/>
+      <w:r>
+        <w:rPr>
+          <w:rFonts w:ascii="Times New Roman" w:hAnsi="Times New Roman" w:cs="Times New Roman"/>
+        </w:rPr>
+        <w:t>test</w:t>
+      </w:r>
+      <w:proofErr w:type="gramEnd"/>
+      <w:r>
+        <w:rPr>
+          <w:rFonts w:ascii="Times New Roman" w:hAnsi="Times New Roman" w:cs="Times New Roman"/>
+        </w:rPr>
+        <w:t xml:space="preserve"> AI’s ability to produce solutions that meet a certain computational time requirement.</w:t>
       </w:r>
     </w:p>
     <w:p>
@@ -8977,8 +10609,16 @@
               <w:rPr>
                 <w:rFonts w:ascii="Times New Roman" w:eastAsia="Aptos" w:hAnsi="Times New Roman" w:cs="Times New Roman"/>
               </w:rPr>
-              <w:t>Convert to bytes</w:t>
-            </w:r>
+              <w:t xml:space="preserve">Convert to </w:t>
+            </w:r>
+            <w:proofErr w:type="gramStart"/>
+            <w:r>
+              <w:rPr>
+                <w:rFonts w:ascii="Times New Roman" w:eastAsia="Aptos" w:hAnsi="Times New Roman" w:cs="Times New Roman"/>
+              </w:rPr>
+              <w:t>bytes</w:t>
+            </w:r>
+            <w:proofErr w:type="gramEnd"/>
           </w:p>
           <w:p>
             <w:pPr>
@@ -9004,8 +10644,16 @@
                 <w:rFonts w:ascii="Times New Roman" w:eastAsia="Aptos" w:hAnsi="Times New Roman" w:cs="Times New Roman"/>
               </w:rPr>
               <w:noBreakHyphen/>
-              <w:t>256 hash → always 32</w:t>
-            </w:r>
+              <w:t xml:space="preserve">256 hash → always </w:t>
+            </w:r>
+            <w:proofErr w:type="gramStart"/>
+            <w:r>
+              <w:rPr>
+                <w:rFonts w:ascii="Times New Roman" w:eastAsia="Aptos" w:hAnsi="Times New Roman" w:cs="Times New Roman"/>
+              </w:rPr>
+              <w:t>32</w:t>
+            </w:r>
+            <w:proofErr w:type="gramEnd"/>
           </w:p>
           <w:p>
             <w:pPr>
@@ -9024,8 +10672,16 @@
               <w:rPr>
                 <w:rFonts w:ascii="Times New Roman" w:eastAsia="Aptos" w:hAnsi="Times New Roman" w:cs="Times New Roman"/>
               </w:rPr>
-              <w:t>Take first 8 bytes of hash → constant</w:t>
-            </w:r>
+              <w:t xml:space="preserve">Take first 8 bytes of hash → </w:t>
+            </w:r>
+            <w:proofErr w:type="gramStart"/>
+            <w:r>
+              <w:rPr>
+                <w:rFonts w:ascii="Times New Roman" w:eastAsia="Aptos" w:hAnsi="Times New Roman" w:cs="Times New Roman"/>
+              </w:rPr>
+              <w:t>constant</w:t>
+            </w:r>
+            <w:proofErr w:type="gramEnd"/>
           </w:p>
           <w:p>
             <w:pPr>
@@ -9044,8 +10700,30 @@
               <w:rPr>
                 <w:rFonts w:ascii="Times New Roman" w:eastAsia="Aptos" w:hAnsi="Times New Roman" w:cs="Times New Roman"/>
               </w:rPr>
-              <w:t>Convert those 8 bytes to hex string</w:t>
-            </w:r>
+              <w:t xml:space="preserve">Convert those </w:t>
+            </w:r>
+            <w:proofErr w:type="gramStart"/>
+            <w:r>
+              <w:rPr>
+                <w:rFonts w:ascii="Times New Roman" w:eastAsia="Aptos" w:hAnsi="Times New Roman" w:cs="Times New Roman"/>
+              </w:rPr>
+              <w:t>8</w:t>
+            </w:r>
+            <w:proofErr w:type="gramEnd"/>
+            <w:r>
+              <w:rPr>
+                <w:rFonts w:ascii="Times New Roman" w:eastAsia="Aptos" w:hAnsi="Times New Roman" w:cs="Times New Roman"/>
+              </w:rPr>
+              <w:t xml:space="preserve"> bytes to hex </w:t>
+            </w:r>
+            <w:proofErr w:type="gramStart"/>
+            <w:r>
+              <w:rPr>
+                <w:rFonts w:ascii="Times New Roman" w:eastAsia="Aptos" w:hAnsi="Times New Roman" w:cs="Times New Roman"/>
+              </w:rPr>
+              <w:t>string</w:t>
+            </w:r>
+            <w:proofErr w:type="gramEnd"/>
           </w:p>
           <w:p>
             <w:pPr>
@@ -9065,8 +10743,16 @@
                 <w:rFonts w:ascii="Times New Roman" w:eastAsia="Aptos" w:hAnsi="Times New Roman" w:cs="Times New Roman"/>
               </w:rPr>
               <w:lastRenderedPageBreak/>
-              <w:t>Runtime does NOT depend on input length</w:t>
-            </w:r>
+              <w:t xml:space="preserve">Runtime does NOT depend on input </w:t>
+            </w:r>
+            <w:proofErr w:type="gramStart"/>
+            <w:r>
+              <w:rPr>
+                <w:rFonts w:ascii="Times New Roman" w:eastAsia="Aptos" w:hAnsi="Times New Roman" w:cs="Times New Roman"/>
+              </w:rPr>
+              <w:t>length</w:t>
+            </w:r>
+            <w:proofErr w:type="gramEnd"/>
           </w:p>
           <w:p>
             <w:pPr>
@@ -9092,15 +10778,31 @@
                 <w:rFonts w:ascii="Times New Roman" w:eastAsia="Aptos" w:hAnsi="Times New Roman" w:cs="Times New Roman"/>
               </w:rPr>
               <w:noBreakHyphen/>
-              <w:t>size 16</w:t>
-            </w:r>
+              <w:t xml:space="preserve">size </w:t>
+            </w:r>
+            <w:proofErr w:type="gramStart"/>
+            <w:r>
+              <w:rPr>
+                <w:rFonts w:ascii="Times New Roman" w:eastAsia="Aptos" w:hAnsi="Times New Roman" w:cs="Times New Roman"/>
+              </w:rPr>
+              <w:t>16</w:t>
+            </w:r>
+            <w:proofErr w:type="gramEnd"/>
             <w:r>
               <w:rPr>
                 <w:rFonts w:ascii="Times New Roman" w:eastAsia="Aptos" w:hAnsi="Times New Roman" w:cs="Times New Roman"/>
               </w:rPr>
               <w:noBreakHyphen/>
-              <w:t>char hex</w:t>
-            </w:r>
+              <w:t xml:space="preserve">char </w:t>
+            </w:r>
+            <w:proofErr w:type="gramStart"/>
+            <w:r>
+              <w:rPr>
+                <w:rFonts w:ascii="Times New Roman" w:eastAsia="Aptos" w:hAnsi="Times New Roman" w:cs="Times New Roman"/>
+              </w:rPr>
+              <w:t>hex</w:t>
+            </w:r>
+            <w:proofErr w:type="gramEnd"/>
           </w:p>
           <w:p>
             <w:pPr>
@@ -9232,7 +10934,34 @@
                 <w:rFonts w:ascii="Times New Roman" w:eastAsia="Aptos" w:hAnsi="Times New Roman" w:cs="Times New Roman"/>
               </w:rPr>
               <w:noBreakHyphen/>
-              <w:t xml:space="preserve">36 integer </w:t>
+            </w:r>
+            <w:proofErr w:type="gramStart"/>
+            <w:r>
+              <w:rPr>
+                <w:rFonts w:ascii="Times New Roman" w:eastAsia="Aptos" w:hAnsi="Times New Roman" w:cs="Times New Roman"/>
+              </w:rPr>
+              <w:t>36</w:t>
+            </w:r>
+            <w:proofErr w:type="gramEnd"/>
+            <w:r>
+              <w:rPr>
+                <w:rFonts w:ascii="Times New Roman" w:eastAsia="Aptos" w:hAnsi="Times New Roman" w:cs="Times New Roman"/>
+              </w:rPr>
+              <w:t xml:space="preserve"> </w:t>
+            </w:r>
+            <w:proofErr w:type="gramStart"/>
+            <w:r>
+              <w:rPr>
+                <w:rFonts w:ascii="Times New Roman" w:eastAsia="Aptos" w:hAnsi="Times New Roman" w:cs="Times New Roman"/>
+              </w:rPr>
+              <w:t>integer</w:t>
+            </w:r>
+            <w:proofErr w:type="gramEnd"/>
+            <w:r>
+              <w:rPr>
+                <w:rFonts w:ascii="Times New Roman" w:eastAsia="Aptos" w:hAnsi="Times New Roman" w:cs="Times New Roman"/>
+              </w:rPr>
+              <w:t xml:space="preserve"> </w:t>
             </w:r>
           </w:p>
           <w:p>
@@ -9252,8 +10981,16 @@
               <w:rPr>
                 <w:rFonts w:ascii="Times New Roman" w:eastAsia="Aptos" w:hAnsi="Times New Roman" w:cs="Times New Roman"/>
               </w:rPr>
-              <w:t>Set exponent</w:t>
-            </w:r>
+              <w:t xml:space="preserve">Set </w:t>
+            </w:r>
+            <w:proofErr w:type="gramStart"/>
+            <w:r>
+              <w:rPr>
+                <w:rFonts w:ascii="Times New Roman" w:eastAsia="Aptos" w:hAnsi="Times New Roman" w:cs="Times New Roman"/>
+              </w:rPr>
+              <w:t>exponent</w:t>
+            </w:r>
+            <w:proofErr w:type="gramEnd"/>
           </w:p>
           <w:p>
             <w:pPr>
@@ -9272,8 +11009,16 @@
               <w:rPr>
                 <w:rFonts w:ascii="Times New Roman" w:eastAsia="Aptos" w:hAnsi="Times New Roman" w:cs="Times New Roman"/>
               </w:rPr>
-              <w:t>Set modulus</w:t>
-            </w:r>
+              <w:t xml:space="preserve">Set </w:t>
+            </w:r>
+            <w:proofErr w:type="gramStart"/>
+            <w:r>
+              <w:rPr>
+                <w:rFonts w:ascii="Times New Roman" w:eastAsia="Aptos" w:hAnsi="Times New Roman" w:cs="Times New Roman"/>
+              </w:rPr>
+              <w:t>modulus</w:t>
+            </w:r>
+            <w:proofErr w:type="gramEnd"/>
           </w:p>
           <w:p>
             <w:pPr>
@@ -9292,7 +11037,21 @@
               <w:rPr>
                 <w:rFonts w:ascii="Times New Roman" w:eastAsia="Aptos" w:hAnsi="Times New Roman" w:cs="Times New Roman"/>
               </w:rPr>
-              <w:t xml:space="preserve">Perform modular exponentiation </w:t>
+              <w:t xml:space="preserve">Perform modular </w:t>
+            </w:r>
+            <w:proofErr w:type="gramStart"/>
+            <w:r>
+              <w:rPr>
+                <w:rFonts w:ascii="Times New Roman" w:eastAsia="Aptos" w:hAnsi="Times New Roman" w:cs="Times New Roman"/>
+              </w:rPr>
+              <w:t>exponentiation</w:t>
+            </w:r>
+            <w:proofErr w:type="gramEnd"/>
+            <w:r>
+              <w:rPr>
+                <w:rFonts w:ascii="Times New Roman" w:eastAsia="Aptos" w:hAnsi="Times New Roman" w:cs="Times New Roman"/>
+              </w:rPr>
+              <w:t xml:space="preserve"> </w:t>
             </w:r>
           </w:p>
           <w:p>
@@ -9313,8 +11072,16 @@
                 <w:rFonts w:ascii="Times New Roman" w:eastAsia="Aptos" w:hAnsi="Times New Roman" w:cs="Times New Roman"/>
               </w:rPr>
               <w:lastRenderedPageBreak/>
-              <w:t>Runtime grows with log of exponent / modulus size</w:t>
-            </w:r>
+              <w:t xml:space="preserve">Runtime grows with log of exponent / modulus </w:t>
+            </w:r>
+            <w:proofErr w:type="gramStart"/>
+            <w:r>
+              <w:rPr>
+                <w:rFonts w:ascii="Times New Roman" w:eastAsia="Aptos" w:hAnsi="Times New Roman" w:cs="Times New Roman"/>
+              </w:rPr>
+              <w:t>size</w:t>
+            </w:r>
+            <w:proofErr w:type="gramEnd"/>
           </w:p>
           <w:p>
             <w:pPr>
@@ -9333,8 +11100,16 @@
               <w:rPr>
                 <w:rFonts w:ascii="Times New Roman" w:eastAsia="Aptos" w:hAnsi="Times New Roman" w:cs="Times New Roman"/>
               </w:rPr>
-              <w:t>Output is an integer within modulus range</w:t>
-            </w:r>
+              <w:t xml:space="preserve">Output is an integer within modulus </w:t>
+            </w:r>
+            <w:proofErr w:type="gramStart"/>
+            <w:r>
+              <w:rPr>
+                <w:rFonts w:ascii="Times New Roman" w:eastAsia="Aptos" w:hAnsi="Times New Roman" w:cs="Times New Roman"/>
+              </w:rPr>
+              <w:t>range</w:t>
+            </w:r>
+            <w:proofErr w:type="gramEnd"/>
           </w:p>
           <w:p>
             <w:pPr>
@@ -9485,21 +11260,57 @@
           <w:rFonts w:ascii="Times New Roman" w:hAnsi="Times New Roman" w:cs="Times New Roman"/>
         </w:rPr>
         <w:noBreakHyphen/>
-        <w:t>256 and truncating the output to a fixed 8</w:t>
-      </w:r>
+        <w:t xml:space="preserve">256 and truncating the output to a fixed </w:t>
+      </w:r>
+      <w:proofErr w:type="gramStart"/>
+      <w:r>
+        <w:rPr>
+          <w:rFonts w:ascii="Times New Roman" w:hAnsi="Times New Roman" w:cs="Times New Roman"/>
+        </w:rPr>
+        <w:t>8</w:t>
+      </w:r>
+      <w:proofErr w:type="gramEnd"/>
       <w:r>
         <w:rPr>
           <w:rFonts w:ascii="Times New Roman" w:hAnsi="Times New Roman" w:cs="Times New Roman"/>
         </w:rPr>
         <w:noBreakHyphen/>
-        <w:t>byte segment, the algorithm ensures consistent performance with no variation based on the length or complexity of the license number. This makes it ideal for systems where timing consistency is critical—such as embedded devices, rapid validation tasks, or scenarios where timing attacks must be avoided. However, because it is based on a one</w:t>
+        <w:t xml:space="preserve">byte segment, the algorithm ensures consistent performance with no variation based on the length or complexity of the license number. This makes it ideal for systems where timing consistency is critical—such as embedded devices, rapid validation tasks, or scenarios where timing attacks must </w:t>
+      </w:r>
+      <w:proofErr w:type="gramStart"/>
+      <w:r>
+        <w:rPr>
+          <w:rFonts w:ascii="Times New Roman" w:hAnsi="Times New Roman" w:cs="Times New Roman"/>
+        </w:rPr>
+        <w:t>be avoided</w:t>
+      </w:r>
+      <w:proofErr w:type="gramEnd"/>
+      <w:r>
+        <w:rPr>
+          <w:rFonts w:ascii="Times New Roman" w:hAnsi="Times New Roman" w:cs="Times New Roman"/>
+        </w:rPr>
+        <w:t>. However, because it is based on a one</w:t>
       </w:r>
       <w:r>
         <w:rPr>
           <w:rFonts w:ascii="Times New Roman" w:hAnsi="Times New Roman" w:cs="Times New Roman"/>
         </w:rPr>
         <w:noBreakHyphen/>
-        <w:t>way hash, this approach cannot be decrypted and is therefore suitable only for irreversible verification rather than recoverable encryption. (Copilot, 2026)</w:t>
+        <w:t xml:space="preserve">way hash, this approach cannot </w:t>
+      </w:r>
+      <w:proofErr w:type="gramStart"/>
+      <w:r>
+        <w:rPr>
+          <w:rFonts w:ascii="Times New Roman" w:hAnsi="Times New Roman" w:cs="Times New Roman"/>
+        </w:rPr>
+        <w:t>be decrypted</w:t>
+      </w:r>
+      <w:proofErr w:type="gramEnd"/>
+      <w:r>
+        <w:rPr>
+          <w:rFonts w:ascii="Times New Roman" w:hAnsi="Times New Roman" w:cs="Times New Roman"/>
+        </w:rPr>
+        <w:t xml:space="preserve"> and is therefore suitable only for irreversible verification rather than recoverable encryption. (Copilot, 2026)</w:t>
       </w:r>
     </w:p>
     <w:p>
@@ -9576,7 +11387,21 @@
         <w:rPr>
           <w:rFonts w:ascii="Times New Roman" w:hAnsi="Times New Roman" w:cs="Times New Roman"/>
         </w:rPr>
-        <w:t xml:space="preserve"> and represents how many real</w:t>
+        <w:t xml:space="preserve"> and represents how </w:t>
+      </w:r>
+      <w:proofErr w:type="gramStart"/>
+      <w:r>
+        <w:rPr>
+          <w:rFonts w:ascii="Times New Roman" w:hAnsi="Times New Roman" w:cs="Times New Roman"/>
+        </w:rPr>
+        <w:t>many</w:t>
+      </w:r>
+      <w:proofErr w:type="gramEnd"/>
+      <w:r>
+        <w:rPr>
+          <w:rFonts w:ascii="Times New Roman" w:hAnsi="Times New Roman" w:cs="Times New Roman"/>
+        </w:rPr>
+        <w:t xml:space="preserve"> real</w:t>
       </w:r>
       <w:r>
         <w:rPr>
@@ -9610,7 +11435,21 @@
         <w:rPr>
           <w:rFonts w:ascii="Times New Roman" w:hAnsi="Times New Roman" w:cs="Times New Roman"/>
         </w:rPr>
-        <w:t>The figure below demonstrates the code generated from Copilot AI model. Code will be included upon submission.</w:t>
+        <w:t xml:space="preserve">The figure below demonstrates the code generated from Copilot AI model. Code will </w:t>
+      </w:r>
+      <w:proofErr w:type="gramStart"/>
+      <w:r>
+        <w:rPr>
+          <w:rFonts w:ascii="Times New Roman" w:hAnsi="Times New Roman" w:cs="Times New Roman"/>
+        </w:rPr>
+        <w:t>be included</w:t>
+      </w:r>
+      <w:proofErr w:type="gramEnd"/>
+      <w:r>
+        <w:rPr>
+          <w:rFonts w:ascii="Times New Roman" w:hAnsi="Times New Roman" w:cs="Times New Roman"/>
+        </w:rPr>
+        <w:t xml:space="preserve"> upon submission.</w:t>
       </w:r>
     </w:p>
     <w:p>
@@ -9702,7 +11541,35 @@
         <w:rPr>
           <w:rFonts w:ascii="Times New Roman" w:hAnsi="Times New Roman" w:cs="Times New Roman"/>
         </w:rPr>
-        <w:t>This section will show how secure the AI generated security solutions are. Since this section is completely focused on the best security the AI model will be prompted to sacrifice computational time for the best security measures.</w:t>
+        <w:t xml:space="preserve">This section will show how secure the AI generated security solutions are. Since this section </w:t>
+      </w:r>
+      <w:proofErr w:type="gramStart"/>
+      <w:r>
+        <w:rPr>
+          <w:rFonts w:ascii="Times New Roman" w:hAnsi="Times New Roman" w:cs="Times New Roman"/>
+        </w:rPr>
+        <w:t>is completely focused</w:t>
+      </w:r>
+      <w:proofErr w:type="gramEnd"/>
+      <w:r>
+        <w:rPr>
+          <w:rFonts w:ascii="Times New Roman" w:hAnsi="Times New Roman" w:cs="Times New Roman"/>
+        </w:rPr>
+        <w:t xml:space="preserve"> on the best security the AI model will </w:t>
+      </w:r>
+      <w:proofErr w:type="gramStart"/>
+      <w:r>
+        <w:rPr>
+          <w:rFonts w:ascii="Times New Roman" w:hAnsi="Times New Roman" w:cs="Times New Roman"/>
+        </w:rPr>
+        <w:t>be prompted</w:t>
+      </w:r>
+      <w:proofErr w:type="gramEnd"/>
+      <w:r>
+        <w:rPr>
+          <w:rFonts w:ascii="Times New Roman" w:hAnsi="Times New Roman" w:cs="Times New Roman"/>
+        </w:rPr>
+        <w:t xml:space="preserve"> to sacrifice computational time for the best security measures.</w:t>
       </w:r>
     </w:p>
     <w:p>
@@ -9738,7 +11605,21 @@
         <w:rPr>
           <w:rFonts w:ascii="Times New Roman" w:hAnsi="Times New Roman" w:cs="Times New Roman"/>
         </w:rPr>
-        <w:t>Copilot broke the prompt into many components represented in the table below.</w:t>
+        <w:t xml:space="preserve">Copilot broke the prompt into </w:t>
+      </w:r>
+      <w:proofErr w:type="gramStart"/>
+      <w:r>
+        <w:rPr>
+          <w:rFonts w:ascii="Times New Roman" w:hAnsi="Times New Roman" w:cs="Times New Roman"/>
+        </w:rPr>
+        <w:t>many</w:t>
+      </w:r>
+      <w:proofErr w:type="gramEnd"/>
+      <w:r>
+        <w:rPr>
+          <w:rFonts w:ascii="Times New Roman" w:hAnsi="Times New Roman" w:cs="Times New Roman"/>
+        </w:rPr>
+        <w:t xml:space="preserve"> components represented in the table below.</w:t>
       </w:r>
     </w:p>
     <w:tbl>
@@ -9899,7 +11780,21 @@
               <w:rPr>
                 <w:rFonts w:ascii="Times New Roman" w:eastAsia="Aptos" w:hAnsi="Times New Roman" w:cs="Times New Roman"/>
               </w:rPr>
-              <w:t>The serialized transaction + salt is hashed with Argon2id using high memory and high iteration parameters.</w:t>
+              <w:t xml:space="preserve">The serialized transaction + salt </w:t>
+            </w:r>
+            <w:proofErr w:type="gramStart"/>
+            <w:r>
+              <w:rPr>
+                <w:rFonts w:ascii="Times New Roman" w:eastAsia="Aptos" w:hAnsi="Times New Roman" w:cs="Times New Roman"/>
+              </w:rPr>
+              <w:t>is hashed</w:t>
+            </w:r>
+            <w:proofErr w:type="gramEnd"/>
+            <w:r>
+              <w:rPr>
+                <w:rFonts w:ascii="Times New Roman" w:eastAsia="Aptos" w:hAnsi="Times New Roman" w:cs="Times New Roman"/>
+              </w:rPr>
+              <w:t xml:space="preserve"> with Argon2id using high memory and high iteration parameters.</w:t>
             </w:r>
           </w:p>
         </w:tc>
@@ -9962,15 +11857,36 @@
               <w:rPr>
                 <w:rFonts w:ascii="Times New Roman" w:eastAsia="Aptos" w:hAnsi="Times New Roman" w:cs="Times New Roman"/>
               </w:rPr>
-              <w:t>Each transaction hash is combined with the previous chain hash using SHA</w:t>
+              <w:t xml:space="preserve">Each transaction hash </w:t>
+            </w:r>
+            <w:proofErr w:type="gramStart"/>
+            <w:r>
+              <w:rPr>
+                <w:rFonts w:ascii="Times New Roman" w:eastAsia="Aptos" w:hAnsi="Times New Roman" w:cs="Times New Roman"/>
+              </w:rPr>
+              <w:t>is combined</w:t>
+            </w:r>
+            <w:proofErr w:type="gramEnd"/>
+            <w:r>
+              <w:rPr>
+                <w:rFonts w:ascii="Times New Roman" w:eastAsia="Aptos" w:hAnsi="Times New Roman" w:cs="Times New Roman"/>
+              </w:rPr>
+              <w:t xml:space="preserve"> with the previous chain hash using SHA</w:t>
             </w:r>
             <w:r>
               <w:rPr>
                 <w:rFonts w:ascii="Times New Roman" w:eastAsia="Aptos" w:hAnsi="Times New Roman" w:cs="Times New Roman"/>
               </w:rPr>
               <w:noBreakHyphen/>
+            </w:r>
+            <w:proofErr w:type="gramStart"/>
+            <w:r>
+              <w:rPr>
+                <w:rFonts w:ascii="Times New Roman" w:eastAsia="Aptos" w:hAnsi="Times New Roman" w:cs="Times New Roman"/>
+              </w:rPr>
               <w:t>3</w:t>
             </w:r>
+            <w:proofErr w:type="gramEnd"/>
             <w:r>
               <w:rPr>
                 <w:rFonts w:ascii="Times New Roman" w:eastAsia="Aptos" w:hAnsi="Times New Roman" w:cs="Times New Roman"/>
@@ -10041,7 +11957,35 @@
               <w:rPr>
                 <w:rFonts w:ascii="Times New Roman" w:eastAsia="Aptos" w:hAnsi="Times New Roman" w:cs="Times New Roman"/>
               </w:rPr>
-              <w:t>, all hashes in that batch are placed into a Merkle tree and the Merkle root is calculated.</w:t>
+              <w:t xml:space="preserve">, all hashes in that batch </w:t>
+            </w:r>
+            <w:proofErr w:type="gramStart"/>
+            <w:r>
+              <w:rPr>
+                <w:rFonts w:ascii="Times New Roman" w:eastAsia="Aptos" w:hAnsi="Times New Roman" w:cs="Times New Roman"/>
+              </w:rPr>
+              <w:t>are placed</w:t>
+            </w:r>
+            <w:proofErr w:type="gramEnd"/>
+            <w:r>
+              <w:rPr>
+                <w:rFonts w:ascii="Times New Roman" w:eastAsia="Aptos" w:hAnsi="Times New Roman" w:cs="Times New Roman"/>
+              </w:rPr>
+              <w:t xml:space="preserve"> into a Merkle tree and the Merkle root </w:t>
+            </w:r>
+            <w:proofErr w:type="gramStart"/>
+            <w:r>
+              <w:rPr>
+                <w:rFonts w:ascii="Times New Roman" w:eastAsia="Aptos" w:hAnsi="Times New Roman" w:cs="Times New Roman"/>
+              </w:rPr>
+              <w:t>is calculated</w:t>
+            </w:r>
+            <w:proofErr w:type="gramEnd"/>
+            <w:r>
+              <w:rPr>
+                <w:rFonts w:ascii="Times New Roman" w:eastAsia="Aptos" w:hAnsi="Times New Roman" w:cs="Times New Roman"/>
+              </w:rPr>
+              <w:t>.</w:t>
             </w:r>
           </w:p>
         </w:tc>
@@ -10092,7 +12036,21 @@
               <w:rPr>
                 <w:rFonts w:ascii="Times New Roman" w:eastAsia="Aptos" w:hAnsi="Times New Roman" w:cs="Times New Roman"/>
               </w:rPr>
-              <w:t>The Merkle root for each batch is stored internally and linked into the chain.</w:t>
+              <w:t xml:space="preserve">The Merkle root for each batch </w:t>
+            </w:r>
+            <w:proofErr w:type="gramStart"/>
+            <w:r>
+              <w:rPr>
+                <w:rFonts w:ascii="Times New Roman" w:eastAsia="Aptos" w:hAnsi="Times New Roman" w:cs="Times New Roman"/>
+              </w:rPr>
+              <w:t>is stored</w:t>
+            </w:r>
+            <w:proofErr w:type="gramEnd"/>
+            <w:r>
+              <w:rPr>
+                <w:rFonts w:ascii="Times New Roman" w:eastAsia="Aptos" w:hAnsi="Times New Roman" w:cs="Times New Roman"/>
+              </w:rPr>
+              <w:t xml:space="preserve"> internally and linked into the chain.</w:t>
             </w:r>
           </w:p>
         </w:tc>
@@ -10143,7 +12101,21 @@
               <w:rPr>
                 <w:rFonts w:ascii="Times New Roman" w:eastAsia="Aptos" w:hAnsi="Times New Roman" w:cs="Times New Roman"/>
               </w:rPr>
-              <w:t>At the end of each day, the latest chain head or Merkle root is published to an external, independent system (e.g., regulator, HSM, or public blockchain).</w:t>
+              <w:t xml:space="preserve">At the end of each day, the latest chain head or Merkle root </w:t>
+            </w:r>
+            <w:proofErr w:type="gramStart"/>
+            <w:r>
+              <w:rPr>
+                <w:rFonts w:ascii="Times New Roman" w:eastAsia="Aptos" w:hAnsi="Times New Roman" w:cs="Times New Roman"/>
+              </w:rPr>
+              <w:t>is published</w:t>
+            </w:r>
+            <w:proofErr w:type="gramEnd"/>
+            <w:r>
+              <w:rPr>
+                <w:rFonts w:ascii="Times New Roman" w:eastAsia="Aptos" w:hAnsi="Times New Roman" w:cs="Times New Roman"/>
+              </w:rPr>
+              <w:t xml:space="preserve"> to an external, independent system (e.g., regulator, HSM, or public blockchain).</w:t>
             </w:r>
           </w:p>
         </w:tc>
@@ -10372,7 +12344,21 @@
               <w:rPr>
                 <w:rFonts w:ascii="Times New Roman" w:eastAsia="Aptos" w:hAnsi="Times New Roman" w:cs="Times New Roman"/>
               </w:rPr>
-              <w:t>Uses large amounts of RAM and memory</w:t>
+              <w:t xml:space="preserve">Uses </w:t>
+            </w:r>
+            <w:proofErr w:type="gramStart"/>
+            <w:r>
+              <w:rPr>
+                <w:rFonts w:ascii="Times New Roman" w:eastAsia="Aptos" w:hAnsi="Times New Roman" w:cs="Times New Roman"/>
+              </w:rPr>
+              <w:t>large amounts</w:t>
+            </w:r>
+            <w:proofErr w:type="gramEnd"/>
+            <w:r>
+              <w:rPr>
+                <w:rFonts w:ascii="Times New Roman" w:eastAsia="Aptos" w:hAnsi="Times New Roman" w:cs="Times New Roman"/>
+              </w:rPr>
+              <w:t xml:space="preserve"> of RAM and memory</w:t>
             </w:r>
             <w:r>
               <w:rPr>
@@ -10600,8 +12586,15 @@
                 <w:rFonts w:ascii="Times New Roman" w:eastAsia="Aptos" w:hAnsi="Times New Roman" w:cs="Times New Roman"/>
               </w:rPr>
               <w:noBreakHyphen/>
+            </w:r>
+            <w:proofErr w:type="gramStart"/>
+            <w:r>
+              <w:rPr>
+                <w:rFonts w:ascii="Times New Roman" w:eastAsia="Aptos" w:hAnsi="Times New Roman" w:cs="Times New Roman"/>
+              </w:rPr>
               <w:t>3</w:t>
             </w:r>
+            <w:proofErr w:type="gramEnd"/>
             <w:r>
               <w:rPr>
                 <w:rFonts w:ascii="Times New Roman" w:eastAsia="Aptos" w:hAnsi="Times New Roman" w:cs="Times New Roman"/>
@@ -10740,8 +12733,15 @@
           <w:rFonts w:ascii="Times New Roman" w:hAnsi="Times New Roman" w:cs="Times New Roman"/>
         </w:rPr>
         <w:noBreakHyphen/>
+      </w:r>
+      <w:proofErr w:type="gramStart"/>
+      <w:r>
+        <w:rPr>
+          <w:rFonts w:ascii="Times New Roman" w:hAnsi="Times New Roman" w:cs="Times New Roman"/>
+        </w:rPr>
         <w:t>3</w:t>
       </w:r>
+      <w:proofErr w:type="gramEnd"/>
       <w:r>
         <w:rPr>
           <w:rFonts w:ascii="Times New Roman" w:hAnsi="Times New Roman" w:cs="Times New Roman"/>
@@ -10813,21 +12813,75 @@
           <w:rFonts w:ascii="Times New Roman" w:hAnsi="Times New Roman" w:cs="Times New Roman"/>
         </w:rPr>
         <w:tab/>
-        <w:t xml:space="preserve">Overall, the Microsoft Copilot AI model performed well across all four evaluation sections. It was able to formulate logical solutions for each prompt in a timely manner. Breaking each prompt into multiple sections to help with readability and to attempt to show a thought process. Although the model did provide mostly clear concise answers there were a couple problems we ran into while prompting Copilot. The first being unfinished answers for example, after being prompted during one of the experiments Copilot built a table to show its encryption steps but did not fill the table with all the steps it previously described. Although this is not a major error it does raise questions about how fickle some AI </w:t>
+        <w:t xml:space="preserve">Overall, the Microsoft Copilot AI model performed well across all four evaluation sections. It was able to formulate logical solutions for each prompt in a timely manner. Breaking each prompt into multiple sections to help with readability and to attempt to show a thought process. Although the model did provide mostly clear concise answers there were a couple </w:t>
       </w:r>
       <w:proofErr w:type="gramStart"/>
       <w:r>
         <w:rPr>
           <w:rFonts w:ascii="Times New Roman" w:hAnsi="Times New Roman" w:cs="Times New Roman"/>
         </w:rPr>
-        <w:t>models</w:t>
+        <w:t>problems</w:t>
       </w:r>
       <w:proofErr w:type="gramEnd"/>
       <w:r>
         <w:rPr>
           <w:rFonts w:ascii="Times New Roman" w:hAnsi="Times New Roman" w:cs="Times New Roman"/>
         </w:rPr>
-        <w:t xml:space="preserve"> memory or reasoning process really are. Other problems were smaller in comparison but did make the user experience less pleasant than if they were not encountered.</w:t>
+        <w:t xml:space="preserve"> we ran into while prompting Copilot. The first being unfinished answers for example, after </w:t>
+      </w:r>
+      <w:proofErr w:type="gramStart"/>
+      <w:r>
+        <w:rPr>
+          <w:rFonts w:ascii="Times New Roman" w:hAnsi="Times New Roman" w:cs="Times New Roman"/>
+        </w:rPr>
+        <w:t>being prompted</w:t>
+      </w:r>
+      <w:proofErr w:type="gramEnd"/>
+      <w:r>
+        <w:rPr>
+          <w:rFonts w:ascii="Times New Roman" w:hAnsi="Times New Roman" w:cs="Times New Roman"/>
+        </w:rPr>
+        <w:t xml:space="preserve"> during one of the experiments Copilot built a table to show its encryption steps but did not fill the table with all the steps it previously described. Although this is not a major error it does raise questions about how fickle </w:t>
+      </w:r>
+      <w:proofErr w:type="gramStart"/>
+      <w:r>
+        <w:rPr>
+          <w:rFonts w:ascii="Times New Roman" w:hAnsi="Times New Roman" w:cs="Times New Roman"/>
+        </w:rPr>
+        <w:t>some</w:t>
+      </w:r>
+      <w:proofErr w:type="gramEnd"/>
+      <w:r>
+        <w:rPr>
+          <w:rFonts w:ascii="Times New Roman" w:hAnsi="Times New Roman" w:cs="Times New Roman"/>
+        </w:rPr>
+        <w:t xml:space="preserve"> AI </w:t>
+      </w:r>
+      <w:r>
+        <w:rPr>
+          <w:rFonts w:ascii="Times New Roman" w:hAnsi="Times New Roman" w:cs="Times New Roman"/>
+        </w:rPr>
+        <w:t>models’</w:t>
+      </w:r>
+      <w:r>
+        <w:rPr>
+          <w:rFonts w:ascii="Times New Roman" w:hAnsi="Times New Roman" w:cs="Times New Roman"/>
+        </w:rPr>
+        <w:t xml:space="preserve"> memory or reasoning process really are. Other problems were smaller in comparison but did make the user experience less pleasant than if they </w:t>
+      </w:r>
+      <w:proofErr w:type="gramStart"/>
+      <w:r>
+        <w:rPr>
+          <w:rFonts w:ascii="Times New Roman" w:hAnsi="Times New Roman" w:cs="Times New Roman"/>
+        </w:rPr>
+        <w:t>were not encountered</w:t>
+      </w:r>
+      <w:proofErr w:type="gramEnd"/>
+      <w:r>
+        <w:rPr>
+          <w:rFonts w:ascii="Times New Roman" w:hAnsi="Times New Roman" w:cs="Times New Roman"/>
+        </w:rPr>
+        <w:t>.</w:t>
       </w:r>
     </w:p>
     <w:p>
@@ -10910,7 +12964,21 @@
         <w:rPr>
           <w:rFonts w:ascii="Times New Roman" w:hAnsi="Times New Roman" w:cs="Times New Roman"/>
         </w:rPr>
-        <w:t xml:space="preserve">has many capabilities. Through </w:t>
+        <w:t xml:space="preserve">has </w:t>
+      </w:r>
+      <w:proofErr w:type="gramStart"/>
+      <w:r>
+        <w:rPr>
+          <w:rFonts w:ascii="Times New Roman" w:hAnsi="Times New Roman" w:cs="Times New Roman"/>
+        </w:rPr>
+        <w:t>many</w:t>
+      </w:r>
+      <w:proofErr w:type="gramEnd"/>
+      <w:r>
+        <w:rPr>
+          <w:rFonts w:ascii="Times New Roman" w:hAnsi="Times New Roman" w:cs="Times New Roman"/>
+        </w:rPr>
+        <w:t xml:space="preserve"> capabilities. Through </w:t>
       </w:r>
       <w:r>
         <w:rPr>
@@ -10936,11 +13004,33 @@
         </w:rPr>
         <w:t xml:space="preserve">algorithms </w:t>
       </w:r>
-      <w:r>
-        <w:rPr>
-          <w:rFonts w:ascii="Times New Roman" w:hAnsi="Times New Roman" w:cs="Times New Roman"/>
-        </w:rPr>
-        <w:t xml:space="preserve">seemed to be a complex topic for AI to solve. It was required for the models to use </w:t>
+      <w:proofErr w:type="gramStart"/>
+      <w:r>
+        <w:rPr>
+          <w:rFonts w:ascii="Times New Roman" w:hAnsi="Times New Roman" w:cs="Times New Roman"/>
+        </w:rPr>
+        <w:t>seemed to be</w:t>
+      </w:r>
+      <w:proofErr w:type="gramEnd"/>
+      <w:r>
+        <w:rPr>
+          <w:rFonts w:ascii="Times New Roman" w:hAnsi="Times New Roman" w:cs="Times New Roman"/>
+        </w:rPr>
+        <w:t xml:space="preserve"> a complex topic for AI to solve. It </w:t>
+      </w:r>
+      <w:proofErr w:type="gramStart"/>
+      <w:r>
+        <w:rPr>
+          <w:rFonts w:ascii="Times New Roman" w:hAnsi="Times New Roman" w:cs="Times New Roman"/>
+        </w:rPr>
+        <w:t>was required</w:t>
+      </w:r>
+      <w:proofErr w:type="gramEnd"/>
+      <w:r>
+        <w:rPr>
+          <w:rFonts w:ascii="Times New Roman" w:hAnsi="Times New Roman" w:cs="Times New Roman"/>
+        </w:rPr>
+        <w:t xml:space="preserve"> for the models to use </w:t>
       </w:r>
       <w:r>
         <w:rPr>
@@ -10952,7 +13042,28 @@
         <w:rPr>
           <w:rFonts w:ascii="Times New Roman" w:hAnsi="Times New Roman" w:cs="Times New Roman"/>
         </w:rPr>
-        <w:t>acquired knowledge and problem-solving skills. The sever</w:t>
+        <w:t xml:space="preserve">acquired knowledge and </w:t>
+      </w:r>
+      <w:proofErr w:type="gramStart"/>
+      <w:r>
+        <w:rPr>
+          <w:rFonts w:ascii="Times New Roman" w:hAnsi="Times New Roman" w:cs="Times New Roman"/>
+        </w:rPr>
+        <w:t>problem-solving skills</w:t>
+      </w:r>
+      <w:proofErr w:type="gramEnd"/>
+      <w:r>
+        <w:rPr>
+          <w:rFonts w:ascii="Times New Roman" w:hAnsi="Times New Roman" w:cs="Times New Roman"/>
+        </w:rPr>
+        <w:t xml:space="preserve">. The </w:t>
+      </w:r>
+      <w:proofErr w:type="gramStart"/>
+      <w:r>
+        <w:rPr>
+          <w:rFonts w:ascii="Times New Roman" w:hAnsi="Times New Roman" w:cs="Times New Roman"/>
+        </w:rPr>
+        <w:t>sever</w:t>
       </w:r>
       <w:r>
         <w:rPr>
@@ -10960,6 +13071,7 @@
         </w:rPr>
         <w:t>al</w:t>
       </w:r>
+      <w:proofErr w:type="gramEnd"/>
       <w:r>
         <w:rPr>
           <w:rFonts w:ascii="Times New Roman" w:hAnsi="Times New Roman" w:cs="Times New Roman"/>
@@ -10976,7 +13088,21 @@
         <w:rPr>
           <w:rFonts w:ascii="Times New Roman" w:hAnsi="Times New Roman" w:cs="Times New Roman"/>
         </w:rPr>
-        <w:t xml:space="preserve">prompts we tested </w:t>
+        <w:t xml:space="preserve">prompts we </w:t>
+      </w:r>
+      <w:proofErr w:type="gramStart"/>
+      <w:r>
+        <w:rPr>
+          <w:rFonts w:ascii="Times New Roman" w:hAnsi="Times New Roman" w:cs="Times New Roman"/>
+        </w:rPr>
+        <w:t>tested</w:t>
+      </w:r>
+      <w:proofErr w:type="gramEnd"/>
+      <w:r>
+        <w:rPr>
+          <w:rFonts w:ascii="Times New Roman" w:hAnsi="Times New Roman" w:cs="Times New Roman"/>
+        </w:rPr>
+        <w:t xml:space="preserve"> </w:t>
       </w:r>
       <w:r>
         <w:rPr>
@@ -11026,7 +13152,21 @@
         <w:rPr>
           <w:rFonts w:ascii="Times New Roman" w:hAnsi="Times New Roman" w:cs="Times New Roman"/>
         </w:rPr>
-        <w:t xml:space="preserve">Throughout the AI experiments, similarities were found. GPT based models </w:t>
+        <w:t xml:space="preserve">Throughout the AI experiments, similarities </w:t>
+      </w:r>
+      <w:proofErr w:type="gramStart"/>
+      <w:r>
+        <w:rPr>
+          <w:rFonts w:ascii="Times New Roman" w:hAnsi="Times New Roman" w:cs="Times New Roman"/>
+        </w:rPr>
+        <w:t>were found</w:t>
+      </w:r>
+      <w:proofErr w:type="gramEnd"/>
+      <w:r>
+        <w:rPr>
+          <w:rFonts w:ascii="Times New Roman" w:hAnsi="Times New Roman" w:cs="Times New Roman"/>
+        </w:rPr>
+        <w:t xml:space="preserve">. GPT based models </w:t>
       </w:r>
       <w:r>
         <w:rPr>
@@ -11072,7 +13212,14 @@
         <w:rPr>
           <w:rFonts w:ascii="Times New Roman" w:hAnsi="Times New Roman" w:cs="Times New Roman"/>
         </w:rPr>
-        <w:t xml:space="preserve">Both math and programming knowledge were implemented by </w:t>
+        <w:t xml:space="preserve">Both </w:t>
+      </w:r>
+      <w:proofErr w:type="gramStart"/>
+      <w:r>
+        <w:rPr>
+          <w:rFonts w:ascii="Times New Roman" w:hAnsi="Times New Roman" w:cs="Times New Roman"/>
+        </w:rPr>
+        <w:t xml:space="preserve">math and programming knowledge were implemented by </w:t>
       </w:r>
       <w:r>
         <w:rPr>
@@ -11080,6 +13227,7 @@
         </w:rPr>
         <w:t>the models</w:t>
       </w:r>
+      <w:proofErr w:type="gramEnd"/>
       <w:r>
         <w:rPr>
           <w:rFonts w:ascii="Times New Roman" w:hAnsi="Times New Roman" w:cs="Times New Roman"/>
@@ -11124,7 +13272,21 @@
         <w:rPr>
           <w:rFonts w:ascii="Times New Roman" w:hAnsi="Times New Roman" w:cs="Times New Roman"/>
         </w:rPr>
-        <w:t>Even though solutions were found,</w:t>
+        <w:t xml:space="preserve">Even though solutions </w:t>
+      </w:r>
+      <w:proofErr w:type="gramStart"/>
+      <w:r>
+        <w:rPr>
+          <w:rFonts w:ascii="Times New Roman" w:hAnsi="Times New Roman" w:cs="Times New Roman"/>
+        </w:rPr>
+        <w:t>were found</w:t>
+      </w:r>
+      <w:proofErr w:type="gramEnd"/>
+      <w:r>
+        <w:rPr>
+          <w:rFonts w:ascii="Times New Roman" w:hAnsi="Times New Roman" w:cs="Times New Roman"/>
+        </w:rPr>
+        <w:t>,</w:t>
       </w:r>
       <w:r>
         <w:rPr>
@@ -11136,7 +13298,21 @@
         <w:rPr>
           <w:rFonts w:ascii="Times New Roman" w:hAnsi="Times New Roman" w:cs="Times New Roman"/>
         </w:rPr>
-        <w:t xml:space="preserve">can be seen in Artificial Intelligences knowledge and processing. </w:t>
+        <w:t xml:space="preserve">can </w:t>
+      </w:r>
+      <w:proofErr w:type="gramStart"/>
+      <w:r>
+        <w:rPr>
+          <w:rFonts w:ascii="Times New Roman" w:hAnsi="Times New Roman" w:cs="Times New Roman"/>
+        </w:rPr>
+        <w:t>be seen</w:t>
+      </w:r>
+      <w:proofErr w:type="gramEnd"/>
+      <w:r>
+        <w:rPr>
+          <w:rFonts w:ascii="Times New Roman" w:hAnsi="Times New Roman" w:cs="Times New Roman"/>
+        </w:rPr>
+        <w:t xml:space="preserve"> in Artificial Intelligences knowledge and processing. </w:t>
       </w:r>
       <w:r>
         <w:rPr>
@@ -11148,7 +13324,21 @@
         <w:rPr>
           <w:rFonts w:ascii="Times New Roman" w:hAnsi="Times New Roman" w:cs="Times New Roman"/>
         </w:rPr>
-        <w:t>can be seen as dangerous for legality. Additionally, the method of blind</w:t>
+        <w:t xml:space="preserve">can </w:t>
+      </w:r>
+      <w:proofErr w:type="gramStart"/>
+      <w:r>
+        <w:rPr>
+          <w:rFonts w:ascii="Times New Roman" w:hAnsi="Times New Roman" w:cs="Times New Roman"/>
+        </w:rPr>
+        <w:t>be seen</w:t>
+      </w:r>
+      <w:proofErr w:type="gramEnd"/>
+      <w:r>
+        <w:rPr>
+          <w:rFonts w:ascii="Times New Roman" w:hAnsi="Times New Roman" w:cs="Times New Roman"/>
+        </w:rPr>
+        <w:t xml:space="preserve"> as dangerous for legality. Additionally, the method of blind</w:t>
       </w:r>
       <w:r>
         <w:rPr>
@@ -11186,13 +13376,55 @@
         <w:rPr>
           <w:rFonts w:ascii="Times New Roman" w:hAnsi="Times New Roman" w:cs="Times New Roman"/>
         </w:rPr>
-        <w:t xml:space="preserve">The next limitation can be seen in how a prompt is processed. </w:t>
-      </w:r>
-      <w:r>
-        <w:rPr>
-          <w:rFonts w:ascii="Times New Roman" w:hAnsi="Times New Roman" w:cs="Times New Roman"/>
-        </w:rPr>
-        <w:t xml:space="preserve">AI models can easily focus or hyper fixate on a certain part of the prompt, letting other important information not take precedence. </w:t>
+        <w:t xml:space="preserve">The next limitation can </w:t>
+      </w:r>
+      <w:proofErr w:type="gramStart"/>
+      <w:r>
+        <w:rPr>
+          <w:rFonts w:ascii="Times New Roman" w:hAnsi="Times New Roman" w:cs="Times New Roman"/>
+        </w:rPr>
+        <w:t>be seen</w:t>
+      </w:r>
+      <w:proofErr w:type="gramEnd"/>
+      <w:r>
+        <w:rPr>
+          <w:rFonts w:ascii="Times New Roman" w:hAnsi="Times New Roman" w:cs="Times New Roman"/>
+        </w:rPr>
+        <w:t xml:space="preserve"> in how a prompt </w:t>
+      </w:r>
+      <w:proofErr w:type="gramStart"/>
+      <w:r>
+        <w:rPr>
+          <w:rFonts w:ascii="Times New Roman" w:hAnsi="Times New Roman" w:cs="Times New Roman"/>
+        </w:rPr>
+        <w:t>is processed</w:t>
+      </w:r>
+      <w:proofErr w:type="gramEnd"/>
+      <w:r>
+        <w:rPr>
+          <w:rFonts w:ascii="Times New Roman" w:hAnsi="Times New Roman" w:cs="Times New Roman"/>
+        </w:rPr>
+        <w:t xml:space="preserve">. </w:t>
+      </w:r>
+      <w:r>
+        <w:rPr>
+          <w:rFonts w:ascii="Times New Roman" w:hAnsi="Times New Roman" w:cs="Times New Roman"/>
+        </w:rPr>
+        <w:t xml:space="preserve">AI models can easily focus or hyper fixate on a certain part of the prompt, letting other </w:t>
+      </w:r>
+      <w:proofErr w:type="gramStart"/>
+      <w:r>
+        <w:rPr>
+          <w:rFonts w:ascii="Times New Roman" w:hAnsi="Times New Roman" w:cs="Times New Roman"/>
+        </w:rPr>
+        <w:t>important information</w:t>
+      </w:r>
+      <w:proofErr w:type="gramEnd"/>
+      <w:r>
+        <w:rPr>
+          <w:rFonts w:ascii="Times New Roman" w:hAnsi="Times New Roman" w:cs="Times New Roman"/>
+        </w:rPr>
+        <w:t xml:space="preserve"> not take precedence. </w:t>
       </w:r>
       <w:r>
         <w:rPr>
@@ -11222,7 +13454,21 @@
         <w:rPr>
           <w:rFonts w:ascii="Times New Roman" w:hAnsi="Times New Roman" w:cs="Times New Roman"/>
         </w:rPr>
-        <w:t>, other limitations can be seen in AI models</w:t>
+        <w:t xml:space="preserve">, other limitations can </w:t>
+      </w:r>
+      <w:proofErr w:type="gramStart"/>
+      <w:r>
+        <w:rPr>
+          <w:rFonts w:ascii="Times New Roman" w:hAnsi="Times New Roman" w:cs="Times New Roman"/>
+        </w:rPr>
+        <w:t>be seen</w:t>
+      </w:r>
+      <w:proofErr w:type="gramEnd"/>
+      <w:r>
+        <w:rPr>
+          <w:rFonts w:ascii="Times New Roman" w:hAnsi="Times New Roman" w:cs="Times New Roman"/>
+        </w:rPr>
+        <w:t xml:space="preserve"> in AI models</w:t>
       </w:r>
       <w:r>
         <w:rPr>
@@ -11276,7 +13522,21 @@
         <w:rPr>
           <w:rFonts w:ascii="Times New Roman" w:hAnsi="Times New Roman" w:cs="Times New Roman"/>
         </w:rPr>
-        <w:t xml:space="preserve">Software engineers are trained to follow simple and specific details, while AI is looking for more broad data. </w:t>
+        <w:t xml:space="preserve">Software engineers </w:t>
+      </w:r>
+      <w:proofErr w:type="gramStart"/>
+      <w:r>
+        <w:rPr>
+          <w:rFonts w:ascii="Times New Roman" w:hAnsi="Times New Roman" w:cs="Times New Roman"/>
+        </w:rPr>
+        <w:t>are trained</w:t>
+      </w:r>
+      <w:proofErr w:type="gramEnd"/>
+      <w:r>
+        <w:rPr>
+          <w:rFonts w:ascii="Times New Roman" w:hAnsi="Times New Roman" w:cs="Times New Roman"/>
+        </w:rPr>
+        <w:t xml:space="preserve"> to follow simple and specific details, while AI is looking for more broad data. </w:t>
       </w:r>
     </w:p>
     <w:p>
@@ -11316,7 +13576,21 @@
         <w:rPr>
           <w:rFonts w:ascii="Times New Roman" w:hAnsi="Times New Roman" w:cs="Times New Roman"/>
         </w:rPr>
-        <w:t>Overall, this project resulted in a high success rate. Each prompt was given a successful answer</w:t>
+        <w:t xml:space="preserve">Overall, this project resulted in a high success rate. Each prompt </w:t>
+      </w:r>
+      <w:proofErr w:type="gramStart"/>
+      <w:r>
+        <w:rPr>
+          <w:rFonts w:ascii="Times New Roman" w:hAnsi="Times New Roman" w:cs="Times New Roman"/>
+        </w:rPr>
+        <w:t>was given</w:t>
+      </w:r>
+      <w:proofErr w:type="gramEnd"/>
+      <w:r>
+        <w:rPr>
+          <w:rFonts w:ascii="Times New Roman" w:hAnsi="Times New Roman" w:cs="Times New Roman"/>
+        </w:rPr>
+        <w:t xml:space="preserve"> a successful answer</w:t>
       </w:r>
       <w:r>
         <w:rPr>
@@ -11334,7 +13608,21 @@
         <w:rPr>
           <w:rFonts w:ascii="Times New Roman" w:hAnsi="Times New Roman" w:cs="Times New Roman"/>
         </w:rPr>
-        <w:t xml:space="preserve">opinions could be made based on the findings. </w:t>
+        <w:t xml:space="preserve">opinions could </w:t>
+      </w:r>
+      <w:proofErr w:type="gramStart"/>
+      <w:r>
+        <w:rPr>
+          <w:rFonts w:ascii="Times New Roman" w:hAnsi="Times New Roman" w:cs="Times New Roman"/>
+        </w:rPr>
+        <w:t>be made</w:t>
+      </w:r>
+      <w:proofErr w:type="gramEnd"/>
+      <w:r>
+        <w:rPr>
+          <w:rFonts w:ascii="Times New Roman" w:hAnsi="Times New Roman" w:cs="Times New Roman"/>
+        </w:rPr>
+        <w:t xml:space="preserve"> based on the findings. </w:t>
       </w:r>
     </w:p>
     <w:p>
@@ -11375,7 +13663,21 @@
         <w:rPr>
           <w:rFonts w:ascii="Times New Roman" w:hAnsi="Times New Roman" w:cs="Times New Roman"/>
         </w:rPr>
-        <w:t xml:space="preserve">To further test AI’s capabilities, our team would recommend testing </w:t>
+        <w:t xml:space="preserve">To further test AI’s capabilities, our team would recommend </w:t>
+      </w:r>
+      <w:proofErr w:type="gramStart"/>
+      <w:r>
+        <w:rPr>
+          <w:rFonts w:ascii="Times New Roman" w:hAnsi="Times New Roman" w:cs="Times New Roman"/>
+        </w:rPr>
+        <w:t>testing</w:t>
+      </w:r>
+      <w:proofErr w:type="gramEnd"/>
+      <w:r>
+        <w:rPr>
+          <w:rFonts w:ascii="Times New Roman" w:hAnsi="Times New Roman" w:cs="Times New Roman"/>
+        </w:rPr>
+        <w:t xml:space="preserve"> </w:t>
       </w:r>
       <w:r>
         <w:rPr>
@@ -11400,19 +13702,61 @@
           <w:rFonts w:ascii="Times New Roman" w:hAnsi="Times New Roman" w:cs="Times New Roman"/>
         </w:rPr>
         <w:lastRenderedPageBreak/>
-        <w:t>prompts that are fully developed and detailed.</w:t>
-      </w:r>
-      <w:r>
-        <w:rPr>
-          <w:rFonts w:ascii="Times New Roman" w:hAnsi="Times New Roman" w:cs="Times New Roman"/>
-        </w:rPr>
-        <w:t xml:space="preserve"> It would also be interesting to test with more computational time complexities. </w:t>
-      </w:r>
-      <w:r>
-        <w:rPr>
-          <w:rFonts w:ascii="Times New Roman" w:hAnsi="Times New Roman" w:cs="Times New Roman"/>
-        </w:rPr>
-        <w:t xml:space="preserve">In this project, for scope only two were selected (O (log n0) and O (1)). </w:t>
+        <w:t xml:space="preserve">prompts that </w:t>
+      </w:r>
+      <w:proofErr w:type="gramStart"/>
+      <w:r>
+        <w:rPr>
+          <w:rFonts w:ascii="Times New Roman" w:hAnsi="Times New Roman" w:cs="Times New Roman"/>
+        </w:rPr>
+        <w:t>are fully developed</w:t>
+      </w:r>
+      <w:proofErr w:type="gramEnd"/>
+      <w:r>
+        <w:rPr>
+          <w:rFonts w:ascii="Times New Roman" w:hAnsi="Times New Roman" w:cs="Times New Roman"/>
+        </w:rPr>
+        <w:t xml:space="preserve"> and detailed.</w:t>
+      </w:r>
+      <w:r>
+        <w:rPr>
+          <w:rFonts w:ascii="Times New Roman" w:hAnsi="Times New Roman" w:cs="Times New Roman"/>
+        </w:rPr>
+        <w:t xml:space="preserve"> It would also be interesting to </w:t>
+      </w:r>
+      <w:proofErr w:type="gramStart"/>
+      <w:r>
+        <w:rPr>
+          <w:rFonts w:ascii="Times New Roman" w:hAnsi="Times New Roman" w:cs="Times New Roman"/>
+        </w:rPr>
+        <w:t>test</w:t>
+      </w:r>
+      <w:proofErr w:type="gramEnd"/>
+      <w:r>
+        <w:rPr>
+          <w:rFonts w:ascii="Times New Roman" w:hAnsi="Times New Roman" w:cs="Times New Roman"/>
+        </w:rPr>
+        <w:t xml:space="preserve"> with more computational time complexities. </w:t>
+      </w:r>
+      <w:r>
+        <w:rPr>
+          <w:rFonts w:ascii="Times New Roman" w:hAnsi="Times New Roman" w:cs="Times New Roman"/>
+        </w:rPr>
+        <w:t xml:space="preserve">In this project, for scope only two </w:t>
+      </w:r>
+      <w:proofErr w:type="gramStart"/>
+      <w:r>
+        <w:rPr>
+          <w:rFonts w:ascii="Times New Roman" w:hAnsi="Times New Roman" w:cs="Times New Roman"/>
+        </w:rPr>
+        <w:t>were selected</w:t>
+      </w:r>
+      <w:proofErr w:type="gramEnd"/>
+      <w:r>
+        <w:rPr>
+          <w:rFonts w:ascii="Times New Roman" w:hAnsi="Times New Roman" w:cs="Times New Roman"/>
+        </w:rPr>
+        <w:t xml:space="preserve"> (O (log n0) and O (1)). </w:t>
       </w:r>
       <w:r>
         <w:rPr>
@@ -11424,7 +13768,21 @@
         <w:rPr>
           <w:rFonts w:ascii="Times New Roman" w:hAnsi="Times New Roman" w:cs="Times New Roman"/>
         </w:rPr>
-        <w:t xml:space="preserve">uld be to test how long it takes the model to form a whole solution. </w:t>
+        <w:t xml:space="preserve">uld be to </w:t>
+      </w:r>
+      <w:proofErr w:type="gramStart"/>
+      <w:r>
+        <w:rPr>
+          <w:rFonts w:ascii="Times New Roman" w:hAnsi="Times New Roman" w:cs="Times New Roman"/>
+        </w:rPr>
+        <w:t>test</w:t>
+      </w:r>
+      <w:proofErr w:type="gramEnd"/>
+      <w:r>
+        <w:rPr>
+          <w:rFonts w:ascii="Times New Roman" w:hAnsi="Times New Roman" w:cs="Times New Roman"/>
+        </w:rPr>
+        <w:t xml:space="preserve"> how long it takes the model to form a whole solution. </w:t>
       </w:r>
     </w:p>
     <w:p>
@@ -11565,37 +13923,143 @@
           <w:i/>
           <w:iCs/>
         </w:rPr>
-        <w:t>“Some pointed out that future AI-abetted losses and gains will be unevenly distributed across humanity. Some said the future will be “scary” and some said it will bring “joy and love.” Some said it will initiate “growth and productivity</w:t>
-      </w:r>
+        <w:t>“</w:t>
+      </w:r>
+      <w:proofErr w:type="gramStart"/>
       <w:r>
         <w:rPr>
           <w:rFonts w:ascii="Times New Roman" w:hAnsi="Times New Roman" w:cs="Times New Roman"/>
           <w:i/>
           <w:iCs/>
         </w:rPr>
-        <w:t>”,</w:t>
-      </w:r>
+        <w:t>Some</w:t>
+      </w:r>
+      <w:proofErr w:type="gramEnd"/>
       <w:r>
         <w:rPr>
           <w:rFonts w:ascii="Times New Roman" w:hAnsi="Times New Roman" w:cs="Times New Roman"/>
           <w:i/>
           <w:iCs/>
         </w:rPr>
-        <w:t xml:space="preserve"> but it could result in “rampant unemployment.”</w:t>
-      </w:r>
+        <w:t xml:space="preserve"> pointed out that future AI-abetted losses and gains will </w:t>
+      </w:r>
+      <w:proofErr w:type="gramStart"/>
       <w:r>
         <w:rPr>
           <w:rFonts w:ascii="Times New Roman" w:hAnsi="Times New Roman" w:cs="Times New Roman"/>
           <w:i/>
           <w:iCs/>
         </w:rPr>
+        <w:t>be unevenly distributed</w:t>
+      </w:r>
+      <w:proofErr w:type="gramEnd"/>
+      <w:r>
+        <w:rPr>
+          <w:rFonts w:ascii="Times New Roman" w:hAnsi="Times New Roman" w:cs="Times New Roman"/>
+          <w:i/>
+          <w:iCs/>
+        </w:rPr>
+        <w:t xml:space="preserve"> across humanity. </w:t>
+      </w:r>
+      <w:proofErr w:type="gramStart"/>
+      <w:r>
+        <w:rPr>
+          <w:rFonts w:ascii="Times New Roman" w:hAnsi="Times New Roman" w:cs="Times New Roman"/>
+          <w:i/>
+          <w:iCs/>
+        </w:rPr>
+        <w:t>Some</w:t>
+      </w:r>
+      <w:proofErr w:type="gramEnd"/>
+      <w:r>
+        <w:rPr>
+          <w:rFonts w:ascii="Times New Roman" w:hAnsi="Times New Roman" w:cs="Times New Roman"/>
+          <w:i/>
+          <w:iCs/>
+        </w:rPr>
+        <w:t xml:space="preserve"> said the future will be “scary” and </w:t>
+      </w:r>
+      <w:proofErr w:type="gramStart"/>
+      <w:r>
+        <w:rPr>
+          <w:rFonts w:ascii="Times New Roman" w:hAnsi="Times New Roman" w:cs="Times New Roman"/>
+          <w:i/>
+          <w:iCs/>
+        </w:rPr>
+        <w:t>some</w:t>
+      </w:r>
+      <w:proofErr w:type="gramEnd"/>
+      <w:r>
+        <w:rPr>
+          <w:rFonts w:ascii="Times New Roman" w:hAnsi="Times New Roman" w:cs="Times New Roman"/>
+          <w:i/>
+          <w:iCs/>
+        </w:rPr>
+        <w:t xml:space="preserve"> said it will bring “joy and love.” </w:t>
+      </w:r>
+      <w:proofErr w:type="gramStart"/>
+      <w:r>
+        <w:rPr>
+          <w:rFonts w:ascii="Times New Roman" w:hAnsi="Times New Roman" w:cs="Times New Roman"/>
+          <w:i/>
+          <w:iCs/>
+        </w:rPr>
+        <w:t>Some</w:t>
+      </w:r>
+      <w:proofErr w:type="gramEnd"/>
+      <w:r>
+        <w:rPr>
+          <w:rFonts w:ascii="Times New Roman" w:hAnsi="Times New Roman" w:cs="Times New Roman"/>
+          <w:i/>
+          <w:iCs/>
+        </w:rPr>
+        <w:t xml:space="preserve"> said it will initiate “growth and productivity</w:t>
+      </w:r>
+      <w:proofErr w:type="gramStart"/>
+      <w:r>
+        <w:rPr>
+          <w:rFonts w:ascii="Times New Roman" w:hAnsi="Times New Roman" w:cs="Times New Roman"/>
+          <w:i/>
+          <w:iCs/>
+        </w:rPr>
+        <w:t>”,</w:t>
+      </w:r>
+      <w:proofErr w:type="gramEnd"/>
+      <w:r>
+        <w:rPr>
+          <w:rFonts w:ascii="Times New Roman" w:hAnsi="Times New Roman" w:cs="Times New Roman"/>
+          <w:i/>
+          <w:iCs/>
+        </w:rPr>
+        <w:t xml:space="preserve"> but it could result in “rampant unemployment.”</w:t>
+      </w:r>
+      <w:r>
+        <w:rPr>
+          <w:rFonts w:ascii="Times New Roman" w:hAnsi="Times New Roman" w:cs="Times New Roman"/>
+          <w:i/>
+          <w:iCs/>
+        </w:rPr>
         <w:t xml:space="preserve"> </w:t>
       </w:r>
       <w:r>
         <w:rPr>
           <w:rFonts w:ascii="Times New Roman" w:hAnsi="Times New Roman" w:cs="Times New Roman"/>
         </w:rPr>
-        <w:t>While AI introduces an encroaching fear of unemployment, it also has enhanced many industries</w:t>
+        <w:t xml:space="preserve">While AI introduces an encroaching fear of unemployment, it also has enhanced </w:t>
+      </w:r>
+      <w:proofErr w:type="gramStart"/>
+      <w:r>
+        <w:rPr>
+          <w:rFonts w:ascii="Times New Roman" w:hAnsi="Times New Roman" w:cs="Times New Roman"/>
+        </w:rPr>
+        <w:t>many</w:t>
+      </w:r>
+      <w:proofErr w:type="gramEnd"/>
+      <w:r>
+        <w:rPr>
+          <w:rFonts w:ascii="Times New Roman" w:hAnsi="Times New Roman" w:cs="Times New Roman"/>
+        </w:rPr>
+        <w:t xml:space="preserve"> industries</w:t>
       </w:r>
       <w:r>
         <w:rPr>
@@ -11675,7 +14139,21 @@
         <w:rPr>
           <w:rFonts w:ascii="Times New Roman" w:hAnsi="Times New Roman" w:cs="Times New Roman"/>
         </w:rPr>
-        <w:t xml:space="preserve">development. AI is still considered a newer technology even though it </w:t>
+        <w:t xml:space="preserve">development. AI </w:t>
+      </w:r>
+      <w:proofErr w:type="gramStart"/>
+      <w:r>
+        <w:rPr>
+          <w:rFonts w:ascii="Times New Roman" w:hAnsi="Times New Roman" w:cs="Times New Roman"/>
+        </w:rPr>
+        <w:t>is still considered</w:t>
+      </w:r>
+      <w:proofErr w:type="gramEnd"/>
+      <w:r>
+        <w:rPr>
+          <w:rFonts w:ascii="Times New Roman" w:hAnsi="Times New Roman" w:cs="Times New Roman"/>
+        </w:rPr>
+        <w:t xml:space="preserve"> a newer technology even though it </w:t>
       </w:r>
       <w:proofErr w:type="gramStart"/>
       <w:r>
@@ -11878,7 +14356,21 @@
         <w:rPr>
           <w:rFonts w:ascii="Times New Roman" w:hAnsi="Times New Roman" w:cs="Times New Roman"/>
         </w:rPr>
-        <w:t xml:space="preserve">solved problems was fascinating. Some worked in steps, while others collected info to fully understand the problem. </w:t>
+        <w:t xml:space="preserve">solved problems was fascinating. </w:t>
+      </w:r>
+      <w:proofErr w:type="gramStart"/>
+      <w:r>
+        <w:rPr>
+          <w:rFonts w:ascii="Times New Roman" w:hAnsi="Times New Roman" w:cs="Times New Roman"/>
+        </w:rPr>
+        <w:t>Some</w:t>
+      </w:r>
+      <w:proofErr w:type="gramEnd"/>
+      <w:r>
+        <w:rPr>
+          <w:rFonts w:ascii="Times New Roman" w:hAnsi="Times New Roman" w:cs="Times New Roman"/>
+        </w:rPr>
+        <w:t xml:space="preserve"> worked in steps, while others collected info to fully understand the problem. </w:t>
       </w:r>
       <w:r>
         <w:rPr>
@@ -11896,13 +14388,27 @@
         <w:rPr>
           <w:rFonts w:ascii="Times New Roman" w:hAnsi="Times New Roman" w:cs="Times New Roman"/>
         </w:rPr>
-        <w:t xml:space="preserve">of algorithms and computer science. Our team was able to highlight success rates and limitations during this project. Overall, this project was found to be successful. AI </w:t>
+        <w:t xml:space="preserve">of algorithms and computer science. Our team was able to highlight success rates and limitations during this project. Overall, this project </w:t>
       </w:r>
       <w:proofErr w:type="gramStart"/>
       <w:r>
         <w:rPr>
           <w:rFonts w:ascii="Times New Roman" w:hAnsi="Times New Roman" w:cs="Times New Roman"/>
         </w:rPr>
+        <w:t>was found</w:t>
+      </w:r>
+      <w:proofErr w:type="gramEnd"/>
+      <w:r>
+        <w:rPr>
+          <w:rFonts w:ascii="Times New Roman" w:hAnsi="Times New Roman" w:cs="Times New Roman"/>
+        </w:rPr>
+        <w:t xml:space="preserve"> to be successful. AI </w:t>
+      </w:r>
+      <w:proofErr w:type="gramStart"/>
+      <w:r>
+        <w:rPr>
+          <w:rFonts w:ascii="Times New Roman" w:hAnsi="Times New Roman" w:cs="Times New Roman"/>
+        </w:rPr>
         <w:t>is able to</w:t>
       </w:r>
       <w:proofErr w:type="gramEnd"/>
@@ -11916,7 +14422,21 @@
         <w:rPr>
           <w:rFonts w:ascii="Times New Roman" w:hAnsi="Times New Roman" w:cs="Times New Roman"/>
         </w:rPr>
-        <w:t xml:space="preserve">. However, at the current state of development we believe that it cannot replace an engineer or mathematician. AI should be supplemented as a tool, not </w:t>
+        <w:t xml:space="preserve">. However, at the current state of development we believe that it cannot replace an engineer or mathematician. AI should </w:t>
+      </w:r>
+      <w:proofErr w:type="gramStart"/>
+      <w:r>
+        <w:rPr>
+          <w:rFonts w:ascii="Times New Roman" w:hAnsi="Times New Roman" w:cs="Times New Roman"/>
+        </w:rPr>
+        <w:t>be supplemented</w:t>
+      </w:r>
+      <w:proofErr w:type="gramEnd"/>
+      <w:r>
+        <w:rPr>
+          <w:rFonts w:ascii="Times New Roman" w:hAnsi="Times New Roman" w:cs="Times New Roman"/>
+        </w:rPr>
+        <w:t xml:space="preserve"> as a tool, not </w:t>
       </w:r>
       <w:r>
         <w:rPr>

</xml_diff>